<commit_message>
Measurement: 1) fixed issue with SonTek compass calibration not recognized in XML file CompassCalibrationResult
Updated change log
</commit_message>
<xml_diff>
--- a/UI/Help/QRev_Change_Log.docx
+++ b/UI/Help/QRev_Change_Log.docx
@@ -253,6 +253,24 @@
     </w:p>
     <w:p>
       <w:pPr>
+        <w:pStyle w:val="ListParagraph"/>
+        <w:numPr>
+          <w:ilvl w:val="0"/>
+          <w:numId w:val="31"/>
+        </w:numPr>
+      </w:pPr>
+      <w:r>
+        <w:t xml:space="preserve">Fixed bug </w:t>
+      </w:r>
+      <w:r>
+        <w:t xml:space="preserve">for SonTek ADCPs </w:t>
+      </w:r>
+      <w:r>
+        <w:t>showing no in the xml file CompassCalibrationResult when there is a calibration</w:t>
+      </w:r>
+    </w:p>
+    <w:p>
+      <w:pPr>
         <w:rPr>
           <w:b/>
           <w:bCs/>
@@ -462,6 +480,7 @@
           <w:b/>
           <w:bCs/>
         </w:rPr>
+        <w:lastRenderedPageBreak/>
         <w:t>Changes QRevInt 1.06 to 1.07</w:t>
       </w:r>
     </w:p>
@@ -474,1750 +493,1893 @@
         </w:numPr>
       </w:pPr>
       <w:r>
+        <w:t>Several minor bug fixes</w:t>
+      </w:r>
+    </w:p>
+    <w:p>
+      <w:pPr>
+        <w:pStyle w:val="ListParagraph"/>
+        <w:numPr>
+          <w:ilvl w:val="0"/>
+          <w:numId w:val="26"/>
+        </w:numPr>
+      </w:pPr>
+      <w:r>
+        <w:t>Graphics for BT, GPS, Depths, and WT now share x-axis for zoom and pan</w:t>
+      </w:r>
+    </w:p>
+    <w:p>
+      <w:pPr>
+        <w:pStyle w:val="ListParagraph"/>
+        <w:numPr>
+          <w:ilvl w:val="0"/>
+          <w:numId w:val="26"/>
+        </w:numPr>
+      </w:pPr>
+      <w:r>
+        <w:t>Added stage start, end, and measurement to Premeasurement tab</w:t>
+      </w:r>
+    </w:p>
+    <w:p>
+      <w:pPr>
+        <w:pStyle w:val="ListParagraph"/>
+        <w:numPr>
+          <w:ilvl w:val="0"/>
+          <w:numId w:val="26"/>
+        </w:numPr>
+      </w:pPr>
+      <w:r>
+        <w:t>Modified messages for moving-bed conditions based on selected reference</w:t>
+      </w:r>
+    </w:p>
+    <w:p>
+      <w:pPr>
+        <w:pStyle w:val="ListParagraph"/>
+        <w:numPr>
+          <w:ilvl w:val="0"/>
+          <w:numId w:val="26"/>
+        </w:numPr>
+      </w:pPr>
+      <w:r>
+        <w:t>New QA methods applied consistently when Viewing previously saved QRev.mat</w:t>
+      </w:r>
+    </w:p>
+    <w:p>
+      <w:pPr>
+        <w:rPr>
+          <w:b/>
+          <w:bCs/>
+        </w:rPr>
+      </w:pPr>
+      <w:r>
+        <w:rPr>
+          <w:b/>
+          <w:bCs/>
+        </w:rPr>
+        <w:t>Changes QRevInt 1.01 to QRevInt 1.06</w:t>
+      </w:r>
+    </w:p>
+    <w:p>
+      <w:pPr>
+        <w:pStyle w:val="ListParagraph"/>
+        <w:numPr>
+          <w:ilvl w:val="0"/>
+          <w:numId w:val="25"/>
+        </w:numPr>
+      </w:pPr>
+      <w:r>
+        <w:t>Added shortcut keys</w:t>
+      </w:r>
+    </w:p>
+    <w:p>
+      <w:pPr>
+        <w:pStyle w:val="ListParagraph"/>
+        <w:numPr>
+          <w:ilvl w:val="0"/>
+          <w:numId w:val="25"/>
+        </w:numPr>
+      </w:pPr>
+      <w:r>
+        <w:t>Added option to use length or time for x-axis</w:t>
+      </w:r>
+    </w:p>
+    <w:p>
+      <w:pPr>
+        <w:pStyle w:val="ListParagraph"/>
+        <w:numPr>
+          <w:ilvl w:val="0"/>
+          <w:numId w:val="25"/>
+        </w:numPr>
+      </w:pPr>
+      <w:r>
+        <w:t>Added Advanced Graphics tab</w:t>
+      </w:r>
+    </w:p>
+    <w:p>
+      <w:pPr>
+        <w:pStyle w:val="ListParagraph"/>
+        <w:numPr>
+          <w:ilvl w:val="0"/>
+          <w:numId w:val="25"/>
+        </w:numPr>
+      </w:pPr>
+      <w:r>
+        <w:t>Added correlation and RSSI/SNR to boat data</w:t>
+      </w:r>
+    </w:p>
+    <w:p>
+      <w:pPr>
+        <w:pStyle w:val="ListParagraph"/>
+        <w:numPr>
+          <w:ilvl w:val="0"/>
+          <w:numId w:val="25"/>
+        </w:numPr>
+      </w:pPr>
+      <w:r>
+        <w:t>Fixed code identifying RS5 ADCP model</w:t>
+      </w:r>
+    </w:p>
+    <w:p>
+      <w:pPr>
+        <w:pStyle w:val="ListParagraph"/>
+        <w:numPr>
+          <w:ilvl w:val="0"/>
+          <w:numId w:val="25"/>
+        </w:numPr>
+      </w:pPr>
+      <w:r>
+        <w:t>Fixed ping type and frequency identification</w:t>
+      </w:r>
+    </w:p>
+    <w:p>
+      <w:pPr>
+        <w:pStyle w:val="ListParagraph"/>
+        <w:numPr>
+          <w:ilvl w:val="0"/>
+          <w:numId w:val="25"/>
+        </w:numPr>
+      </w:pPr>
+      <w:r>
+        <w:t>Update</w:t>
+      </w:r>
+      <w:r>
+        <w:t>d</w:t>
+      </w:r>
+      <w:r>
+        <w:t xml:space="preserve"> Oursin uncertainty model to latest methods including Bayesian COV</w:t>
+      </w:r>
+    </w:p>
+    <w:p>
+      <w:pPr>
+        <w:pStyle w:val="ListParagraph"/>
+        <w:numPr>
+          <w:ilvl w:val="0"/>
+          <w:numId w:val="25"/>
+        </w:numPr>
+      </w:pPr>
+      <w:r>
+        <w:t>Updated Oursin user interface and graphs</w:t>
+      </w:r>
+    </w:p>
+    <w:p>
+      <w:pPr>
+        <w:pStyle w:val="ListParagraph"/>
+        <w:numPr>
+          <w:ilvl w:val="0"/>
+          <w:numId w:val="25"/>
+        </w:numPr>
+      </w:pPr>
+      <w:r>
+        <w:t>Added new data fields to *_QRev.mat while maintaining compatibility with older files</w:t>
+      </w:r>
+    </w:p>
+    <w:p>
+      <w:pPr>
+        <w:pStyle w:val="ListParagraph"/>
+        <w:numPr>
+          <w:ilvl w:val="0"/>
+          <w:numId w:val="25"/>
+        </w:numPr>
+      </w:pPr>
+      <w:r>
+        <w:t xml:space="preserve">Added ability </w:t>
+      </w:r>
+      <w:r>
+        <w:t>for</w:t>
+      </w:r>
+      <w:r>
+        <w:t xml:space="preserve"> agencies to configure the Options dialog and the default values</w:t>
+      </w:r>
+    </w:p>
+    <w:p>
+      <w:pPr>
+        <w:pStyle w:val="ListParagraph"/>
+        <w:numPr>
+          <w:ilvl w:val="0"/>
+          <w:numId w:val="25"/>
+        </w:numPr>
+      </w:pPr>
+      <w:r>
+        <w:t>Added option to allow an observed no moving-bed condition</w:t>
+      </w:r>
+    </w:p>
+    <w:p>
+      <w:pPr>
+        <w:pStyle w:val="ListParagraph"/>
+        <w:numPr>
+          <w:ilvl w:val="0"/>
+          <w:numId w:val="25"/>
+        </w:numPr>
+      </w:pPr>
+      <w:r>
+        <w:t>Added option to turn off use of heading data</w:t>
+      </w:r>
+    </w:p>
+    <w:p>
+      <w:pPr>
+        <w:pStyle w:val="ListParagraph"/>
+        <w:numPr>
+          <w:ilvl w:val="0"/>
+          <w:numId w:val="25"/>
+        </w:numPr>
+      </w:pPr>
+      <w:r>
+        <w:t>Filter settings for transects are no</w:t>
+      </w:r>
+      <w:r>
+        <w:t>w</w:t>
+      </w:r>
+      <w:r>
+        <w:t xml:space="preserve"> applied to moving-bed tests</w:t>
+      </w:r>
+    </w:p>
+    <w:p>
+      <w:pPr>
+        <w:pStyle w:val="ListParagraph"/>
+        <w:numPr>
+          <w:ilvl w:val="0"/>
+          <w:numId w:val="25"/>
+        </w:numPr>
+      </w:pPr>
+      <w:r>
+        <w:t>Added tooltips to all tables and labels that are highlighted due to ADQA</w:t>
+      </w:r>
+    </w:p>
+    <w:p>
+      <w:pPr>
+        <w:pStyle w:val="ListParagraph"/>
+        <w:numPr>
+          <w:ilvl w:val="0"/>
+          <w:numId w:val="25"/>
+        </w:numPr>
+      </w:pPr>
+      <w:r>
+        <w:t>Uses Numba AOT compiling of robust loess smooth, Bayesian COV, and top and bottom discharge computations to improve overall speed. 70% average speed improvement.</w:t>
+      </w:r>
+    </w:p>
+    <w:p>
+      <w:pPr>
+        <w:pStyle w:val="ListParagraph"/>
+        <w:numPr>
+          <w:ilvl w:val="0"/>
+          <w:numId w:val="25"/>
+        </w:numPr>
+      </w:pPr>
+      <w:r>
+        <w:t>Improvements</w:t>
+      </w:r>
+      <w:r>
+        <w:t xml:space="preserve"> to depth filter. May cause </w:t>
+      </w:r>
+      <w:r>
+        <w:t xml:space="preserve">a </w:t>
+      </w:r>
+      <w:r>
+        <w:t>small change in discharge for some measurements.</w:t>
+      </w:r>
+    </w:p>
+    <w:p>
+      <w:pPr>
+        <w:pStyle w:val="ListParagraph"/>
+        <w:numPr>
+          <w:ilvl w:val="0"/>
+          <w:numId w:val="25"/>
+        </w:numPr>
+      </w:pPr>
+      <w:r>
+        <w:t>Added fields for Measurement Number and Person(s) to Premeasurement tab</w:t>
+      </w:r>
+    </w:p>
+    <w:p>
+      <w:pPr>
+        <w:pStyle w:val="ListParagraph"/>
+        <w:numPr>
+          <w:ilvl w:val="0"/>
+          <w:numId w:val="25"/>
+        </w:numPr>
+      </w:pPr>
+      <w:r>
+        <w:t>All reported and/or discovered bugs were fixed.</w:t>
+      </w:r>
+    </w:p>
+    <w:p>
+      <w:pPr>
+        <w:pStyle w:val="ListParagraph"/>
+        <w:numPr>
+          <w:ilvl w:val="0"/>
+          <w:numId w:val="25"/>
+        </w:numPr>
+      </w:pPr>
+      <w:r>
+        <w:t>User’s manual updated</w:t>
+      </w:r>
+    </w:p>
+    <w:p>
+      <w:pPr>
+        <w:pStyle w:val="ListParagraph"/>
+        <w:numPr>
+          <w:ilvl w:val="0"/>
+          <w:numId w:val="25"/>
+        </w:numPr>
+      </w:pPr>
+      <w:r>
+        <w:t>Technical manual updated</w:t>
+      </w:r>
+    </w:p>
+    <w:p>
+      <w:pPr>
+        <w:rPr>
+          <w:b/>
+          <w:bCs/>
+        </w:rPr>
+      </w:pPr>
+      <w:r>
+        <w:rPr>
+          <w:b/>
+          <w:bCs/>
+        </w:rPr>
+        <w:t>Changes QRevInt 1.00 to QRevInt 1.01</w:t>
+      </w:r>
+    </w:p>
+    <w:p>
+      <w:pPr>
+        <w:pStyle w:val="ListParagraph"/>
+        <w:numPr>
+          <w:ilvl w:val="0"/>
+          <w:numId w:val="24"/>
+        </w:numPr>
+      </w:pPr>
+      <w:r>
+        <w:t>Changed composite depths to interpolate for invalid depths using the composite data rather than the primary reference.</w:t>
+      </w:r>
+    </w:p>
+    <w:p>
+      <w:pPr>
+        <w:pStyle w:val="ListParagraph"/>
+        <w:numPr>
+          <w:ilvl w:val="0"/>
+          <w:numId w:val="24"/>
+        </w:numPr>
+      </w:pPr>
+      <w:r>
+        <w:t>WT error and vertical velocity filters are now applied based on ping type for all new processing of data.</w:t>
+      </w:r>
+      <w:r>
+        <w:t xml:space="preserve"> </w:t>
+      </w:r>
+      <w:r>
+        <w:t>Loading older QRev files without reprocessing will display previous results.</w:t>
+      </w:r>
+    </w:p>
+    <w:p>
+      <w:pPr>
+        <w:pStyle w:val="ListParagraph"/>
+        <w:numPr>
+          <w:ilvl w:val="0"/>
+          <w:numId w:val="24"/>
+        </w:numPr>
+      </w:pPr>
+      <w:r>
+        <w:t>BT error and vertical velocity filters are now applied based on bottom track ping frequency for all new processing of data. Loading older QRev files without reprocessing will display previous results.</w:t>
+      </w:r>
+    </w:p>
+    <w:p>
+      <w:pPr>
+        <w:pStyle w:val="ListParagraph"/>
+        <w:numPr>
+          <w:ilvl w:val="0"/>
+          <w:numId w:val="24"/>
+        </w:numPr>
+      </w:pPr>
+      <w:r>
+        <w:t xml:space="preserve">The user now has an option in the Options dialog to apply error and vertical velocity filters based on data from the entire measurement rather than based on data from individual measurements. </w:t>
+      </w:r>
+    </w:p>
+    <w:p>
+      <w:pPr>
+        <w:pStyle w:val="ListParagraph"/>
+        <w:numPr>
+          <w:ilvl w:val="0"/>
+          <w:numId w:val="24"/>
+        </w:numPr>
+      </w:pPr>
+      <w:r>
+        <w:t>An option for the jet color map has been added to the Options dialog.</w:t>
+      </w:r>
+    </w:p>
+    <w:p>
+      <w:pPr>
+        <w:pStyle w:val="ListParagraph"/>
+        <w:numPr>
+          <w:ilvl w:val="0"/>
+          <w:numId w:val="24"/>
+        </w:numPr>
+      </w:pPr>
+      <w:r>
+        <w:t xml:space="preserve">Added points to </w:t>
+      </w:r>
+      <w:r>
+        <w:t>plots in Depth tab</w:t>
+      </w:r>
+    </w:p>
+    <w:p>
+      <w:pPr>
+        <w:pStyle w:val="ListParagraph"/>
+        <w:numPr>
+          <w:ilvl w:val="0"/>
+          <w:numId w:val="24"/>
+        </w:numPr>
+      </w:pPr>
+      <w:r>
+        <w:t>Fixed several bugs related to reading RS5 and older QRev files.</w:t>
+      </w:r>
+    </w:p>
+    <w:p>
+      <w:pPr>
+        <w:pStyle w:val="ListParagraph"/>
+        <w:rPr>
+          <w:b/>
+          <w:bCs/>
+        </w:rPr>
+      </w:pPr>
+    </w:p>
+    <w:p>
+      <w:pPr>
+        <w:rPr>
+          <w:b/>
+          <w:bCs/>
+        </w:rPr>
+      </w:pPr>
+      <w:r>
+        <w:rPr>
+          <w:b/>
+          <w:bCs/>
+        </w:rPr>
+        <w:t>Changes QRevInt 4.26 Beta to QRevInt 1.00</w:t>
+      </w:r>
+    </w:p>
+    <w:p>
+      <w:pPr>
+        <w:pStyle w:val="ListParagraph"/>
+        <w:numPr>
+          <w:ilvl w:val="0"/>
+          <w:numId w:val="23"/>
+        </w:numPr>
+      </w:pPr>
+      <w:r>
+        <w:t>New versioning implemented.</w:t>
+      </w:r>
+    </w:p>
+    <w:p>
+      <w:pPr>
+        <w:pStyle w:val="ListParagraph"/>
+        <w:numPr>
+          <w:ilvl w:val="0"/>
+          <w:numId w:val="23"/>
+        </w:numPr>
+      </w:pPr>
+      <w:r>
+        <w:t>Added disclaimer and license that must be agreed to prior to running the first time.</w:t>
+      </w:r>
+    </w:p>
+    <w:p>
+      <w:pPr>
+        <w:pStyle w:val="ListParagraph"/>
+        <w:numPr>
+          <w:ilvl w:val="0"/>
+          <w:numId w:val="23"/>
+        </w:numPr>
+      </w:pPr>
+      <w:r>
+        <w:t>Modified code for compatibility with older QRev.mat files that lack the new features.</w:t>
+      </w:r>
+    </w:p>
+    <w:p>
+      <w:pPr>
+        <w:pStyle w:val="ListParagraph"/>
+        <w:numPr>
+          <w:ilvl w:val="0"/>
+          <w:numId w:val="23"/>
+        </w:numPr>
+      </w:pPr>
+      <w:r>
+        <w:t>QRev.mat files previously saved can be view as saved but will apply new features upon any change.</w:t>
+      </w:r>
+    </w:p>
+    <w:p>
+      <w:pPr>
+        <w:pStyle w:val="ListParagraph"/>
+        <w:numPr>
+          <w:ilvl w:val="0"/>
+          <w:numId w:val="23"/>
+        </w:numPr>
+      </w:pPr>
+      <w:r>
+        <w:t>Changed date format to YYYY.MM.DD.</w:t>
+      </w:r>
+    </w:p>
+    <w:p>
+      <w:pPr>
+        <w:pStyle w:val="ListParagraph"/>
+        <w:numPr>
+          <w:ilvl w:val="0"/>
+          <w:numId w:val="23"/>
+        </w:numPr>
+      </w:pPr>
+      <w:r>
+        <w:t>Added background color to the main window to distinguish from QRev.</w:t>
+      </w:r>
+    </w:p>
+    <w:p>
+      <w:pPr>
+        <w:pStyle w:val="ListParagraph"/>
+        <w:numPr>
+          <w:ilvl w:val="0"/>
+          <w:numId w:val="23"/>
+        </w:numPr>
+      </w:pPr>
+      <w:r>
+        <w:t>Extrap subsection label changes based on data loaded and processed.</w:t>
+      </w:r>
+    </w:p>
+    <w:p>
+      <w:pPr>
+        <w:pStyle w:val="ListParagraph"/>
+        <w:numPr>
+          <w:ilvl w:val="0"/>
+          <w:numId w:val="23"/>
+        </w:numPr>
+      </w:pPr>
+      <w:r>
+        <w:t>Fixed some compatibility issues with RS5 data.</w:t>
+      </w:r>
+    </w:p>
+    <w:p>
+      <w:pPr>
+        <w:rPr>
+          <w:b/>
+          <w:bCs/>
+        </w:rPr>
+      </w:pPr>
+      <w:r>
+        <w:rPr>
+          <w:b/>
+          <w:bCs/>
+        </w:rPr>
+        <w:t xml:space="preserve">Changes </w:t>
+      </w:r>
+      <w:r>
+        <w:rPr>
+          <w:b/>
+          <w:bCs/>
+        </w:rPr>
+        <w:t xml:space="preserve">QRev </w:t>
+      </w:r>
+      <w:r>
+        <w:rPr>
+          <w:b/>
+          <w:bCs/>
+        </w:rPr>
+        <w:t xml:space="preserve">4.23 to </w:t>
+      </w:r>
+      <w:r>
+        <w:rPr>
+          <w:b/>
+          <w:bCs/>
+        </w:rPr>
+        <w:t xml:space="preserve">QRevInt </w:t>
+      </w:r>
+      <w:r>
+        <w:rPr>
+          <w:b/>
+          <w:bCs/>
+        </w:rPr>
+        <w:t>4.26</w:t>
+      </w:r>
+      <w:r>
+        <w:rPr>
+          <w:b/>
+          <w:bCs/>
+        </w:rPr>
+        <w:t xml:space="preserve"> Beta</w:t>
+      </w:r>
+    </w:p>
+    <w:p>
+      <w:pPr>
+        <w:pStyle w:val="ListParagraph"/>
+        <w:numPr>
+          <w:ilvl w:val="0"/>
+          <w:numId w:val="22"/>
+        </w:numPr>
+      </w:pPr>
+      <w:r>
+        <w:t>Due to development conducted outside the USGS the name was changed to QRevInt, so as to represent the international support and development.</w:t>
+      </w:r>
+    </w:p>
+    <w:p>
+      <w:pPr>
+        <w:pStyle w:val="ListParagraph"/>
+        <w:numPr>
+          <w:ilvl w:val="0"/>
+          <w:numId w:val="22"/>
+        </w:numPr>
+      </w:pPr>
+      <w:r>
+        <w:t>Change icon to blue to distinguish from USGS version of QRev</w:t>
+      </w:r>
+    </w:p>
+    <w:p>
+      <w:pPr>
+        <w:pStyle w:val="ListParagraph"/>
+        <w:numPr>
+          <w:ilvl w:val="0"/>
+          <w:numId w:val="22"/>
+        </w:numPr>
+      </w:pPr>
+      <w:r>
+        <w:t>Fixed bug in EDI associated with GPS data.</w:t>
+      </w:r>
+    </w:p>
+    <w:p>
+      <w:pPr>
+        <w:pStyle w:val="ListParagraph"/>
+        <w:numPr>
+          <w:ilvl w:val="0"/>
+          <w:numId w:val="22"/>
+        </w:numPr>
+      </w:pPr>
+      <w:r>
+        <w:t>Technical manual update to include explanation of computing discharge in shallow water and corrected table 10.</w:t>
+      </w:r>
+    </w:p>
+    <w:p>
+      <w:pPr>
+        <w:pStyle w:val="ListParagraph"/>
+        <w:numPr>
+          <w:ilvl w:val="0"/>
+          <w:numId w:val="22"/>
+        </w:numPr>
+      </w:pPr>
+      <w:r>
+        <w:t>Fixed bug in applying weighted medians when switching from automatic to manual data type</w:t>
+      </w:r>
+    </w:p>
+    <w:p>
+      <w:pPr>
+        <w:pStyle w:val="ListParagraph"/>
+        <w:numPr>
+          <w:ilvl w:val="0"/>
+          <w:numId w:val="22"/>
+        </w:numPr>
+      </w:pPr>
+      <w:r>
+        <w:t>Modified extrap subsection so that subsectioning always works from left to right</w:t>
+      </w:r>
+    </w:p>
+    <w:p>
+      <w:pPr>
+        <w:pStyle w:val="ListParagraph"/>
+        <w:numPr>
+          <w:ilvl w:val="0"/>
+          <w:numId w:val="22"/>
+        </w:numPr>
+      </w:pPr>
+      <w:r>
+        <w:t>Removed depth from Oursin measured discharge uncertainty</w:t>
+      </w:r>
+    </w:p>
+    <w:p>
+      <w:pPr>
+        <w:pStyle w:val="ListParagraph"/>
+        <w:numPr>
+          <w:ilvl w:val="0"/>
+          <w:numId w:val="22"/>
+        </w:numPr>
+      </w:pPr>
+      <w:r>
+        <w:t>Added start date and delta Q to summary table</w:t>
+      </w:r>
+    </w:p>
+    <w:p>
+      <w:pPr>
+        <w:pStyle w:val="ListParagraph"/>
+        <w:numPr>
+          <w:ilvl w:val="0"/>
+          <w:numId w:val="22"/>
+        </w:numPr>
+      </w:pPr>
+      <w:r>
+        <w:t>Modified documentation reflect change to QRevInt</w:t>
+      </w:r>
+    </w:p>
+    <w:p>
+      <w:r>
+        <w:rPr>
+          <w:b/>
+          <w:bCs/>
+        </w:rPr>
+        <w:t>Changes 4.23 to 4.24</w:t>
+      </w:r>
+    </w:p>
+    <w:p>
+      <w:pPr>
+        <w:pStyle w:val="ListParagraph"/>
+        <w:numPr>
+          <w:ilvl w:val="0"/>
+          <w:numId w:val="20"/>
+        </w:numPr>
+      </w:pPr>
+      <w:r>
+        <w:t>Added user option to prompt for rating on save</w:t>
+      </w:r>
+    </w:p>
+    <w:p>
+      <w:pPr>
+        <w:pStyle w:val="ListParagraph"/>
+        <w:numPr>
+          <w:ilvl w:val="0"/>
+          <w:numId w:val="20"/>
+        </w:numPr>
+      </w:pPr>
+      <w:r>
+        <w:t>Added user option to compute extrapolation fit using discharge weighted medians</w:t>
+      </w:r>
+    </w:p>
+    <w:p>
+      <w:pPr>
+        <w:pStyle w:val="ListParagraph"/>
+        <w:numPr>
+          <w:ilvl w:val="0"/>
+          <w:numId w:val="20"/>
+        </w:numPr>
+      </w:pPr>
+      <w:r>
+        <w:t>Total measurement discharge will ignore any transect with a discharge that could not be computed</w:t>
+      </w:r>
+    </w:p>
+    <w:p>
+      <w:pPr>
+        <w:pStyle w:val="ListParagraph"/>
+        <w:numPr>
+          <w:ilvl w:val="0"/>
+          <w:numId w:val="20"/>
+        </w:numPr>
+      </w:pPr>
+      <w:r>
+        <w:t>Fixed bug reading some old QRev.mat files associated with new rating feature</w:t>
+      </w:r>
+    </w:p>
+    <w:p>
+      <w:pPr>
+        <w:rPr>
+          <w:b/>
+          <w:bCs/>
+        </w:rPr>
+      </w:pPr>
+      <w:r>
+        <w:rPr>
+          <w:b/>
+          <w:bCs/>
+        </w:rPr>
+        <w:t>Changes 4.21 to 4.23</w:t>
+      </w:r>
+    </w:p>
+    <w:p>
+      <w:pPr>
+        <w:pStyle w:val="ListParagraph"/>
+        <w:numPr>
+          <w:ilvl w:val="0"/>
+          <w:numId w:val="20"/>
+        </w:numPr>
+      </w:pPr>
+      <w:r>
+        <w:t>New TRDI raw data reader that is 3+ times faster</w:t>
+      </w:r>
+    </w:p>
+    <w:p>
+      <w:pPr>
+        <w:pStyle w:val="ListParagraph"/>
+        <w:numPr>
+          <w:ilvl w:val="0"/>
+          <w:numId w:val="20"/>
+        </w:numPr>
+      </w:pPr>
+      <w:r>
+        <w:t xml:space="preserve">Fixed issue with depth reference drop down </w:t>
+      </w:r>
+      <w:r>
+        <w:t xml:space="preserve">menu </w:t>
+      </w:r>
+      <w:r>
+        <w:t>when depth sounder data were collected</w:t>
+      </w:r>
+    </w:p>
+    <w:p>
+      <w:pPr>
+        <w:pStyle w:val="ListParagraph"/>
+        <w:numPr>
+          <w:ilvl w:val="0"/>
+          <w:numId w:val="20"/>
+        </w:numPr>
+      </w:pPr>
+      <w:r>
+        <w:t>Fixed issue so that GPS references that aren’t available cannot be selected</w:t>
+      </w:r>
+    </w:p>
+    <w:p>
+      <w:pPr>
+        <w:pStyle w:val="ListParagraph"/>
+        <w:numPr>
+          <w:ilvl w:val="0"/>
+          <w:numId w:val="20"/>
+        </w:numPr>
+      </w:pPr>
+      <w:r>
+        <w:t>Fixed several issues with new GPS-BT tab and GPS usage for moving-bed test</w:t>
+      </w:r>
+    </w:p>
+    <w:p>
+      <w:pPr>
+        <w:pStyle w:val="ListParagraph"/>
+        <w:numPr>
+          <w:ilvl w:val="0"/>
+          <w:numId w:val="20"/>
+        </w:numPr>
+      </w:pPr>
+      <w:r>
+        <w:t>Fixed bugs in heading interpolation</w:t>
+      </w:r>
+    </w:p>
+    <w:p>
+      <w:pPr>
+        <w:pStyle w:val="ListParagraph"/>
+        <w:numPr>
+          <w:ilvl w:val="0"/>
+          <w:numId w:val="20"/>
+        </w:numPr>
+      </w:pPr>
+      <w:r>
+        <w:t>Fixed bug reading *_QRev.mat having only 1 transect</w:t>
+      </w:r>
+    </w:p>
+    <w:p>
+      <w:pPr>
+        <w:pStyle w:val="ListParagraph"/>
+        <w:numPr>
+          <w:ilvl w:val="0"/>
+          <w:numId w:val="20"/>
+        </w:numPr>
+      </w:pPr>
+      <w:r>
+        <w:t>Fixed bug when loading measurement with no transects selected</w:t>
+      </w:r>
+    </w:p>
+    <w:p>
+      <w:pPr>
+        <w:pStyle w:val="ListParagraph"/>
+        <w:numPr>
+          <w:ilvl w:val="0"/>
+          <w:numId w:val="20"/>
+        </w:numPr>
+      </w:pPr>
+      <w:r>
+        <w:t xml:space="preserve">Fixed issue </w:t>
+      </w:r>
+      <w:r>
+        <w:t>that could occur when processing moving-bed tests loaded from *_QRev.mat</w:t>
+      </w:r>
+    </w:p>
+    <w:p>
+      <w:pPr>
+        <w:rPr>
+          <w:b/>
+          <w:bCs/>
+        </w:rPr>
+      </w:pPr>
+      <w:r>
+        <w:rPr>
+          <w:b/>
+          <w:bCs/>
+        </w:rPr>
+        <w:t>Changes 4.16 to 4.</w:t>
+      </w:r>
+      <w:r>
+        <w:rPr>
+          <w:b/>
+          <w:bCs/>
+        </w:rPr>
+        <w:t>2</w:t>
+      </w:r>
+      <w:r>
+        <w:rPr>
+          <w:b/>
+          <w:bCs/>
+        </w:rPr>
+        <w:t>1</w:t>
+      </w:r>
+    </w:p>
+    <w:p>
+      <w:pPr>
+        <w:pStyle w:val="ListParagraph"/>
+        <w:numPr>
+          <w:ilvl w:val="0"/>
+          <w:numId w:val="19"/>
+        </w:numPr>
+      </w:pPr>
+      <w:r>
         <w:lastRenderedPageBreak/>
-        <w:t>Several minor bug fixes</w:t>
-      </w:r>
-    </w:p>
-    <w:p>
-      <w:pPr>
-        <w:pStyle w:val="ListParagraph"/>
-        <w:numPr>
-          <w:ilvl w:val="0"/>
-          <w:numId w:val="26"/>
-        </w:numPr>
-      </w:pPr>
-      <w:r>
-        <w:t>Graphics for BT, GPS, Depths, and WT now share x-axis for zoom and pan</w:t>
-      </w:r>
-    </w:p>
-    <w:p>
-      <w:pPr>
-        <w:pStyle w:val="ListParagraph"/>
-        <w:numPr>
-          <w:ilvl w:val="0"/>
-          <w:numId w:val="26"/>
-        </w:numPr>
-      </w:pPr>
-      <w:r>
-        <w:t>Added stage start, end, and measurement to Premeasurement tab</w:t>
-      </w:r>
-    </w:p>
-    <w:p>
-      <w:pPr>
-        <w:pStyle w:val="ListParagraph"/>
-        <w:numPr>
-          <w:ilvl w:val="0"/>
-          <w:numId w:val="26"/>
-        </w:numPr>
-      </w:pPr>
-      <w:r>
-        <w:t>Modified messages for moving-bed conditions based on selected reference</w:t>
-      </w:r>
-    </w:p>
-    <w:p>
-      <w:pPr>
-        <w:pStyle w:val="ListParagraph"/>
-        <w:numPr>
-          <w:ilvl w:val="0"/>
-          <w:numId w:val="26"/>
-        </w:numPr>
-      </w:pPr>
-      <w:r>
-        <w:t>New QA methods applied consistently when Viewing previously saved QRev.mat</w:t>
-      </w:r>
-    </w:p>
-    <w:p>
-      <w:pPr>
-        <w:rPr>
-          <w:b/>
-          <w:bCs/>
-        </w:rPr>
-      </w:pPr>
-      <w:r>
-        <w:rPr>
-          <w:b/>
-          <w:bCs/>
-        </w:rPr>
-        <w:t>Changes QRevInt 1.01 to QRevInt 1.06</w:t>
-      </w:r>
-    </w:p>
-    <w:p>
-      <w:pPr>
-        <w:pStyle w:val="ListParagraph"/>
-        <w:numPr>
-          <w:ilvl w:val="0"/>
-          <w:numId w:val="25"/>
-        </w:numPr>
-      </w:pPr>
-      <w:r>
-        <w:t>Added shortcut keys</w:t>
-      </w:r>
-    </w:p>
-    <w:p>
-      <w:pPr>
-        <w:pStyle w:val="ListParagraph"/>
-        <w:numPr>
-          <w:ilvl w:val="0"/>
-          <w:numId w:val="25"/>
-        </w:numPr>
-      </w:pPr>
-      <w:r>
-        <w:t>Added option to use length or time for x-axis</w:t>
-      </w:r>
-    </w:p>
-    <w:p>
-      <w:pPr>
-        <w:pStyle w:val="ListParagraph"/>
-        <w:numPr>
-          <w:ilvl w:val="0"/>
-          <w:numId w:val="25"/>
-        </w:numPr>
-      </w:pPr>
-      <w:r>
-        <w:t>Added Advanced Graphics tab</w:t>
-      </w:r>
-    </w:p>
-    <w:p>
-      <w:pPr>
-        <w:pStyle w:val="ListParagraph"/>
-        <w:numPr>
-          <w:ilvl w:val="0"/>
-          <w:numId w:val="25"/>
-        </w:numPr>
-      </w:pPr>
-      <w:r>
-        <w:t>Added correlation and RSSI/SNR to boat data</w:t>
-      </w:r>
-    </w:p>
-    <w:p>
-      <w:pPr>
-        <w:pStyle w:val="ListParagraph"/>
-        <w:numPr>
-          <w:ilvl w:val="0"/>
-          <w:numId w:val="25"/>
-        </w:numPr>
-      </w:pPr>
-      <w:r>
-        <w:t>Fixed code identifying RS5 ADCP model</w:t>
-      </w:r>
-    </w:p>
-    <w:p>
-      <w:pPr>
-        <w:pStyle w:val="ListParagraph"/>
-        <w:numPr>
-          <w:ilvl w:val="0"/>
-          <w:numId w:val="25"/>
-        </w:numPr>
-      </w:pPr>
-      <w:r>
-        <w:t>Fixed ping type and frequency identification</w:t>
-      </w:r>
-    </w:p>
-    <w:p>
-      <w:pPr>
-        <w:pStyle w:val="ListParagraph"/>
-        <w:numPr>
-          <w:ilvl w:val="0"/>
-          <w:numId w:val="25"/>
-        </w:numPr>
-      </w:pPr>
-      <w:r>
-        <w:t>Update</w:t>
-      </w:r>
-      <w:r>
-        <w:t>d</w:t>
-      </w:r>
-      <w:r>
-        <w:t xml:space="preserve"> Oursin uncertainty model to latest methods including Bayesian COV</w:t>
-      </w:r>
-    </w:p>
-    <w:p>
-      <w:pPr>
-        <w:pStyle w:val="ListParagraph"/>
-        <w:numPr>
-          <w:ilvl w:val="0"/>
-          <w:numId w:val="25"/>
-        </w:numPr>
-      </w:pPr>
-      <w:r>
-        <w:t>Updated Oursin user interface and graphs</w:t>
-      </w:r>
-    </w:p>
-    <w:p>
-      <w:pPr>
-        <w:pStyle w:val="ListParagraph"/>
-        <w:numPr>
-          <w:ilvl w:val="0"/>
-          <w:numId w:val="25"/>
-        </w:numPr>
-      </w:pPr>
-      <w:r>
-        <w:t>Added new data fields to *_QRev.mat while maintaining compatibility with older files</w:t>
-      </w:r>
-    </w:p>
-    <w:p>
-      <w:pPr>
-        <w:pStyle w:val="ListParagraph"/>
-        <w:numPr>
-          <w:ilvl w:val="0"/>
-          <w:numId w:val="25"/>
-        </w:numPr>
-      </w:pPr>
-      <w:r>
-        <w:t xml:space="preserve">Added ability </w:t>
-      </w:r>
-      <w:r>
-        <w:t>for</w:t>
-      </w:r>
-      <w:r>
-        <w:t xml:space="preserve"> agencies to configure the Options dialog and the default values</w:t>
-      </w:r>
-    </w:p>
-    <w:p>
-      <w:pPr>
-        <w:pStyle w:val="ListParagraph"/>
-        <w:numPr>
-          <w:ilvl w:val="0"/>
-          <w:numId w:val="25"/>
-        </w:numPr>
-      </w:pPr>
-      <w:r>
-        <w:t>Added option to allow an observed no moving-bed condition</w:t>
-      </w:r>
-    </w:p>
-    <w:p>
-      <w:pPr>
-        <w:pStyle w:val="ListParagraph"/>
-        <w:numPr>
-          <w:ilvl w:val="0"/>
-          <w:numId w:val="25"/>
-        </w:numPr>
-      </w:pPr>
-      <w:r>
-        <w:t>Added option to turn off use of heading data</w:t>
-      </w:r>
-    </w:p>
-    <w:p>
-      <w:pPr>
-        <w:pStyle w:val="ListParagraph"/>
-        <w:numPr>
-          <w:ilvl w:val="0"/>
-          <w:numId w:val="25"/>
-        </w:numPr>
-      </w:pPr>
-      <w:r>
-        <w:t>Filter settings for transects are no</w:t>
-      </w:r>
-      <w:r>
-        <w:t>w</w:t>
-      </w:r>
-      <w:r>
-        <w:t xml:space="preserve"> applied to moving-bed tests</w:t>
-      </w:r>
-    </w:p>
-    <w:p>
-      <w:pPr>
-        <w:pStyle w:val="ListParagraph"/>
-        <w:numPr>
-          <w:ilvl w:val="0"/>
-          <w:numId w:val="25"/>
-        </w:numPr>
-      </w:pPr>
-      <w:r>
-        <w:t>Added tooltips to all tables and labels that are highlighted due to ADQA</w:t>
-      </w:r>
-    </w:p>
-    <w:p>
-      <w:pPr>
-        <w:pStyle w:val="ListParagraph"/>
-        <w:numPr>
-          <w:ilvl w:val="0"/>
-          <w:numId w:val="25"/>
-        </w:numPr>
-      </w:pPr>
-      <w:r>
-        <w:t>Uses Numba AOT compiling of robust loess smooth, Bayesian COV, and top and bottom discharge computations to improve overall speed. 70% average speed improvement.</w:t>
-      </w:r>
-    </w:p>
-    <w:p>
-      <w:pPr>
-        <w:pStyle w:val="ListParagraph"/>
-        <w:numPr>
-          <w:ilvl w:val="0"/>
-          <w:numId w:val="25"/>
-        </w:numPr>
-      </w:pPr>
-      <w:r>
-        <w:t>Improvements</w:t>
-      </w:r>
-      <w:r>
-        <w:t xml:space="preserve"> to depth filter. May cause </w:t>
-      </w:r>
-      <w:r>
-        <w:t xml:space="preserve">a </w:t>
-      </w:r>
-      <w:r>
-        <w:t>small change in discharge for some measurements.</w:t>
-      </w:r>
-    </w:p>
-    <w:p>
-      <w:pPr>
-        <w:pStyle w:val="ListParagraph"/>
-        <w:numPr>
-          <w:ilvl w:val="0"/>
-          <w:numId w:val="25"/>
-        </w:numPr>
-      </w:pPr>
-      <w:r>
-        <w:t>Added fields for Measurement Number and Person(s) to Premeasurement tab</w:t>
-      </w:r>
-    </w:p>
-    <w:p>
-      <w:pPr>
-        <w:pStyle w:val="ListParagraph"/>
-        <w:numPr>
-          <w:ilvl w:val="0"/>
-          <w:numId w:val="25"/>
-        </w:numPr>
-      </w:pPr>
-      <w:r>
-        <w:t>All reported and/or discovered bugs were fixed.</w:t>
-      </w:r>
-    </w:p>
-    <w:p>
-      <w:pPr>
-        <w:pStyle w:val="ListParagraph"/>
-        <w:numPr>
-          <w:ilvl w:val="0"/>
-          <w:numId w:val="25"/>
-        </w:numPr>
-      </w:pPr>
-      <w:r>
-        <w:t>User’s manual updated</w:t>
-      </w:r>
-    </w:p>
-    <w:p>
-      <w:pPr>
-        <w:pStyle w:val="ListParagraph"/>
-        <w:numPr>
-          <w:ilvl w:val="0"/>
-          <w:numId w:val="25"/>
-        </w:numPr>
-      </w:pPr>
-      <w:r>
-        <w:t>Technical manual updated</w:t>
-      </w:r>
-    </w:p>
-    <w:p>
-      <w:pPr>
-        <w:rPr>
-          <w:b/>
-          <w:bCs/>
-        </w:rPr>
-      </w:pPr>
-      <w:r>
-        <w:rPr>
-          <w:b/>
-          <w:bCs/>
-        </w:rPr>
-        <w:t>Changes QRevInt 1.00 to QRevInt 1.01</w:t>
-      </w:r>
-    </w:p>
-    <w:p>
-      <w:pPr>
-        <w:pStyle w:val="ListParagraph"/>
-        <w:numPr>
-          <w:ilvl w:val="0"/>
-          <w:numId w:val="24"/>
-        </w:numPr>
-      </w:pPr>
-      <w:r>
-        <w:t>Changed composite depths to interpolate for invalid depths using the composite data rather than the primary reference.</w:t>
-      </w:r>
-    </w:p>
-    <w:p>
-      <w:pPr>
-        <w:pStyle w:val="ListParagraph"/>
-        <w:numPr>
-          <w:ilvl w:val="0"/>
-          <w:numId w:val="24"/>
-        </w:numPr>
-      </w:pPr>
-      <w:r>
-        <w:t>WT error and vertical velocity filters are now applied based on ping type for all new processing of data.</w:t>
-      </w:r>
-      <w:r>
-        <w:t xml:space="preserve"> </w:t>
-      </w:r>
-      <w:r>
-        <w:t>Loading older QRev files without reprocessing will display previous results.</w:t>
-      </w:r>
-    </w:p>
-    <w:p>
-      <w:pPr>
-        <w:pStyle w:val="ListParagraph"/>
-        <w:numPr>
-          <w:ilvl w:val="0"/>
-          <w:numId w:val="24"/>
-        </w:numPr>
-      </w:pPr>
-      <w:r>
-        <w:t>BT error and vertical velocity filters are now applied based on bottom track ping frequency for all new processing of data. Loading older QRev files without reprocessing will display previous results.</w:t>
-      </w:r>
-    </w:p>
-    <w:p>
-      <w:pPr>
-        <w:pStyle w:val="ListParagraph"/>
-        <w:numPr>
-          <w:ilvl w:val="0"/>
-          <w:numId w:val="24"/>
-        </w:numPr>
-      </w:pPr>
-      <w:r>
-        <w:t xml:space="preserve">The user now has an option in the Options dialog to apply error and vertical velocity filters based on data from the entire measurement rather than based on data from individual measurements. </w:t>
-      </w:r>
-    </w:p>
-    <w:p>
-      <w:pPr>
-        <w:pStyle w:val="ListParagraph"/>
-        <w:numPr>
-          <w:ilvl w:val="0"/>
-          <w:numId w:val="24"/>
-        </w:numPr>
-      </w:pPr>
-      <w:r>
-        <w:t>An option for the jet color map has been added to the Options dialog.</w:t>
-      </w:r>
-    </w:p>
-    <w:p>
-      <w:pPr>
-        <w:pStyle w:val="ListParagraph"/>
-        <w:numPr>
-          <w:ilvl w:val="0"/>
-          <w:numId w:val="24"/>
-        </w:numPr>
-      </w:pPr>
-      <w:r>
-        <w:t xml:space="preserve">Added points to </w:t>
-      </w:r>
-      <w:r>
-        <w:t>plots in Depth tab</w:t>
-      </w:r>
-    </w:p>
-    <w:p>
-      <w:pPr>
-        <w:pStyle w:val="ListParagraph"/>
-        <w:numPr>
-          <w:ilvl w:val="0"/>
-          <w:numId w:val="24"/>
-        </w:numPr>
-      </w:pPr>
-      <w:r>
-        <w:t>Fixed several bugs related to reading RS5 and older QRev files.</w:t>
-      </w:r>
-    </w:p>
-    <w:p>
-      <w:pPr>
-        <w:pStyle w:val="ListParagraph"/>
-        <w:rPr>
-          <w:b/>
-          <w:bCs/>
-        </w:rPr>
-      </w:pPr>
-    </w:p>
-    <w:p>
-      <w:pPr>
-        <w:rPr>
-          <w:b/>
-          <w:bCs/>
-        </w:rPr>
-      </w:pPr>
-      <w:r>
-        <w:rPr>
-          <w:b/>
-          <w:bCs/>
-        </w:rPr>
+        <w:t>Added code to identify and notify of user changes to original values</w:t>
+      </w:r>
+    </w:p>
+    <w:p>
+      <w:pPr>
+        <w:pStyle w:val="ListParagraph"/>
+        <w:numPr>
+          <w:ilvl w:val="0"/>
+          <w:numId w:val="19"/>
+        </w:numPr>
+      </w:pPr>
+      <w:r>
+        <w:t>Added ability to use GPS as a reference for moving-bed tests</w:t>
+      </w:r>
+    </w:p>
+    <w:p>
+      <w:pPr>
+        <w:pStyle w:val="ListParagraph"/>
+        <w:numPr>
+          <w:ilvl w:val="0"/>
+          <w:numId w:val="19"/>
+        </w:numPr>
+      </w:pPr>
+      <w:r>
+        <w:t>Applying magvar or heading offset or heading source changes to all transects applies them to moving-bed test also</w:t>
+      </w:r>
+    </w:p>
+    <w:p>
+      <w:pPr>
+        <w:pStyle w:val="ListParagraph"/>
+        <w:numPr>
+          <w:ilvl w:val="0"/>
+          <w:numId w:val="19"/>
+        </w:numPr>
+      </w:pPr>
+      <w:r>
+        <w:t>Moving-bed test flow speed now corrected for moving-bed velocity</w:t>
+      </w:r>
+    </w:p>
+    <w:p>
+      <w:pPr>
+        <w:pStyle w:val="ListParagraph"/>
+        <w:numPr>
+          <w:ilvl w:val="0"/>
+          <w:numId w:val="19"/>
+        </w:numPr>
+      </w:pPr>
+      <w:r>
+        <w:t>Added automatic checking of GPS lag</w:t>
+      </w:r>
+    </w:p>
+    <w:p>
+      <w:pPr>
+        <w:pStyle w:val="ListParagraph"/>
+        <w:numPr>
+          <w:ilvl w:val="0"/>
+          <w:numId w:val="19"/>
+        </w:numPr>
+      </w:pPr>
+      <w:r>
+        <w:t>Added GPS – BT comparison tab to GPS Tab</w:t>
+      </w:r>
+    </w:p>
+    <w:p>
+      <w:pPr>
+        <w:pStyle w:val="ListParagraph"/>
+        <w:numPr>
+          <w:ilvl w:val="0"/>
+          <w:numId w:val="19"/>
+        </w:numPr>
+      </w:pPr>
+      <w:r>
+        <w:t>Fixed issue with applying the correct moving-bed test when multiple tests are available</w:t>
+      </w:r>
+    </w:p>
+    <w:p>
+      <w:pPr>
+        <w:pStyle w:val="ListParagraph"/>
+        <w:numPr>
+          <w:ilvl w:val="0"/>
+          <w:numId w:val="19"/>
+        </w:numPr>
+      </w:pPr>
+      <w:r>
+        <w:t>Modifications to allow QRev to work with Rowe and Nortek ADCPs.</w:t>
+      </w:r>
+    </w:p>
+    <w:p>
+      <w:pPr>
+        <w:pStyle w:val="ListParagraph"/>
+        <w:numPr>
+          <w:ilvl w:val="0"/>
+          <w:numId w:val="19"/>
+        </w:numPr>
+      </w:pPr>
+      <w:r>
+        <w:t>Added support for user edge discharge for WinRiver II 2.22</w:t>
+      </w:r>
+    </w:p>
+    <w:p>
+      <w:pPr>
+        <w:pStyle w:val="ListParagraph"/>
+        <w:numPr>
+          <w:ilvl w:val="0"/>
+          <w:numId w:val="19"/>
+        </w:numPr>
+      </w:pPr>
+      <w:r>
+        <w:t>“.mat” is always appended as suffix to saved QRev file</w:t>
+      </w:r>
+    </w:p>
+    <w:p>
+      <w:pPr>
+        <w:pStyle w:val="ListParagraph"/>
+        <w:numPr>
+          <w:ilvl w:val="0"/>
+          <w:numId w:val="19"/>
+        </w:numPr>
+      </w:pPr>
+      <w:r>
+        <w:t>Manual threshold for wt and bt saved and displayed when opening *_QRev.mat</w:t>
+      </w:r>
+    </w:p>
+    <w:p>
+      <w:pPr>
+        <w:pStyle w:val="ListParagraph"/>
+        <w:numPr>
+          <w:ilvl w:val="0"/>
+          <w:numId w:val="19"/>
+        </w:numPr>
+      </w:pPr>
+      <w:r>
+        <w:t>Modified code to use 1</w:t>
+      </w:r>
+      <w:r>
+        <w:rPr>
+          <w:vertAlign w:val="superscript"/>
+        </w:rPr>
+        <w:t>st</w:t>
+      </w:r>
+      <w:r>
+        <w:t xml:space="preserve"> checked transect rather than 1</w:t>
+      </w:r>
+      <w:r>
+        <w:rPr>
+          <w:vertAlign w:val="superscript"/>
+        </w:rPr>
+        <w:t>st</w:t>
+      </w:r>
+      <w:r>
+        <w:t xml:space="preserve"> transect for general settings</w:t>
+      </w:r>
+    </w:p>
+    <w:p>
+      <w:pPr>
+        <w:pStyle w:val="ListParagraph"/>
+        <w:numPr>
+          <w:ilvl w:val="0"/>
+          <w:numId w:val="19"/>
+        </w:numPr>
+      </w:pPr>
+      <w:r>
+        <w:t>Modified code to accept measurements with inconsistent availability of GPS data types</w:t>
+      </w:r>
+    </w:p>
+    <w:p>
+      <w:pPr>
+        <w:pStyle w:val="ListParagraph"/>
+        <w:numPr>
+          <w:ilvl w:val="0"/>
+          <w:numId w:val="19"/>
+        </w:numPr>
+      </w:pPr>
+      <w:r>
+        <w:t>Fixed issue loading data with no valid bottom track</w:t>
+      </w:r>
+    </w:p>
+    <w:p>
+      <w:pPr>
+        <w:pStyle w:val="ListParagraph"/>
+        <w:numPr>
+          <w:ilvl w:val="0"/>
+          <w:numId w:val="19"/>
+        </w:numPr>
+      </w:pPr>
+      <w:r>
+        <w:t>Added notification when SonTek data is loaded with other than Earth coordinates</w:t>
+      </w:r>
+    </w:p>
+    <w:p>
+      <w:pPr>
+        <w:pStyle w:val="ListParagraph"/>
+        <w:numPr>
+          <w:ilvl w:val="0"/>
+          <w:numId w:val="19"/>
+        </w:numPr>
+      </w:pPr>
+      <w:r>
+        <w:t>Fixed issue with selecting transects in EDI if some transects were not checked</w:t>
+      </w:r>
+    </w:p>
+    <w:p>
+      <w:pPr>
+        <w:pStyle w:val="ListParagraph"/>
+        <w:numPr>
+          <w:ilvl w:val="0"/>
+          <w:numId w:val="19"/>
+        </w:numPr>
+      </w:pPr>
+      <w:r>
+        <w:t>Fixed issue in EDI if no GPS data are available</w:t>
+      </w:r>
+    </w:p>
+    <w:p>
+      <w:pPr>
+        <w:pStyle w:val="ListParagraph"/>
+        <w:numPr>
+          <w:ilvl w:val="0"/>
+          <w:numId w:val="19"/>
+        </w:numPr>
+      </w:pPr>
+      <w:r>
+        <w:t>Fixed QA check for missing samples</w:t>
+      </w:r>
+    </w:p>
+    <w:p>
+      <w:pPr>
+        <w:pStyle w:val="ListParagraph"/>
+        <w:numPr>
+          <w:ilvl w:val="0"/>
+          <w:numId w:val="19"/>
+        </w:numPr>
+      </w:pPr>
+      <w:r>
+        <w:t>Fixed issue with invalid stationary moving-bed tests used for correction</w:t>
+      </w:r>
+    </w:p>
+    <w:p>
+      <w:pPr>
+        <w:rPr>
+          <w:b/>
+          <w:bCs/>
+        </w:rPr>
+      </w:pPr>
+    </w:p>
+    <w:p>
+      <w:r>
+        <w:rPr>
+          <w:b/>
+          <w:bCs/>
+        </w:rPr>
+        <w:t>Changes 4</w:t>
+      </w:r>
+      <w:r>
+        <w:rPr>
+          <w:b/>
+          <w:bCs/>
+        </w:rPr>
+        <w:t>.</w:t>
+      </w:r>
+      <w:r>
+        <w:rPr>
+          <w:b/>
+          <w:bCs/>
+        </w:rPr>
+        <w:t>15 to 4</w:t>
+      </w:r>
+      <w:r>
+        <w:rPr>
+          <w:b/>
+          <w:bCs/>
+        </w:rPr>
+        <w:t>.</w:t>
+      </w:r>
+      <w:r>
+        <w:rPr>
+          <w:b/>
+          <w:bCs/>
+        </w:rPr>
+        <w:t>16</w:t>
+      </w:r>
+    </w:p>
+    <w:p>
+      <w:pPr>
+        <w:pStyle w:val="ListParagraph"/>
+        <w:numPr>
+          <w:ilvl w:val="0"/>
+          <w:numId w:val="18"/>
+        </w:numPr>
+      </w:pPr>
+      <w:r>
+        <w:t>Fixed incomplete system test for TRDI causing crash when saving</w:t>
+      </w:r>
+    </w:p>
+    <w:p>
+      <w:pPr>
+        <w:pStyle w:val="ListParagraph"/>
+        <w:numPr>
+          <w:ilvl w:val="0"/>
+          <w:numId w:val="18"/>
+        </w:numPr>
+      </w:pPr>
+      <w:r>
+        <w:t>Fixed issue with PT3 test status not displayed properly</w:t>
+      </w:r>
+    </w:p>
+    <w:p>
+      <w:pPr>
+        <w:pStyle w:val="ListParagraph"/>
+        <w:numPr>
+          <w:ilvl w:val="0"/>
+          <w:numId w:val="18"/>
+        </w:numPr>
+      </w:pPr>
+      <w:r>
+        <w:t>Fixed issue with VTG low speed message</w:t>
+      </w:r>
+    </w:p>
+    <w:p>
+      <w:pPr>
+        <w:pStyle w:val="ListParagraph"/>
+        <w:numPr>
+          <w:ilvl w:val="0"/>
+          <w:numId w:val="18"/>
+        </w:numPr>
+      </w:pPr>
+      <w:r>
+        <w:t>Fixed issue with VTG and composite tracks on causing switch to GGA</w:t>
+      </w:r>
+    </w:p>
+    <w:p>
+      <w:pPr>
+        <w:pStyle w:val="ListParagraph"/>
+        <w:numPr>
+          <w:ilvl w:val="0"/>
+          <w:numId w:val="18"/>
+        </w:numPr>
+      </w:pPr>
+      <w:r>
+        <w:t>Fixed issues with the edges tab</w:t>
+      </w:r>
+      <w:r>
+        <w:t>: no valid GPS, 0 or 1 ensembles selected, etc.</w:t>
+      </w:r>
+    </w:p>
+    <w:p>
+      <w:pPr>
+        <w:pStyle w:val="ListParagraph"/>
+        <w:numPr>
+          <w:ilvl w:val="0"/>
+          <w:numId w:val="18"/>
+        </w:numPr>
+      </w:pPr>
+      <w:r>
+        <w:t>Fixed issues with tab text color not updating properly</w:t>
+      </w:r>
+    </w:p>
+    <w:p>
+      <w:pPr>
+        <w:pStyle w:val="ListParagraph"/>
+        <w:numPr>
+          <w:ilvl w:val="0"/>
+          <w:numId w:val="18"/>
+        </w:numPr>
+      </w:pPr>
+      <w:r>
+        <w:t>Updated user’s manual to indicate that 4-beam composite is the default if vertical beam or depth sounder data are available.</w:t>
+      </w:r>
+    </w:p>
+    <w:p>
+      <w:pPr>
+        <w:pStyle w:val="ListParagraph"/>
+        <w:numPr>
+          <w:ilvl w:val="0"/>
+          <w:numId w:val="18"/>
+        </w:numPr>
+      </w:pPr>
+      <w:r>
+        <w:t>Several issues with the interaction with RIVRS were fixed</w:t>
+      </w:r>
+    </w:p>
+    <w:p>
+      <w:pPr>
+        <w:pStyle w:val="ListParagraph"/>
+        <w:numPr>
+          <w:ilvl w:val="0"/>
+          <w:numId w:val="18"/>
+        </w:numPr>
+      </w:pPr>
+      <w:r>
+        <w:t>Fixed inconsistent behavior of the up/down arrows</w:t>
+      </w:r>
+    </w:p>
+    <w:p>
+      <w:pPr>
+        <w:pStyle w:val="ListParagraph"/>
+        <w:numPr>
+          <w:ilvl w:val="0"/>
+          <w:numId w:val="18"/>
+        </w:numPr>
+      </w:pPr>
+      <w:r>
+        <w:t>Improved speed of transect change using up/down arrows</w:t>
+      </w:r>
+    </w:p>
+    <w:p>
+      <w:pPr>
+        <w:pStyle w:val="ListParagraph"/>
+        <w:numPr>
+          <w:ilvl w:val="0"/>
+          <w:numId w:val="18"/>
+        </w:numPr>
+      </w:pPr>
+      <w:r>
+        <w:t>Fixed issue with files saving in previously used folder</w:t>
+      </w:r>
+    </w:p>
+    <w:p>
+      <w:pPr>
+        <w:pStyle w:val="ListParagraph"/>
+        <w:numPr>
+          <w:ilvl w:val="0"/>
+          <w:numId w:val="18"/>
+        </w:numPr>
+      </w:pPr>
+      <w:r>
+        <w:t>Modified code for compatibility with Nortek Signature 1000</w:t>
+      </w:r>
+    </w:p>
+    <w:p>
+      <w:pPr>
+        <w:rPr>
+          <w:b/>
+          <w:bCs/>
+        </w:rPr>
+      </w:pPr>
+      <w:r>
+        <w:rPr>
+          <w:b/>
+          <w:bCs/>
+        </w:rPr>
+        <w:t>Changes 4.14 to 4.15</w:t>
+      </w:r>
+    </w:p>
+    <w:p>
+      <w:pPr>
+        <w:pStyle w:val="ListParagraph"/>
+        <w:numPr>
+          <w:ilvl w:val="0"/>
+          <w:numId w:val="17"/>
+        </w:numPr>
+      </w:pPr>
+      <w:r>
+        <w:t>Fixed issue with shiptrack when all GPS data are invalid</w:t>
+      </w:r>
+    </w:p>
+    <w:p>
+      <w:pPr>
+        <w:pStyle w:val="ListParagraph"/>
+        <w:numPr>
+          <w:ilvl w:val="0"/>
+          <w:numId w:val="17"/>
+        </w:numPr>
+      </w:pPr>
+      <w:r>
+        <w:t>Fixed bug when applying stationary moving-bed correction</w:t>
+      </w:r>
+    </w:p>
+    <w:p>
+      <w:pPr>
+        <w:rPr>
+          <w:b/>
+          <w:bCs/>
+        </w:rPr>
+      </w:pPr>
+      <w:r>
+        <w:rPr>
+          <w:b/>
+          <w:bCs/>
+        </w:rPr>
+        <w:t>Changes 4.13 to 4.14</w:t>
+      </w:r>
+    </w:p>
+    <w:p>
+      <w:pPr>
+        <w:pStyle w:val="ListParagraph"/>
+        <w:numPr>
+          <w:ilvl w:val="0"/>
+          <w:numId w:val="16"/>
+        </w:numPr>
+      </w:pPr>
+      <w:r>
+        <w:t>Fixed issue with applying a loop test when preceded by a stationary test.</w:t>
+      </w:r>
+    </w:p>
+    <w:p>
+      <w:pPr>
+        <w:pStyle w:val="ListParagraph"/>
+        <w:numPr>
+          <w:ilvl w:val="0"/>
+          <w:numId w:val="16"/>
+        </w:numPr>
+      </w:pPr>
+      <w:r>
         <w:lastRenderedPageBreak/>
-        <w:t>Changes QRevInt 4.26 Beta to QRevInt 1.00</w:t>
-      </w:r>
-    </w:p>
-    <w:p>
-      <w:pPr>
-        <w:pStyle w:val="ListParagraph"/>
-        <w:numPr>
-          <w:ilvl w:val="0"/>
-          <w:numId w:val="23"/>
-        </w:numPr>
-      </w:pPr>
-      <w:r>
-        <w:t>New versioning implemented.</w:t>
-      </w:r>
-    </w:p>
-    <w:p>
-      <w:pPr>
-        <w:pStyle w:val="ListParagraph"/>
-        <w:numPr>
-          <w:ilvl w:val="0"/>
-          <w:numId w:val="23"/>
-        </w:numPr>
-      </w:pPr>
-      <w:r>
-        <w:t>Added disclaimer and license that must be agreed to prior to running the first time.</w:t>
-      </w:r>
-    </w:p>
-    <w:p>
-      <w:pPr>
-        <w:pStyle w:val="ListParagraph"/>
-        <w:numPr>
-          <w:ilvl w:val="0"/>
-          <w:numId w:val="23"/>
-        </w:numPr>
-      </w:pPr>
-      <w:r>
-        <w:t>Modified code for compatibility with older QRev.mat files that lack the new features.</w:t>
-      </w:r>
-    </w:p>
-    <w:p>
-      <w:pPr>
-        <w:pStyle w:val="ListParagraph"/>
-        <w:numPr>
-          <w:ilvl w:val="0"/>
-          <w:numId w:val="23"/>
-        </w:numPr>
-      </w:pPr>
-      <w:r>
-        <w:t>QRev.mat files previously saved can be view as saved but will apply new features upon any change.</w:t>
-      </w:r>
-    </w:p>
-    <w:p>
-      <w:pPr>
-        <w:pStyle w:val="ListParagraph"/>
-        <w:numPr>
-          <w:ilvl w:val="0"/>
-          <w:numId w:val="23"/>
-        </w:numPr>
-      </w:pPr>
-      <w:r>
-        <w:t>Changed date format to YYYY.MM.DD.</w:t>
-      </w:r>
-    </w:p>
-    <w:p>
-      <w:pPr>
-        <w:pStyle w:val="ListParagraph"/>
-        <w:numPr>
-          <w:ilvl w:val="0"/>
-          <w:numId w:val="23"/>
-        </w:numPr>
-      </w:pPr>
-      <w:r>
-        <w:t>Added background color to the main window to distinguish from QRev.</w:t>
-      </w:r>
-    </w:p>
-    <w:p>
-      <w:pPr>
-        <w:pStyle w:val="ListParagraph"/>
-        <w:numPr>
-          <w:ilvl w:val="0"/>
-          <w:numId w:val="23"/>
-        </w:numPr>
-      </w:pPr>
-      <w:r>
-        <w:t>Extrap subsection label changes based on data loaded and processed.</w:t>
-      </w:r>
-    </w:p>
-    <w:p>
-      <w:pPr>
-        <w:pStyle w:val="ListParagraph"/>
-        <w:numPr>
-          <w:ilvl w:val="0"/>
-          <w:numId w:val="23"/>
-        </w:numPr>
-      </w:pPr>
-      <w:r>
-        <w:t>Fixed some compatibility issues with RS5 data.</w:t>
-      </w:r>
-    </w:p>
-    <w:p>
-      <w:pPr>
-        <w:rPr>
-          <w:b/>
-          <w:bCs/>
-        </w:rPr>
-      </w:pPr>
-      <w:r>
-        <w:rPr>
-          <w:b/>
-          <w:bCs/>
-        </w:rPr>
-        <w:t xml:space="preserve">Changes </w:t>
-      </w:r>
-      <w:r>
-        <w:rPr>
-          <w:b/>
-          <w:bCs/>
-        </w:rPr>
-        <w:t xml:space="preserve">QRev </w:t>
-      </w:r>
-      <w:r>
-        <w:rPr>
-          <w:b/>
-          <w:bCs/>
-        </w:rPr>
-        <w:t xml:space="preserve">4.23 to </w:t>
-      </w:r>
-      <w:r>
-        <w:rPr>
-          <w:b/>
-          <w:bCs/>
-        </w:rPr>
-        <w:t xml:space="preserve">QRevInt </w:t>
-      </w:r>
-      <w:r>
-        <w:rPr>
-          <w:b/>
-          <w:bCs/>
-        </w:rPr>
-        <w:t>4.26</w:t>
-      </w:r>
-      <w:r>
-        <w:rPr>
-          <w:b/>
-          <w:bCs/>
-        </w:rPr>
-        <w:t xml:space="preserve"> Beta</w:t>
-      </w:r>
-    </w:p>
-    <w:p>
-      <w:pPr>
-        <w:pStyle w:val="ListParagraph"/>
-        <w:numPr>
-          <w:ilvl w:val="0"/>
-          <w:numId w:val="22"/>
-        </w:numPr>
-      </w:pPr>
-      <w:r>
-        <w:t>Due to development conducted outside the USGS the name was changed to QRevInt, so as to represent the international support and development.</w:t>
-      </w:r>
-    </w:p>
-    <w:p>
-      <w:pPr>
-        <w:pStyle w:val="ListParagraph"/>
-        <w:numPr>
-          <w:ilvl w:val="0"/>
-          <w:numId w:val="22"/>
-        </w:numPr>
-      </w:pPr>
-      <w:r>
-        <w:t>Change icon to blue to distinguish from USGS version of QRev</w:t>
-      </w:r>
-    </w:p>
-    <w:p>
-      <w:pPr>
-        <w:pStyle w:val="ListParagraph"/>
-        <w:numPr>
-          <w:ilvl w:val="0"/>
-          <w:numId w:val="22"/>
-        </w:numPr>
-      </w:pPr>
-      <w:r>
-        <w:t>Fixed bug in EDI associated with GPS data.</w:t>
-      </w:r>
-    </w:p>
-    <w:p>
-      <w:pPr>
-        <w:pStyle w:val="ListParagraph"/>
-        <w:numPr>
-          <w:ilvl w:val="0"/>
-          <w:numId w:val="22"/>
-        </w:numPr>
-      </w:pPr>
-      <w:r>
-        <w:t>Technical manual update to include explanation of computing discharge in shallow water and corrected table 10.</w:t>
-      </w:r>
-    </w:p>
-    <w:p>
-      <w:pPr>
-        <w:pStyle w:val="ListParagraph"/>
-        <w:numPr>
-          <w:ilvl w:val="0"/>
-          <w:numId w:val="22"/>
-        </w:numPr>
-      </w:pPr>
-      <w:r>
-        <w:t>Fixed bug in applying weighted medians when switching from automatic to manual data type</w:t>
-      </w:r>
-    </w:p>
-    <w:p>
-      <w:pPr>
-        <w:pStyle w:val="ListParagraph"/>
-        <w:numPr>
-          <w:ilvl w:val="0"/>
-          <w:numId w:val="22"/>
-        </w:numPr>
-      </w:pPr>
-      <w:r>
-        <w:t>Modified extrap subsection so that subsectioning always works from left to right</w:t>
-      </w:r>
-    </w:p>
-    <w:p>
-      <w:pPr>
-        <w:pStyle w:val="ListParagraph"/>
-        <w:numPr>
-          <w:ilvl w:val="0"/>
-          <w:numId w:val="22"/>
-        </w:numPr>
-      </w:pPr>
-      <w:r>
-        <w:t>Removed depth from Oursin measured discharge uncertainty</w:t>
-      </w:r>
-    </w:p>
-    <w:p>
-      <w:pPr>
-        <w:pStyle w:val="ListParagraph"/>
-        <w:numPr>
-          <w:ilvl w:val="0"/>
-          <w:numId w:val="22"/>
-        </w:numPr>
-      </w:pPr>
-      <w:r>
-        <w:t>Added start date and delta Q to summary table</w:t>
-      </w:r>
-    </w:p>
-    <w:p>
-      <w:pPr>
-        <w:pStyle w:val="ListParagraph"/>
-        <w:numPr>
-          <w:ilvl w:val="0"/>
-          <w:numId w:val="22"/>
-        </w:numPr>
-      </w:pPr>
-      <w:r>
-        <w:t>Modified documentation reflect change to QRevInt</w:t>
-      </w:r>
-    </w:p>
-    <w:p>
-      <w:r>
-        <w:rPr>
-          <w:b/>
-          <w:bCs/>
-        </w:rPr>
-        <w:t>Changes 4.23 to 4.24</w:t>
-      </w:r>
-    </w:p>
-    <w:p>
-      <w:pPr>
-        <w:pStyle w:val="ListParagraph"/>
-        <w:numPr>
-          <w:ilvl w:val="0"/>
-          <w:numId w:val="20"/>
-        </w:numPr>
-      </w:pPr>
-      <w:r>
-        <w:t>Added user option to prompt for rating on save</w:t>
-      </w:r>
-    </w:p>
-    <w:p>
-      <w:pPr>
-        <w:pStyle w:val="ListParagraph"/>
-        <w:numPr>
-          <w:ilvl w:val="0"/>
-          <w:numId w:val="20"/>
-        </w:numPr>
-      </w:pPr>
-      <w:r>
-        <w:t>Added user option to compute extrapolation fit using discharge weighted medians</w:t>
-      </w:r>
-    </w:p>
-    <w:p>
-      <w:pPr>
-        <w:pStyle w:val="ListParagraph"/>
-        <w:numPr>
-          <w:ilvl w:val="0"/>
-          <w:numId w:val="20"/>
-        </w:numPr>
-      </w:pPr>
-      <w:r>
-        <w:t>Total measurement discharge will ignore any transect with a discharge that could not be computed</w:t>
-      </w:r>
-    </w:p>
-    <w:p>
-      <w:pPr>
-        <w:pStyle w:val="ListParagraph"/>
-        <w:numPr>
-          <w:ilvl w:val="0"/>
-          <w:numId w:val="20"/>
-        </w:numPr>
-      </w:pPr>
-      <w:r>
-        <w:t>Fixed bug reading some old QRev.mat files associated with new rating feature</w:t>
-      </w:r>
-    </w:p>
-    <w:p>
-      <w:pPr>
-        <w:rPr>
-          <w:b/>
-          <w:bCs/>
-        </w:rPr>
-      </w:pPr>
-      <w:r>
-        <w:rPr>
-          <w:b/>
-          <w:bCs/>
-        </w:rPr>
-        <w:t>Changes 4.21 to 4.23</w:t>
-      </w:r>
-    </w:p>
-    <w:p>
-      <w:pPr>
-        <w:pStyle w:val="ListParagraph"/>
-        <w:numPr>
-          <w:ilvl w:val="0"/>
-          <w:numId w:val="20"/>
-        </w:numPr>
-      </w:pPr>
-      <w:r>
-        <w:t>New TRDI raw data reader that is 3+ times faster</w:t>
-      </w:r>
-    </w:p>
-    <w:p>
-      <w:pPr>
-        <w:pStyle w:val="ListParagraph"/>
-        <w:numPr>
-          <w:ilvl w:val="0"/>
-          <w:numId w:val="20"/>
-        </w:numPr>
-      </w:pPr>
-      <w:r>
-        <w:t xml:space="preserve">Fixed issue with depth reference drop down </w:t>
-      </w:r>
-      <w:r>
-        <w:t xml:space="preserve">menu </w:t>
-      </w:r>
-      <w:r>
-        <w:t>when depth sounder data were collected</w:t>
-      </w:r>
-    </w:p>
-    <w:p>
-      <w:pPr>
-        <w:pStyle w:val="ListParagraph"/>
-        <w:numPr>
-          <w:ilvl w:val="0"/>
-          <w:numId w:val="20"/>
-        </w:numPr>
-      </w:pPr>
-      <w:r>
-        <w:t>Fixed issue so that GPS references that aren’t available cannot be selected</w:t>
-      </w:r>
-    </w:p>
-    <w:p>
-      <w:pPr>
-        <w:pStyle w:val="ListParagraph"/>
-        <w:numPr>
-          <w:ilvl w:val="0"/>
-          <w:numId w:val="20"/>
-        </w:numPr>
-      </w:pPr>
-      <w:r>
-        <w:t>Fixed several issues with new GPS-BT tab and GPS usage for moving-bed test</w:t>
-      </w:r>
-    </w:p>
-    <w:p>
-      <w:pPr>
-        <w:pStyle w:val="ListParagraph"/>
-        <w:numPr>
-          <w:ilvl w:val="0"/>
-          <w:numId w:val="20"/>
-        </w:numPr>
-      </w:pPr>
-      <w:r>
-        <w:t>Fixed bugs in heading interpolation</w:t>
-      </w:r>
-    </w:p>
-    <w:p>
-      <w:pPr>
-        <w:pStyle w:val="ListParagraph"/>
-        <w:numPr>
-          <w:ilvl w:val="0"/>
-          <w:numId w:val="20"/>
-        </w:numPr>
-      </w:pPr>
-      <w:r>
-        <w:t>Fixed bug reading *_QRev.mat having only 1 transect</w:t>
-      </w:r>
-    </w:p>
-    <w:p>
-      <w:pPr>
-        <w:pStyle w:val="ListParagraph"/>
-        <w:numPr>
-          <w:ilvl w:val="0"/>
-          <w:numId w:val="20"/>
-        </w:numPr>
-      </w:pPr>
-      <w:r>
-        <w:t>Fixed bug when loading measurement with no transects selected</w:t>
-      </w:r>
-    </w:p>
-    <w:p>
-      <w:pPr>
-        <w:pStyle w:val="ListParagraph"/>
-        <w:numPr>
-          <w:ilvl w:val="0"/>
-          <w:numId w:val="20"/>
-        </w:numPr>
-      </w:pPr>
-      <w:r>
-        <w:t xml:space="preserve">Fixed issue </w:t>
-      </w:r>
-      <w:r>
-        <w:t>that could occur when processing moving-bed tests loaded from *_QRev.mat</w:t>
-      </w:r>
-    </w:p>
-    <w:p>
-      <w:pPr>
-        <w:rPr>
-          <w:b/>
-          <w:bCs/>
-        </w:rPr>
-      </w:pPr>
-      <w:r>
-        <w:rPr>
-          <w:b/>
-          <w:bCs/>
-        </w:rPr>
-        <w:t>Changes 4.16 to 4.</w:t>
-      </w:r>
-      <w:r>
-        <w:rPr>
-          <w:b/>
-          <w:bCs/>
-        </w:rPr>
-        <w:t>2</w:t>
-      </w:r>
-      <w:r>
-        <w:rPr>
-          <w:b/>
-          <w:bCs/>
-        </w:rPr>
-        <w:t>1</w:t>
-      </w:r>
-    </w:p>
-    <w:p>
-      <w:pPr>
-        <w:pStyle w:val="ListParagraph"/>
-        <w:numPr>
-          <w:ilvl w:val="0"/>
-          <w:numId w:val="19"/>
-        </w:numPr>
-      </w:pPr>
-      <w:r>
-        <w:t>Added code to identify and notify of user changes to original values</w:t>
-      </w:r>
-    </w:p>
-    <w:p>
-      <w:pPr>
-        <w:pStyle w:val="ListParagraph"/>
-        <w:numPr>
-          <w:ilvl w:val="0"/>
-          <w:numId w:val="19"/>
+        <w:t>Fixed issue with current settings when measurement has mixture of GPS and no GPS</w:t>
+      </w:r>
+    </w:p>
+    <w:p>
+      <w:pPr>
+        <w:rPr>
+          <w:b/>
+          <w:bCs/>
+        </w:rPr>
+      </w:pPr>
+      <w:r>
+        <w:rPr>
+          <w:b/>
+          <w:bCs/>
+        </w:rPr>
+        <w:t>Changes 3.43 to 4.1</w:t>
+      </w:r>
+      <w:r>
+        <w:rPr>
+          <w:b/>
+          <w:bCs/>
+        </w:rPr>
+        <w:t>3</w:t>
+      </w:r>
+    </w:p>
+    <w:p>
+      <w:pPr>
+        <w:pStyle w:val="ListParagraph"/>
+        <w:numPr>
+          <w:ilvl w:val="0"/>
+          <w:numId w:val="15"/>
+        </w:numPr>
+      </w:pPr>
+      <w:r>
+        <w:t>Ported code from Matlab to Python</w:t>
+      </w:r>
+    </w:p>
+    <w:p>
+      <w:pPr>
+        <w:pStyle w:val="ListParagraph"/>
+        <w:numPr>
+          <w:ilvl w:val="0"/>
+          <w:numId w:val="15"/>
+        </w:numPr>
+      </w:pPr>
+      <w:r>
+        <w:t>User interface redesigned using PyQt</w:t>
+      </w:r>
+    </w:p>
+    <w:p>
+      <w:pPr>
+        <w:pStyle w:val="ListParagraph"/>
+        <w:numPr>
+          <w:ilvl w:val="0"/>
+          <w:numId w:val="15"/>
+        </w:numPr>
+      </w:pPr>
+      <w:r>
+        <w:t>Main summary page includes contour, shiptrack, and discharge time series graphics</w:t>
+      </w:r>
+    </w:p>
+    <w:p>
+      <w:pPr>
+        <w:pStyle w:val="ListParagraph"/>
+        <w:numPr>
+          <w:ilvl w:val="0"/>
+          <w:numId w:val="15"/>
+        </w:numPr>
+      </w:pPr>
+      <w:r>
+        <w:t>Ability to change navigation reference through the toolbar</w:t>
+      </w:r>
+    </w:p>
+    <w:p>
+      <w:pPr>
+        <w:pStyle w:val="ListParagraph"/>
+        <w:numPr>
+          <w:ilvl w:val="0"/>
+          <w:numId w:val="15"/>
+        </w:numPr>
+      </w:pPr>
+      <w:r>
+        <w:t>Ability to turn on or off composite tracks through the toolbar</w:t>
+      </w:r>
+    </w:p>
+    <w:p>
+      <w:pPr>
+        <w:pStyle w:val="ListParagraph"/>
+        <w:numPr>
+          <w:ilvl w:val="0"/>
+          <w:numId w:val="15"/>
+        </w:numPr>
+      </w:pPr>
+      <w:r>
+        <w:t>Changes to default settings are highlighted</w:t>
+      </w:r>
+    </w:p>
+    <w:p>
+      <w:pPr>
+        <w:pStyle w:val="ListParagraph"/>
+        <w:numPr>
+          <w:ilvl w:val="0"/>
+          <w:numId w:val="15"/>
+        </w:numPr>
+      </w:pPr>
+      <w:r>
+        <w:t>Opening and measurement loading speed has been improved</w:t>
+      </w:r>
+    </w:p>
+    <w:p>
+      <w:pPr>
+        <w:pStyle w:val="ListParagraph"/>
+        <w:numPr>
+          <w:ilvl w:val="0"/>
+          <w:numId w:val="15"/>
+        </w:numPr>
+      </w:pPr>
+      <w:r>
+        <w:t xml:space="preserve">Change water velocity interpolation from linear to ABBA </w:t>
+      </w:r>
+    </w:p>
+    <w:p>
+      <w:pPr>
+        <w:pStyle w:val="ListParagraph"/>
+        <w:numPr>
+          <w:ilvl w:val="0"/>
+          <w:numId w:val="15"/>
+        </w:numPr>
+      </w:pPr>
+      <w:r>
+        <w:t>Water velocities for all invalid bins are interpolated rather than added to top or bottom extrapolation</w:t>
+      </w:r>
+    </w:p>
+    <w:p>
+      <w:pPr>
+        <w:pStyle w:val="ListParagraph"/>
+        <w:numPr>
+          <w:ilvl w:val="0"/>
+          <w:numId w:val="15"/>
+        </w:numPr>
+      </w:pPr>
+      <w:r>
+        <w:t>F</w:t>
+      </w:r>
+      <w:r>
+        <w:t>ixed bug in vtg primary composite tracks, wasn't substituting GGA</w:t>
+      </w:r>
+    </w:p>
+    <w:p>
+      <w:pPr>
+        <w:pStyle w:val="ListParagraph"/>
+        <w:numPr>
+          <w:ilvl w:val="0"/>
+          <w:numId w:val="15"/>
+        </w:numPr>
+      </w:pPr>
+      <w:r>
+        <w:t>Added uncertainty to the automatic comment when a file is saved</w:t>
+      </w:r>
+    </w:p>
+    <w:p>
+      <w:pPr>
+        <w:pStyle w:val="ListParagraph"/>
+        <w:numPr>
+          <w:ilvl w:val="0"/>
+          <w:numId w:val="15"/>
+        </w:numPr>
+      </w:pPr>
+      <w:r>
+        <w:t>Statistics and interpolation methods in Python may result in small differences from Matlab</w:t>
+      </w:r>
+    </w:p>
+    <w:p>
+      <w:pPr>
+        <w:rPr>
+          <w:b/>
+          <w:bCs/>
+        </w:rPr>
+      </w:pPr>
+      <w:r>
+        <w:rPr>
+          <w:b/>
+          <w:bCs/>
+        </w:rPr>
+        <w:t>Changes 3.42 to 3.43</w:t>
+      </w:r>
+    </w:p>
+    <w:p>
+      <w:pPr>
+        <w:pStyle w:val="ListParagraph"/>
+        <w:numPr>
+          <w:ilvl w:val="0"/>
+          <w:numId w:val="3"/>
+        </w:numPr>
+      </w:pPr>
+      <w:r>
+        <w:t>Fixed bug that did not properly identify missing (lost) ensembles if the typical ensemble duration was greater than 1.5 sec. This affected mode 13 StreamPro data.</w:t>
+      </w:r>
+    </w:p>
+    <w:p>
+      <w:pPr>
+        <w:rPr>
+          <w:b/>
+          <w:bCs/>
+        </w:rPr>
+      </w:pPr>
+      <w:r>
+        <w:rPr>
+          <w:b/>
+          <w:bCs/>
+        </w:rPr>
+        <w:t>Changes 3.41 to 3.42</w:t>
+      </w:r>
+    </w:p>
+    <w:p>
+      <w:pPr>
+        <w:pStyle w:val="ListParagraph"/>
+        <w:numPr>
+          <w:ilvl w:val="0"/>
+          <w:numId w:val="2"/>
+        </w:numPr>
+      </w:pPr>
+      <w:r>
+        <w:t>Fixed bug in bottom discharge extrapolation. Previous versions failed to estimate the bottom discharge for ensembles that had no valid data but where depth cell velocities were interpolated.</w:t>
+      </w:r>
+    </w:p>
+    <w:p>
+      <w:pPr>
+        <w:rPr>
+          <w:b/>
+          <w:bCs/>
+        </w:rPr>
+      </w:pPr>
+      <w:r>
+        <w:rPr>
+          <w:b/>
+          <w:bCs/>
+        </w:rPr>
+        <w:t>Changes 3.40 to 3.41</w:t>
+      </w:r>
+    </w:p>
+    <w:p>
+      <w:pPr>
+        <w:pStyle w:val="ListParagraph"/>
+        <w:numPr>
+          <w:ilvl w:val="0"/>
+          <w:numId w:val="1"/>
+        </w:numPr>
+      </w:pPr>
+      <w:r>
+        <w:t>Fixed bug with discharge percent change not updating after multiple speed of sound changes.</w:t>
+      </w:r>
+    </w:p>
+    <w:p>
+      <w:pPr>
+        <w:pStyle w:val="ListParagraph"/>
+        <w:numPr>
+          <w:ilvl w:val="0"/>
+          <w:numId w:val="1"/>
+        </w:numPr>
+      </w:pPr>
+      <w:r>
+        <w:t>Fixed bug in edges table where wrong row was highlighted if some transects were unchecked.</w:t>
+      </w:r>
+    </w:p>
+    <w:p>
+      <w:pPr>
+        <w:pStyle w:val="ListParagraph"/>
+        <w:numPr>
+          <w:ilvl w:val="0"/>
+          <w:numId w:val="1"/>
+        </w:numPr>
+      </w:pPr>
+      <w:r>
+        <w:t>Fixed bug in edges shiptrack so it only displays valid orginal data and not interpolated data.</w:t>
+      </w:r>
+    </w:p>
+    <w:p>
+      <w:pPr>
+        <w:pStyle w:val="ListParagraph"/>
+        <w:numPr>
+          <w:ilvl w:val="0"/>
+          <w:numId w:val="1"/>
+        </w:numPr>
+      </w:pPr>
+      <w:r>
+        <w:t>Fixed bug no allowing manual entry of 0 salinity.</w:t>
+      </w:r>
+    </w:p>
+    <w:p>
+      <w:pPr>
+        <w:rPr>
+          <w:b/>
+          <w:bCs/>
+        </w:rPr>
+      </w:pPr>
+      <w:r>
+        <w:rPr>
+          <w:b/>
+          <w:bCs/>
+        </w:rPr>
+        <w:t>Changes from 3.35 to 3.40</w:t>
+      </w:r>
+    </w:p>
+    <w:p>
+      <w:pPr>
+        <w:pStyle w:val="ListParagraph"/>
+        <w:numPr>
+          <w:ilvl w:val="0"/>
+          <w:numId w:val="4"/>
+        </w:numPr>
+      </w:pPr>
+      <w:r>
+        <w:t>Fixed bug causing crash when TRDI PT3 test was incomplete.</w:t>
+      </w:r>
+    </w:p>
+    <w:p>
+      <w:pPr>
+        <w:pStyle w:val="ListParagraph"/>
+        <w:numPr>
+          <w:ilvl w:val="0"/>
+          <w:numId w:val="4"/>
+        </w:numPr>
+      </w:pPr>
+      <w:r>
+        <w:t>Modified uncertainty estimate for invalid and edges to use absolute values.</w:t>
+      </w:r>
+    </w:p>
+    <w:p>
+      <w:pPr>
+        <w:pStyle w:val="ListParagraph"/>
+        <w:numPr>
+          <w:ilvl w:val="0"/>
+          <w:numId w:val="4"/>
+        </w:numPr>
+      </w:pPr>
+      <w:r>
+        <w:t>Fixed issue with multi-line comments in XML file.</w:t>
+      </w:r>
+    </w:p>
+    <w:p>
+      <w:pPr>
+        <w:pStyle w:val="ListParagraph"/>
+        <w:numPr>
+          <w:ilvl w:val="0"/>
+          <w:numId w:val="4"/>
+        </w:numPr>
+      </w:pPr>
+      <w:r>
+        <w:t>Fixed draft check to only evaluate checked transects.</w:t>
+      </w:r>
+    </w:p>
+    <w:p>
+      <w:pPr>
+        <w:pStyle w:val="ListParagraph"/>
+        <w:numPr>
+          <w:ilvl w:val="0"/>
+          <w:numId w:val="4"/>
+        </w:numPr>
+      </w:pPr>
+      <w:r>
+        <w:t>XML file now only contains the summary information from a SonTek compass calibration.</w:t>
+      </w:r>
+    </w:p>
+    <w:p>
+      <w:pPr>
+        <w:pStyle w:val="ListParagraph"/>
+        <w:numPr>
+          <w:ilvl w:val="0"/>
+          <w:numId w:val="4"/>
+        </w:numPr>
+      </w:pPr>
+      <w:r>
+        <w:t>Fixed bug in moving-bed test if loop compass error and direction could not be computed.</w:t>
+      </w:r>
+    </w:p>
+    <w:p>
+      <w:pPr>
+        <w:pStyle w:val="ListParagraph"/>
+        <w:numPr>
+          <w:ilvl w:val="0"/>
+          <w:numId w:val="4"/>
+        </w:numPr>
+      </w:pPr>
+      <w:r>
+        <w:t>Added message for missing samples in SonTek data.</w:t>
+      </w:r>
+    </w:p>
+    <w:p>
+      <w:pPr>
+        <w:pStyle w:val="ListParagraph"/>
+        <w:numPr>
+          <w:ilvl w:val="0"/>
+          <w:numId w:val="4"/>
+        </w:numPr>
+      </w:pPr>
+      <w:r>
+        <w:t>Modified PT3 tests to reduce false positives.</w:t>
+      </w:r>
+    </w:p>
+    <w:p>
+      <w:pPr>
+        <w:pStyle w:val="ListParagraph"/>
+        <w:numPr>
+          <w:ilvl w:val="0"/>
+          <w:numId w:val="4"/>
+        </w:numPr>
+      </w:pPr>
+      <w:r>
+        <w:t>Added check to boat and wt to check warn if all data are invalid.</w:t>
+      </w:r>
+    </w:p>
+    <w:p>
+      <w:pPr>
+        <w:pStyle w:val="ListParagraph"/>
+        <w:numPr>
+          <w:ilvl w:val="0"/>
+          <w:numId w:val="4"/>
+        </w:numPr>
+      </w:pPr>
+      <w:r>
+        <w:t>Edge sign check changed to only show message if edge discharge is greater than 0.5%</w:t>
+      </w:r>
+    </w:p>
+    <w:p>
+      <w:pPr>
+        <w:pStyle w:val="ListParagraph"/>
+        <w:numPr>
+          <w:ilvl w:val="0"/>
+          <w:numId w:val="4"/>
+        </w:numPr>
+      </w:pPr>
+      <w:r>
+        <w:t>Added option to store a style sheet with the xml output file.</w:t>
+      </w:r>
+    </w:p>
+    <w:p>
+      <w:pPr>
+        <w:pStyle w:val="ListParagraph"/>
+        <w:numPr>
+          <w:ilvl w:val="0"/>
+          <w:numId w:val="4"/>
         </w:numPr>
       </w:pPr>
       <w:r>
         <w:lastRenderedPageBreak/>
-        <w:t>Added ability to use GPS as a reference for moving-bed tests</w:t>
-      </w:r>
-    </w:p>
-    <w:p>
-      <w:pPr>
-        <w:pStyle w:val="ListParagraph"/>
-        <w:numPr>
-          <w:ilvl w:val="0"/>
-          <w:numId w:val="19"/>
-        </w:numPr>
-      </w:pPr>
-      <w:r>
-        <w:t>Applying magvar or heading offset or heading source changes to all transects applies them to moving-bed test also</w:t>
-      </w:r>
-    </w:p>
-    <w:p>
-      <w:pPr>
-        <w:pStyle w:val="ListParagraph"/>
-        <w:numPr>
-          <w:ilvl w:val="0"/>
-          <w:numId w:val="19"/>
-        </w:numPr>
-      </w:pPr>
-      <w:r>
-        <w:t>Moving-bed test flow speed now corrected for moving-bed velocity</w:t>
-      </w:r>
-    </w:p>
-    <w:p>
-      <w:pPr>
-        <w:pStyle w:val="ListParagraph"/>
-        <w:numPr>
-          <w:ilvl w:val="0"/>
-          <w:numId w:val="19"/>
-        </w:numPr>
-      </w:pPr>
-      <w:r>
-        <w:t>Added automatic checking of GPS lag</w:t>
-      </w:r>
-    </w:p>
-    <w:p>
-      <w:pPr>
-        <w:pStyle w:val="ListParagraph"/>
-        <w:numPr>
-          <w:ilvl w:val="0"/>
-          <w:numId w:val="19"/>
-        </w:numPr>
-      </w:pPr>
-      <w:r>
-        <w:t>Added GPS – BT comparison tab to GPS Tab</w:t>
-      </w:r>
-    </w:p>
-    <w:p>
-      <w:pPr>
-        <w:pStyle w:val="ListParagraph"/>
-        <w:numPr>
-          <w:ilvl w:val="0"/>
-          <w:numId w:val="19"/>
-        </w:numPr>
-      </w:pPr>
-      <w:r>
-        <w:t>Fixed issue with applying the correct moving-bed test when multiple tests are available</w:t>
-      </w:r>
-    </w:p>
-    <w:p>
-      <w:pPr>
-        <w:pStyle w:val="ListParagraph"/>
-        <w:numPr>
-          <w:ilvl w:val="0"/>
-          <w:numId w:val="19"/>
-        </w:numPr>
-      </w:pPr>
-      <w:r>
-        <w:t>Modifications to allow QRev to work with Rowe and Nortek ADCPs.</w:t>
-      </w:r>
-    </w:p>
-    <w:p>
-      <w:pPr>
-        <w:pStyle w:val="ListParagraph"/>
-        <w:numPr>
-          <w:ilvl w:val="0"/>
-          <w:numId w:val="19"/>
-        </w:numPr>
-      </w:pPr>
-      <w:r>
-        <w:t>Added support for user edge discharge for WinRiver II 2.22</w:t>
-      </w:r>
-    </w:p>
-    <w:p>
-      <w:pPr>
-        <w:pStyle w:val="ListParagraph"/>
-        <w:numPr>
-          <w:ilvl w:val="0"/>
-          <w:numId w:val="19"/>
-        </w:numPr>
-      </w:pPr>
-      <w:r>
-        <w:t>“.mat” is always appended as suffix to saved QRev file</w:t>
-      </w:r>
-    </w:p>
-    <w:p>
-      <w:pPr>
-        <w:pStyle w:val="ListParagraph"/>
-        <w:numPr>
-          <w:ilvl w:val="0"/>
-          <w:numId w:val="19"/>
-        </w:numPr>
-      </w:pPr>
-      <w:r>
-        <w:t>Manual threshold for wt and bt saved and displayed when opening *_QRev.mat</w:t>
-      </w:r>
-    </w:p>
-    <w:p>
-      <w:pPr>
-        <w:pStyle w:val="ListParagraph"/>
-        <w:numPr>
-          <w:ilvl w:val="0"/>
-          <w:numId w:val="19"/>
-        </w:numPr>
-      </w:pPr>
-      <w:r>
-        <w:t>Modified code to use 1</w:t>
-      </w:r>
-      <w:r>
-        <w:rPr>
-          <w:vertAlign w:val="superscript"/>
-        </w:rPr>
-        <w:t>st</w:t>
-      </w:r>
-      <w:r>
-        <w:t xml:space="preserve"> checked transect rather than 1</w:t>
-      </w:r>
-      <w:r>
-        <w:rPr>
-          <w:vertAlign w:val="superscript"/>
-        </w:rPr>
-        <w:t>st</w:t>
-      </w:r>
-      <w:r>
-        <w:t xml:space="preserve"> transect for general settings</w:t>
-      </w:r>
-    </w:p>
-    <w:p>
-      <w:pPr>
-        <w:pStyle w:val="ListParagraph"/>
-        <w:numPr>
-          <w:ilvl w:val="0"/>
-          <w:numId w:val="19"/>
-        </w:numPr>
-      </w:pPr>
-      <w:r>
-        <w:t>Modified code to accept measurements with inconsistent availability of GPS data types</w:t>
-      </w:r>
-    </w:p>
-    <w:p>
-      <w:pPr>
-        <w:pStyle w:val="ListParagraph"/>
-        <w:numPr>
-          <w:ilvl w:val="0"/>
-          <w:numId w:val="19"/>
-        </w:numPr>
-      </w:pPr>
-      <w:r>
-        <w:t>Fixed issue loading data with no valid bottom track</w:t>
-      </w:r>
-    </w:p>
-    <w:p>
-      <w:pPr>
-        <w:pStyle w:val="ListParagraph"/>
-        <w:numPr>
-          <w:ilvl w:val="0"/>
-          <w:numId w:val="19"/>
-        </w:numPr>
-      </w:pPr>
-      <w:r>
-        <w:t>Added notification when SonTek data is loaded with other than Earth coordinates</w:t>
-      </w:r>
-    </w:p>
-    <w:p>
-      <w:pPr>
-        <w:pStyle w:val="ListParagraph"/>
-        <w:numPr>
-          <w:ilvl w:val="0"/>
-          <w:numId w:val="19"/>
-        </w:numPr>
-      </w:pPr>
-      <w:r>
-        <w:t>Fixed issue with selecting transects in EDI if some transects were not checked</w:t>
-      </w:r>
-    </w:p>
-    <w:p>
-      <w:pPr>
-        <w:pStyle w:val="ListParagraph"/>
-        <w:numPr>
-          <w:ilvl w:val="0"/>
-          <w:numId w:val="19"/>
-        </w:numPr>
-      </w:pPr>
-      <w:r>
-        <w:t>Fixed issue in EDI if no GPS data are available</w:t>
-      </w:r>
-    </w:p>
-    <w:p>
-      <w:pPr>
-        <w:pStyle w:val="ListParagraph"/>
-        <w:numPr>
-          <w:ilvl w:val="0"/>
-          <w:numId w:val="19"/>
-        </w:numPr>
-      </w:pPr>
-      <w:r>
-        <w:t>Fixed QA check for missing samples</w:t>
-      </w:r>
-    </w:p>
-    <w:p>
-      <w:pPr>
-        <w:pStyle w:val="ListParagraph"/>
-        <w:numPr>
-          <w:ilvl w:val="0"/>
-          <w:numId w:val="19"/>
-        </w:numPr>
-      </w:pPr>
-      <w:r>
-        <w:t>Fixed issue with invalid stationary moving-bed tests used for correction</w:t>
-      </w:r>
-    </w:p>
-    <w:p>
-      <w:pPr>
-        <w:rPr>
-          <w:b/>
-          <w:bCs/>
-        </w:rPr>
-      </w:pPr>
-    </w:p>
-    <w:p>
-      <w:r>
-        <w:rPr>
-          <w:b/>
-          <w:bCs/>
-        </w:rPr>
-        <w:t>Changes 4</w:t>
-      </w:r>
-      <w:r>
-        <w:rPr>
-          <w:b/>
-          <w:bCs/>
-        </w:rPr>
-        <w:t>.</w:t>
-      </w:r>
-      <w:r>
-        <w:rPr>
-          <w:b/>
-          <w:bCs/>
-        </w:rPr>
-        <w:t>15 to 4</w:t>
-      </w:r>
-      <w:r>
-        <w:rPr>
-          <w:b/>
-          <w:bCs/>
-        </w:rPr>
-        <w:t>.</w:t>
-      </w:r>
-      <w:r>
-        <w:rPr>
-          <w:b/>
-          <w:bCs/>
-        </w:rPr>
-        <w:t>16</w:t>
-      </w:r>
-    </w:p>
-    <w:p>
-      <w:pPr>
-        <w:pStyle w:val="ListParagraph"/>
-        <w:numPr>
-          <w:ilvl w:val="0"/>
-          <w:numId w:val="18"/>
-        </w:numPr>
-      </w:pPr>
-      <w:r>
-        <w:t>Fixed incomplete system test for TRDI causing crash when saving</w:t>
-      </w:r>
-    </w:p>
-    <w:p>
-      <w:pPr>
-        <w:pStyle w:val="ListParagraph"/>
-        <w:numPr>
-          <w:ilvl w:val="0"/>
-          <w:numId w:val="18"/>
-        </w:numPr>
-      </w:pPr>
-      <w:r>
-        <w:t>Fixed issue with PT3 test status not displayed properly</w:t>
-      </w:r>
-    </w:p>
-    <w:p>
-      <w:pPr>
-        <w:pStyle w:val="ListParagraph"/>
-        <w:numPr>
-          <w:ilvl w:val="0"/>
-          <w:numId w:val="18"/>
-        </w:numPr>
-      </w:pPr>
-      <w:r>
-        <w:t>Fixed issue with VTG low speed message</w:t>
-      </w:r>
-    </w:p>
-    <w:p>
-      <w:pPr>
-        <w:pStyle w:val="ListParagraph"/>
-        <w:numPr>
-          <w:ilvl w:val="0"/>
-          <w:numId w:val="18"/>
-        </w:numPr>
-      </w:pPr>
-      <w:r>
-        <w:t>Fixed issue with VTG and composite tracks on causing switch to GGA</w:t>
-      </w:r>
-    </w:p>
-    <w:p>
-      <w:pPr>
-        <w:pStyle w:val="ListParagraph"/>
-        <w:numPr>
-          <w:ilvl w:val="0"/>
-          <w:numId w:val="18"/>
-        </w:numPr>
-      </w:pPr>
-      <w:r>
-        <w:t>Fixed issues with the edges tab</w:t>
-      </w:r>
-      <w:r>
-        <w:t>: no valid GPS, 0 or 1 ensembles selected, etc.</w:t>
-      </w:r>
-    </w:p>
-    <w:p>
-      <w:pPr>
-        <w:pStyle w:val="ListParagraph"/>
-        <w:numPr>
-          <w:ilvl w:val="0"/>
-          <w:numId w:val="18"/>
-        </w:numPr>
-      </w:pPr>
-      <w:r>
-        <w:t>Fixed issues with tab text color not updating properly</w:t>
-      </w:r>
-    </w:p>
-    <w:p>
-      <w:pPr>
-        <w:pStyle w:val="ListParagraph"/>
-        <w:numPr>
-          <w:ilvl w:val="0"/>
-          <w:numId w:val="18"/>
-        </w:numPr>
-      </w:pPr>
-      <w:r>
-        <w:t>Updated user’s manual to indicate that 4-beam composite is the default if vertical beam or depth sounder data are available.</w:t>
-      </w:r>
-    </w:p>
-    <w:p>
-      <w:pPr>
-        <w:pStyle w:val="ListParagraph"/>
-        <w:numPr>
-          <w:ilvl w:val="0"/>
-          <w:numId w:val="18"/>
-        </w:numPr>
-      </w:pPr>
-      <w:r>
-        <w:t>Several issues with the interaction with RIVRS were fixed</w:t>
-      </w:r>
-    </w:p>
-    <w:p>
-      <w:pPr>
-        <w:pStyle w:val="ListParagraph"/>
-        <w:numPr>
-          <w:ilvl w:val="0"/>
-          <w:numId w:val="18"/>
-        </w:numPr>
-      </w:pPr>
-      <w:r>
-        <w:t>Fixed inconsistent behavior of the up/down arrows</w:t>
-      </w:r>
-    </w:p>
-    <w:p>
-      <w:pPr>
-        <w:pStyle w:val="ListParagraph"/>
-        <w:numPr>
-          <w:ilvl w:val="0"/>
-          <w:numId w:val="18"/>
-        </w:numPr>
-      </w:pPr>
-      <w:r>
-        <w:t>Improved speed of transect change using up/down arrows</w:t>
-      </w:r>
-    </w:p>
-    <w:p>
-      <w:pPr>
-        <w:pStyle w:val="ListParagraph"/>
-        <w:numPr>
-          <w:ilvl w:val="0"/>
-          <w:numId w:val="18"/>
-        </w:numPr>
-      </w:pPr>
-      <w:r>
-        <w:t>Fixed issue with files saving in previously used folder</w:t>
-      </w:r>
-    </w:p>
-    <w:p>
-      <w:pPr>
-        <w:pStyle w:val="ListParagraph"/>
-        <w:numPr>
-          <w:ilvl w:val="0"/>
-          <w:numId w:val="18"/>
-        </w:numPr>
-      </w:pPr>
-      <w:r>
-        <w:t>Modified code for compatibility with Nortek Signature 1000</w:t>
-      </w:r>
-    </w:p>
-    <w:p>
-      <w:pPr>
-        <w:rPr>
-          <w:b/>
-          <w:bCs/>
-        </w:rPr>
-      </w:pPr>
-      <w:r>
-        <w:rPr>
-          <w:b/>
-          <w:bCs/>
-        </w:rPr>
-        <w:t>Changes 4.14 to 4.15</w:t>
-      </w:r>
-    </w:p>
-    <w:p>
-      <w:pPr>
-        <w:pStyle w:val="ListParagraph"/>
-        <w:numPr>
-          <w:ilvl w:val="0"/>
-          <w:numId w:val="17"/>
-        </w:numPr>
-      </w:pPr>
-      <w:r>
-        <w:t>Fixed issue with shiptrack when all GPS data are invalid</w:t>
-      </w:r>
-    </w:p>
-    <w:p>
-      <w:pPr>
-        <w:pStyle w:val="ListParagraph"/>
-        <w:numPr>
-          <w:ilvl w:val="0"/>
-          <w:numId w:val="17"/>
-        </w:numPr>
-      </w:pPr>
-      <w:r>
-        <w:t>Fixed bug when applying stationary moving-bed correction</w:t>
-      </w:r>
-    </w:p>
-    <w:p>
-      <w:pPr>
-        <w:rPr>
-          <w:b/>
-          <w:bCs/>
-        </w:rPr>
-      </w:pPr>
-      <w:r>
-        <w:rPr>
-          <w:b/>
-          <w:bCs/>
-        </w:rPr>
-        <w:t>Changes 4.13 to 4.14</w:t>
-      </w:r>
-    </w:p>
-    <w:p>
-      <w:pPr>
-        <w:pStyle w:val="ListParagraph"/>
-        <w:numPr>
-          <w:ilvl w:val="0"/>
-          <w:numId w:val="16"/>
-        </w:numPr>
-      </w:pPr>
-      <w:r>
-        <w:t>Fixed issue with applying a loop test when preceded by a stationary test.</w:t>
-      </w:r>
-    </w:p>
-    <w:p>
-      <w:pPr>
-        <w:pStyle w:val="ListParagraph"/>
-        <w:numPr>
-          <w:ilvl w:val="0"/>
-          <w:numId w:val="16"/>
-        </w:numPr>
-      </w:pPr>
-      <w:r>
-        <w:t>Fixed issue with current settings when measurement has mixture of GPS and no GPS</w:t>
-      </w:r>
-    </w:p>
-    <w:p>
-      <w:pPr>
-        <w:rPr>
-          <w:b/>
-          <w:bCs/>
-        </w:rPr>
-      </w:pPr>
-      <w:r>
-        <w:rPr>
-          <w:b/>
-          <w:bCs/>
-        </w:rPr>
-        <w:lastRenderedPageBreak/>
-        <w:t>Changes 3.43 to 4.1</w:t>
-      </w:r>
-      <w:r>
-        <w:rPr>
-          <w:b/>
-          <w:bCs/>
-        </w:rPr>
-        <w:t>3</w:t>
-      </w:r>
-    </w:p>
-    <w:p>
-      <w:pPr>
-        <w:pStyle w:val="ListParagraph"/>
-        <w:numPr>
-          <w:ilvl w:val="0"/>
-          <w:numId w:val="15"/>
-        </w:numPr>
-      </w:pPr>
-      <w:r>
-        <w:t>Ported code from Matlab to Python</w:t>
-      </w:r>
-    </w:p>
-    <w:p>
-      <w:pPr>
-        <w:pStyle w:val="ListParagraph"/>
-        <w:numPr>
-          <w:ilvl w:val="0"/>
-          <w:numId w:val="15"/>
-        </w:numPr>
-      </w:pPr>
-      <w:r>
-        <w:t>User interface redesigned using PyQt</w:t>
-      </w:r>
-    </w:p>
-    <w:p>
-      <w:pPr>
-        <w:pStyle w:val="ListParagraph"/>
-        <w:numPr>
-          <w:ilvl w:val="0"/>
-          <w:numId w:val="15"/>
-        </w:numPr>
-      </w:pPr>
-      <w:r>
-        <w:t>Main summary page includes contour, shiptrack, and discharge time series graphics</w:t>
-      </w:r>
-    </w:p>
-    <w:p>
-      <w:pPr>
-        <w:pStyle w:val="ListParagraph"/>
-        <w:numPr>
-          <w:ilvl w:val="0"/>
-          <w:numId w:val="15"/>
-        </w:numPr>
-      </w:pPr>
-      <w:r>
-        <w:t>Ability to change navigation reference through the toolbar</w:t>
-      </w:r>
-    </w:p>
-    <w:p>
-      <w:pPr>
-        <w:pStyle w:val="ListParagraph"/>
-        <w:numPr>
-          <w:ilvl w:val="0"/>
-          <w:numId w:val="15"/>
-        </w:numPr>
-      </w:pPr>
-      <w:r>
-        <w:t>Ability to turn on or off composite tracks through the toolbar</w:t>
-      </w:r>
-    </w:p>
-    <w:p>
-      <w:pPr>
-        <w:pStyle w:val="ListParagraph"/>
-        <w:numPr>
-          <w:ilvl w:val="0"/>
-          <w:numId w:val="15"/>
-        </w:numPr>
-      </w:pPr>
-      <w:r>
-        <w:t>Changes to default settings are highlighted</w:t>
-      </w:r>
-    </w:p>
-    <w:p>
-      <w:pPr>
-        <w:pStyle w:val="ListParagraph"/>
-        <w:numPr>
-          <w:ilvl w:val="0"/>
-          <w:numId w:val="15"/>
-        </w:numPr>
-      </w:pPr>
-      <w:r>
-        <w:t>Opening and measurement loading speed has been improved</w:t>
-      </w:r>
-    </w:p>
-    <w:p>
-      <w:pPr>
-        <w:pStyle w:val="ListParagraph"/>
-        <w:numPr>
-          <w:ilvl w:val="0"/>
-          <w:numId w:val="15"/>
-        </w:numPr>
-      </w:pPr>
-      <w:r>
-        <w:t xml:space="preserve">Change water velocity interpolation from linear to ABBA </w:t>
-      </w:r>
-    </w:p>
-    <w:p>
-      <w:pPr>
-        <w:pStyle w:val="ListParagraph"/>
-        <w:numPr>
-          <w:ilvl w:val="0"/>
-          <w:numId w:val="15"/>
-        </w:numPr>
-      </w:pPr>
-      <w:r>
-        <w:t>Water velocities for all invalid bins are interpolated rather than added to top or bottom extrapolation</w:t>
-      </w:r>
-    </w:p>
-    <w:p>
-      <w:pPr>
-        <w:pStyle w:val="ListParagraph"/>
-        <w:numPr>
-          <w:ilvl w:val="0"/>
-          <w:numId w:val="15"/>
-        </w:numPr>
-      </w:pPr>
-      <w:r>
-        <w:t>F</w:t>
-      </w:r>
-      <w:r>
-        <w:t>ixed bug in vtg primary composite tracks, wasn't substituting GGA</w:t>
-      </w:r>
-    </w:p>
-    <w:p>
-      <w:pPr>
-        <w:pStyle w:val="ListParagraph"/>
-        <w:numPr>
-          <w:ilvl w:val="0"/>
-          <w:numId w:val="15"/>
-        </w:numPr>
-      </w:pPr>
-      <w:r>
-        <w:t>Added uncertainty to the automatic comment when a file is saved</w:t>
-      </w:r>
-    </w:p>
-    <w:p>
-      <w:pPr>
-        <w:pStyle w:val="ListParagraph"/>
-        <w:numPr>
-          <w:ilvl w:val="0"/>
-          <w:numId w:val="15"/>
-        </w:numPr>
-      </w:pPr>
-      <w:r>
-        <w:t>Statistics and interpolation methods in Python may result in small differences from Matlab</w:t>
-      </w:r>
-    </w:p>
-    <w:p>
-      <w:pPr>
-        <w:rPr>
-          <w:b/>
-          <w:bCs/>
-        </w:rPr>
-      </w:pPr>
-      <w:r>
-        <w:rPr>
-          <w:b/>
-          <w:bCs/>
-        </w:rPr>
-        <w:t>Changes 3.42 to 3.43</w:t>
-      </w:r>
-    </w:p>
-    <w:p>
-      <w:pPr>
-        <w:pStyle w:val="ListParagraph"/>
-        <w:numPr>
-          <w:ilvl w:val="0"/>
-          <w:numId w:val="3"/>
-        </w:numPr>
-      </w:pPr>
-      <w:r>
-        <w:t>Fixed bug that did not properly identify missing (lost) ensembles if the typical ensemble duration was greater than 1.5 sec. This affected mode 13 StreamPro data.</w:t>
-      </w:r>
-    </w:p>
-    <w:p>
-      <w:pPr>
-        <w:rPr>
-          <w:b/>
-          <w:bCs/>
-        </w:rPr>
-      </w:pPr>
-      <w:r>
-        <w:rPr>
-          <w:b/>
-          <w:bCs/>
-        </w:rPr>
-        <w:t>Changes 3.41 to 3.42</w:t>
-      </w:r>
-    </w:p>
-    <w:p>
-      <w:pPr>
-        <w:pStyle w:val="ListParagraph"/>
-        <w:numPr>
-          <w:ilvl w:val="0"/>
-          <w:numId w:val="2"/>
-        </w:numPr>
-      </w:pPr>
-      <w:r>
-        <w:t>Fixed bug in bottom discharge extrapolation. Previous versions failed to estimate the bottom discharge for ensembles that had no valid data but where depth cell velocities were interpolated.</w:t>
-      </w:r>
-    </w:p>
-    <w:p>
-      <w:pPr>
-        <w:rPr>
-          <w:b/>
-          <w:bCs/>
-        </w:rPr>
-      </w:pPr>
-      <w:r>
-        <w:rPr>
-          <w:b/>
-          <w:bCs/>
-        </w:rPr>
-        <w:t>Changes 3.40 to 3.41</w:t>
-      </w:r>
-    </w:p>
-    <w:p>
-      <w:pPr>
-        <w:pStyle w:val="ListParagraph"/>
-        <w:numPr>
-          <w:ilvl w:val="0"/>
-          <w:numId w:val="1"/>
-        </w:numPr>
-      </w:pPr>
-      <w:r>
-        <w:t>Fixed bug with discharge percent change not updating after multiple speed of sound changes.</w:t>
-      </w:r>
-    </w:p>
-    <w:p>
-      <w:pPr>
-        <w:pStyle w:val="ListParagraph"/>
-        <w:numPr>
-          <w:ilvl w:val="0"/>
-          <w:numId w:val="1"/>
-        </w:numPr>
-      </w:pPr>
-      <w:r>
-        <w:t>Fixed bug in edges table where wrong row was highlighted if some transects were unchecked.</w:t>
-      </w:r>
-    </w:p>
-    <w:p>
-      <w:pPr>
-        <w:pStyle w:val="ListParagraph"/>
-        <w:numPr>
-          <w:ilvl w:val="0"/>
-          <w:numId w:val="1"/>
-        </w:numPr>
-      </w:pPr>
-      <w:r>
-        <w:t>Fixed bug in edges shiptrack so it only displays valid orginal data and not interpolated data.</w:t>
-      </w:r>
-    </w:p>
-    <w:p>
-      <w:pPr>
-        <w:pStyle w:val="ListParagraph"/>
-        <w:numPr>
-          <w:ilvl w:val="0"/>
-          <w:numId w:val="1"/>
-        </w:numPr>
-      </w:pPr>
-      <w:r>
-        <w:t>Fixed bug no allowing manual entry of 0 salinity.</w:t>
-      </w:r>
-    </w:p>
-    <w:p>
-      <w:pPr>
-        <w:rPr>
-          <w:b/>
-          <w:bCs/>
-        </w:rPr>
-      </w:pPr>
-      <w:r>
-        <w:rPr>
-          <w:b/>
-          <w:bCs/>
-        </w:rPr>
-        <w:t>Changes from 3.35 to 3.40</w:t>
+        <w:t>Added _ separator between date and time in default filename.</w:t>
       </w:r>
     </w:p>
     <w:p>
@@ -2229,151 +2391,6 @@
         </w:numPr>
       </w:pPr>
       <w:r>
-        <w:t>Fixed bug causing crash when TRDI PT3 test was incomplete.</w:t>
-      </w:r>
-    </w:p>
-    <w:p>
-      <w:pPr>
-        <w:pStyle w:val="ListParagraph"/>
-        <w:numPr>
-          <w:ilvl w:val="0"/>
-          <w:numId w:val="4"/>
-        </w:numPr>
-      </w:pPr>
-      <w:r>
-        <w:t>Modified uncertainty estimate for invalid and edges to use absolute values.</w:t>
-      </w:r>
-    </w:p>
-    <w:p>
-      <w:pPr>
-        <w:pStyle w:val="ListParagraph"/>
-        <w:numPr>
-          <w:ilvl w:val="0"/>
-          <w:numId w:val="4"/>
-        </w:numPr>
-      </w:pPr>
-      <w:r>
-        <w:t>Fixed issue with multi-line comments in XML file.</w:t>
-      </w:r>
-    </w:p>
-    <w:p>
-      <w:pPr>
-        <w:pStyle w:val="ListParagraph"/>
-        <w:numPr>
-          <w:ilvl w:val="0"/>
-          <w:numId w:val="4"/>
-        </w:numPr>
-      </w:pPr>
-      <w:r>
-        <w:t>Fixed draft check to only evaluate checked transects.</w:t>
-      </w:r>
-    </w:p>
-    <w:p>
-      <w:pPr>
-        <w:pStyle w:val="ListParagraph"/>
-        <w:numPr>
-          <w:ilvl w:val="0"/>
-          <w:numId w:val="4"/>
-        </w:numPr>
-      </w:pPr>
-      <w:r>
-        <w:t>XML file now only contains the summary information from a SonTek compass calibration.</w:t>
-      </w:r>
-    </w:p>
-    <w:p>
-      <w:pPr>
-        <w:pStyle w:val="ListParagraph"/>
-        <w:numPr>
-          <w:ilvl w:val="0"/>
-          <w:numId w:val="4"/>
-        </w:numPr>
-      </w:pPr>
-      <w:r>
-        <w:t>Fixed bug in moving-bed test if loop compass error and direction could not be computed.</w:t>
-      </w:r>
-    </w:p>
-    <w:p>
-      <w:pPr>
-        <w:pStyle w:val="ListParagraph"/>
-        <w:numPr>
-          <w:ilvl w:val="0"/>
-          <w:numId w:val="4"/>
-        </w:numPr>
-      </w:pPr>
-      <w:r>
-        <w:t>Added message for missing samples in SonTek data.</w:t>
-      </w:r>
-    </w:p>
-    <w:p>
-      <w:pPr>
-        <w:pStyle w:val="ListParagraph"/>
-        <w:numPr>
-          <w:ilvl w:val="0"/>
-          <w:numId w:val="4"/>
-        </w:numPr>
-      </w:pPr>
-      <w:r>
-        <w:t>Modified PT3 tests to reduce false positives.</w:t>
-      </w:r>
-    </w:p>
-    <w:p>
-      <w:pPr>
-        <w:pStyle w:val="ListParagraph"/>
-        <w:numPr>
-          <w:ilvl w:val="0"/>
-          <w:numId w:val="4"/>
-        </w:numPr>
-      </w:pPr>
-      <w:r>
-        <w:t>Added check to boat and wt to check warn if all data are invalid.</w:t>
-      </w:r>
-    </w:p>
-    <w:p>
-      <w:pPr>
-        <w:pStyle w:val="ListParagraph"/>
-        <w:numPr>
-          <w:ilvl w:val="0"/>
-          <w:numId w:val="4"/>
-        </w:numPr>
-      </w:pPr>
-      <w:r>
-        <w:t>Edge sign check changed to only show message if edge discharge is greater than 0.5%</w:t>
-      </w:r>
-    </w:p>
-    <w:p>
-      <w:pPr>
-        <w:pStyle w:val="ListParagraph"/>
-        <w:numPr>
-          <w:ilvl w:val="0"/>
-          <w:numId w:val="4"/>
-        </w:numPr>
-      </w:pPr>
-      <w:r>
-        <w:t>Added option to store a style sheet with the xml output file.</w:t>
-      </w:r>
-    </w:p>
-    <w:p>
-      <w:pPr>
-        <w:pStyle w:val="ListParagraph"/>
-        <w:numPr>
-          <w:ilvl w:val="0"/>
-          <w:numId w:val="4"/>
-        </w:numPr>
-      </w:pPr>
-      <w:r>
-        <w:t>Added _ separator between date and time in default filename.</w:t>
-      </w:r>
-    </w:p>
-    <w:p>
-      <w:pPr>
-        <w:pStyle w:val="ListParagraph"/>
-        <w:numPr>
-          <w:ilvl w:val="0"/>
-          <w:numId w:val="4"/>
-        </w:numPr>
-      </w:pPr>
-      <w:r>
-        <w:lastRenderedPageBreak/>
         <w:t>Default compass data view changed to evaluation if evaluation is available.</w:t>
       </w:r>
     </w:p>
@@ -3768,7 +3785,7 @@
         <v:path o:extrusionok="f" gradientshapeok="t" o:connecttype="rect"/>
         <o:lock v:ext="edit" aspectratio="t"/>
       </v:shapetype>
-      <v:shape id="_x0000_i1076" type="#_x0000_t75" alt="Icon&#10;&#10;Description automatically generated" style="width:192pt;height:192pt;visibility:visible" o:bullet="t">
+      <v:shape id="_x0000_i1043" type="#_x0000_t75" alt="Icon&#10;&#10;Description automatically generated" style="width:192pt;height:192pt;visibility:visible" o:bullet="t">
         <v:imagedata r:id="rId1" o:title="Icon&#10;&#10;Description automatically generated"/>
       </v:shape>
     </w:pict>

</xml_diff>

<commit_message>
Updated version of matplotlib to 3.3.3 to fix odd contour plot behavior.
</commit_message>
<xml_diff>
--- a/UI/Help/QRev_Change_Log.docx
+++ b/UI/Help/QRev_Change_Log.docx
@@ -69,14 +69,52 @@
         </w:rPr>
         <w:t>Upgraded Python to 3.8</w:t>
       </w:r>
-      <w:r>
-        <w:rPr>
-          <w:rStyle w:val="eop"/>
-          <w:rFonts w:ascii="Calibri" w:hAnsi="Calibri" w:cs="Calibri"/>
+    </w:p>
+    <w:p>
+      <w:pPr>
+        <w:pStyle w:val="ListParagraph"/>
+        <w:numPr>
+          <w:ilvl w:val="0"/>
+          <w:numId w:val="28"/>
+        </w:numPr>
+        <w:shd w:val="clear" w:color="auto" w:fill="FFFFFF"/>
+        <w:spacing w:after="0" w:line="240" w:lineRule="auto"/>
+        <w:textAlignment w:val="baseline"/>
+        <w:rPr>
+          <w:rFonts w:ascii="Calibri" w:eastAsia="Times New Roman" w:hAnsi="Calibri" w:cs="Calibri"/>
           <w:color w:val="000000"/>
-          <w:shd w:val="clear" w:color="auto" w:fill="FFFFFF"/>
-        </w:rPr>
-        <w:t> </w:t>
+          <w:sz w:val="24"/>
+          <w:szCs w:val="24"/>
+        </w:rPr>
+      </w:pPr>
+      <w:r>
+        <w:rPr>
+          <w:rFonts w:ascii="Calibri" w:eastAsia="Times New Roman" w:hAnsi="Calibri" w:cs="Calibri"/>
+          <w:color w:val="000000"/>
+          <w:sz w:val="24"/>
+          <w:szCs w:val="24"/>
+        </w:rPr>
+        <w:t xml:space="preserve">Fixed crash on main tab due to lollipop plot if </w:t>
+      </w:r>
+      <w:proofErr w:type="spellStart"/>
+      <w:r>
+        <w:rPr>
+          <w:rFonts w:ascii="Calibri" w:eastAsia="Times New Roman" w:hAnsi="Calibri" w:cs="Calibri"/>
+          <w:color w:val="000000"/>
+          <w:sz w:val="24"/>
+          <w:szCs w:val="24"/>
+        </w:rPr>
+        <w:t>oursin</w:t>
+      </w:r>
+      <w:proofErr w:type="spellEnd"/>
+      <w:r>
+        <w:rPr>
+          <w:rFonts w:ascii="Calibri" w:eastAsia="Times New Roman" w:hAnsi="Calibri" w:cs="Calibri"/>
+          <w:color w:val="000000"/>
+          <w:sz w:val="24"/>
+          <w:szCs w:val="24"/>
+        </w:rPr>
+        <w:t xml:space="preserve"> not used.</w:t>
       </w:r>
     </w:p>
     <w:p>
@@ -86,9 +124,175 @@
           <w:ilvl w:val="0"/>
           <w:numId w:val="28"/>
         </w:numPr>
+        <w:shd w:val="clear" w:color="auto" w:fill="FFFFFF"/>
+        <w:spacing w:after="0" w:line="240" w:lineRule="auto"/>
+        <w:textAlignment w:val="baseline"/>
+        <w:rPr>
+          <w:rFonts w:ascii="Calibri" w:eastAsia="Times New Roman" w:hAnsi="Calibri" w:cs="Calibri"/>
+          <w:color w:val="000000"/>
+          <w:sz w:val="24"/>
+          <w:szCs w:val="24"/>
+        </w:rPr>
+      </w:pPr>
+      <w:r>
+        <w:rPr>
+          <w:rFonts w:ascii="Calibri" w:eastAsia="Times New Roman" w:hAnsi="Calibri" w:cs="Calibri"/>
+          <w:color w:val="000000"/>
+          <w:sz w:val="24"/>
+          <w:szCs w:val="24"/>
+        </w:rPr>
+        <w:t xml:space="preserve">Fix crash when changing WT plot options on file loaded from RS5 </w:t>
+      </w:r>
+      <w:proofErr w:type="spellStart"/>
+      <w:r>
+        <w:rPr>
+          <w:rFonts w:ascii="Calibri" w:eastAsia="Times New Roman" w:hAnsi="Calibri" w:cs="Calibri"/>
+          <w:color w:val="000000"/>
+          <w:sz w:val="24"/>
+          <w:szCs w:val="24"/>
+        </w:rPr>
+        <w:t>Qrev</w:t>
+      </w:r>
+      <w:proofErr w:type="spellEnd"/>
+      <w:r>
+        <w:rPr>
+          <w:rFonts w:ascii="Calibri" w:eastAsia="Times New Roman" w:hAnsi="Calibri" w:cs="Calibri"/>
+          <w:color w:val="000000"/>
+          <w:sz w:val="24"/>
+          <w:szCs w:val="24"/>
+        </w:rPr>
+        <w:t xml:space="preserve"> </w:t>
+      </w:r>
+      <w:proofErr w:type="spellStart"/>
+      <w:r>
+        <w:rPr>
+          <w:rFonts w:ascii="Calibri" w:eastAsia="Times New Roman" w:hAnsi="Calibri" w:cs="Calibri"/>
+          <w:color w:val="000000"/>
+          <w:sz w:val="24"/>
+          <w:szCs w:val="24"/>
+        </w:rPr>
+        <w:t>matfile</w:t>
+      </w:r>
+      <w:proofErr w:type="spellEnd"/>
+      <w:r>
+        <w:rPr>
+          <w:rFonts w:ascii="Calibri" w:eastAsia="Times New Roman" w:hAnsi="Calibri" w:cs="Calibri"/>
+          <w:color w:val="000000"/>
+          <w:sz w:val="24"/>
+          <w:szCs w:val="24"/>
+        </w:rPr>
+        <w:t xml:space="preserve"> due to spaces in ping types when reloading.</w:t>
+      </w:r>
+    </w:p>
+    <w:p>
+      <w:pPr>
+        <w:pStyle w:val="ListParagraph"/>
+        <w:numPr>
+          <w:ilvl w:val="0"/>
+          <w:numId w:val="28"/>
+        </w:numPr>
+        <w:shd w:val="clear" w:color="auto" w:fill="FFFFFF"/>
+        <w:spacing w:after="0" w:line="240" w:lineRule="auto"/>
+        <w:textAlignment w:val="baseline"/>
+        <w:rPr>
+          <w:rFonts w:ascii="Calibri" w:eastAsia="Times New Roman" w:hAnsi="Calibri" w:cs="Calibri"/>
+          <w:color w:val="000000"/>
+          <w:sz w:val="24"/>
+          <w:szCs w:val="24"/>
+        </w:rPr>
+      </w:pPr>
+      <w:r>
+        <w:rPr>
+          <w:rFonts w:ascii="Calibri" w:eastAsia="Times New Roman" w:hAnsi="Calibri" w:cs="Calibri"/>
+          <w:color w:val="000000"/>
+          <w:sz w:val="24"/>
+          <w:szCs w:val="24"/>
+        </w:rPr>
+        <w:t xml:space="preserve">Fix crash when plotting </w:t>
+      </w:r>
+      <w:proofErr w:type="spellStart"/>
+      <w:r>
+        <w:rPr>
+          <w:rFonts w:ascii="Calibri" w:eastAsia="Times New Roman" w:hAnsi="Calibri" w:cs="Calibri"/>
+          <w:color w:val="000000"/>
+          <w:sz w:val="24"/>
+          <w:szCs w:val="24"/>
+        </w:rPr>
+        <w:t>shiptrack</w:t>
+      </w:r>
+      <w:proofErr w:type="spellEnd"/>
+      <w:r>
+        <w:rPr>
+          <w:rFonts w:ascii="Calibri" w:eastAsia="Times New Roman" w:hAnsi="Calibri" w:cs="Calibri"/>
+          <w:color w:val="000000"/>
+          <w:sz w:val="24"/>
+          <w:szCs w:val="24"/>
+        </w:rPr>
+        <w:t xml:space="preserve"> on </w:t>
+      </w:r>
+      <w:proofErr w:type="spellStart"/>
+      <w:r>
+        <w:rPr>
+          <w:rFonts w:ascii="Calibri" w:eastAsia="Times New Roman" w:hAnsi="Calibri" w:cs="Calibri"/>
+          <w:color w:val="000000"/>
+          <w:sz w:val="24"/>
+          <w:szCs w:val="24"/>
+        </w:rPr>
+        <w:t>MvBedTst</w:t>
+      </w:r>
+      <w:proofErr w:type="spellEnd"/>
+      <w:r>
+        <w:rPr>
+          <w:rFonts w:ascii="Calibri" w:eastAsia="Times New Roman" w:hAnsi="Calibri" w:cs="Calibri"/>
+          <w:color w:val="000000"/>
+          <w:sz w:val="24"/>
+          <w:szCs w:val="24"/>
+        </w:rPr>
+        <w:t xml:space="preserve"> tab when viewing some older </w:t>
+      </w:r>
+      <w:proofErr w:type="spellStart"/>
+      <w:r>
+        <w:rPr>
+          <w:rFonts w:ascii="Calibri" w:eastAsia="Times New Roman" w:hAnsi="Calibri" w:cs="Calibri"/>
+          <w:color w:val="000000"/>
+          <w:sz w:val="24"/>
+          <w:szCs w:val="24"/>
+        </w:rPr>
+        <w:t>Qrev</w:t>
+      </w:r>
+      <w:proofErr w:type="spellEnd"/>
+      <w:r>
+        <w:rPr>
+          <w:rFonts w:ascii="Calibri" w:eastAsia="Times New Roman" w:hAnsi="Calibri" w:cs="Calibri"/>
+          <w:color w:val="000000"/>
+          <w:sz w:val="24"/>
+          <w:szCs w:val="24"/>
+        </w:rPr>
+        <w:t xml:space="preserve"> files.</w:t>
+      </w:r>
+    </w:p>
+    <w:p>
+      <w:pPr>
+        <w:pStyle w:val="ListParagraph"/>
+        <w:numPr>
+          <w:ilvl w:val="0"/>
+          <w:numId w:val="28"/>
+        </w:numPr>
       </w:pPr>
       <w:r>
         <w:t>Added config file.</w:t>
+      </w:r>
+    </w:p>
+    <w:p>
+      <w:pPr>
+        <w:pStyle w:val="ListParagraph"/>
+        <w:numPr>
+          <w:ilvl w:val="0"/>
+          <w:numId w:val="28"/>
+        </w:numPr>
+      </w:pPr>
+      <w:r>
+        <w:t>Added creation of config file if one does not exist.</w:t>
       </w:r>
     </w:p>
     <w:p>
@@ -507,6 +711,7 @@
         </w:numPr>
       </w:pPr>
       <w:r>
+        <w:lastRenderedPageBreak/>
         <w:t xml:space="preserve">Fixed crash when opening an older </w:t>
       </w:r>
       <w:proofErr w:type="spellStart"/>
@@ -582,7 +787,6 @@
           <w:b/>
           <w:bCs/>
         </w:rPr>
-        <w:lastRenderedPageBreak/>
         <w:t>Changes 4.26 to 4.27</w:t>
       </w:r>
     </w:p>
@@ -1134,6 +1338,7 @@
       </w:pPr>
       <w:proofErr w:type="spellStart"/>
       <w:r>
+        <w:lastRenderedPageBreak/>
         <w:t>Extrap</w:t>
       </w:r>
       <w:proofErr w:type="spellEnd"/>
@@ -1203,7 +1408,6 @@
           <w:b/>
           <w:bCs/>
         </w:rPr>
-        <w:lastRenderedPageBreak/>
         <w:t>Changes 4.23 to 4.24</w:t>
       </w:r>
     </w:p>
@@ -1807,7 +2011,6 @@
         </w:numPr>
       </w:pPr>
       <w:r>
-        <w:lastRenderedPageBreak/>
         <w:t>Fixed issue with VTG low speed message</w:t>
       </w:r>
     </w:p>
@@ -2258,6 +2461,7 @@
           <w:b/>
           <w:bCs/>
         </w:rPr>
+        <w:lastRenderedPageBreak/>
         <w:t>Changes 3.41 to 3.42</w:t>
       </w:r>
     </w:p>
@@ -2285,7 +2489,6 @@
           <w:b/>
           <w:bCs/>
         </w:rPr>
-        <w:lastRenderedPageBreak/>
         <w:t>Changes 3.40 to 3.41</w:t>
       </w:r>
     </w:p>
@@ -2797,6 +3000,7 @@
         </w:numPr>
       </w:pPr>
       <w:r>
+        <w:lastRenderedPageBreak/>
         <w:t>Fixed bug creating structure for test results from existing QRev files</w:t>
       </w:r>
     </w:p>
@@ -2833,7 +3037,6 @@
         </w:numPr>
       </w:pPr>
       <w:r>
-        <w:lastRenderedPageBreak/>
         <w:t>Fixed bug preventing user uncertainty from being recomputed after changing a filter or extrapolation</w:t>
       </w:r>
     </w:p>
@@ -3186,6 +3389,7 @@
         </w:numPr>
       </w:pPr>
       <w:r>
+        <w:lastRenderedPageBreak/>
         <w:t>Clicking a row in the extrapolation discharge sensitivity table will set the fit to those parameters.</w:t>
       </w:r>
     </w:p>
@@ -3218,7 +3422,6 @@
         </w:numPr>
       </w:pPr>
       <w:r>
-        <w:lastRenderedPageBreak/>
         <w:t>The system test window now displays the total number of tests.</w:t>
       </w:r>
     </w:p>
@@ -3656,6 +3859,7 @@
         </w:numPr>
       </w:pPr>
       <w:r>
+        <w:lastRenderedPageBreak/>
         <w:t>Update help to add pdf file which can be searched.</w:t>
       </w:r>
     </w:p>
@@ -3692,7 +3896,6 @@
         </w:numPr>
       </w:pPr>
       <w:r>
-        <w:lastRenderedPageBreak/>
         <w:t>Fixed bug causing Use in main table to be shown in red when there were no errors.</w:t>
       </w:r>
     </w:p>
@@ -4202,7 +4405,7 @@
         <v:path o:extrusionok="f" gradientshapeok="t" o:connecttype="rect"/>
         <o:lock v:ext="edit" aspectratio="t"/>
       </v:shapetype>
-      <v:shape id="_x0000_i1038" type="#_x0000_t75" alt="A close up of a logo&#10;&#10;Description automatically generated" style="width:35.55pt;height:35.55pt;visibility:visible;mso-wrap-style:square" o:bullet="t">
+      <v:shape id="_x0000_i1067" type="#_x0000_t75" alt="A close up of a logo&#10;&#10;Description automatically generated" style="width:35.3pt;height:35.3pt;visibility:visible;mso-wrap-style:square" o:bullet="t">
         <v:imagedata r:id="rId1" o:title="A close up of a logo&#10;&#10;Description automatically generated"/>
       </v:shape>
     </w:pict>

</xml_diff>

<commit_message>
Update version and changelog.
</commit_message>
<xml_diff>
--- a/UI/Help/QRev_Change_Log.docx
+++ b/UI/Help/QRev_Change_Log.docx
@@ -46,6 +46,60 @@
           <w:b/>
           <w:bCs/>
         </w:rPr>
+        <w:t>Changes 4.</w:t>
+      </w:r>
+      <w:r>
+        <w:rPr>
+          <w:b/>
+          <w:bCs/>
+        </w:rPr>
+        <w:t>30</w:t>
+      </w:r>
+      <w:r>
+        <w:rPr>
+          <w:b/>
+          <w:bCs/>
+        </w:rPr>
+        <w:t xml:space="preserve"> to 4.3</w:t>
+      </w:r>
+      <w:r>
+        <w:rPr>
+          <w:b/>
+          <w:bCs/>
+        </w:rPr>
+        <w:t>1</w:t>
+      </w:r>
+    </w:p>
+    <w:p>
+      <w:pPr>
+        <w:pStyle w:val="ListParagraph"/>
+        <w:numPr>
+          <w:ilvl w:val="0"/>
+          <w:numId w:val="29"/>
+        </w:numPr>
+      </w:pPr>
+      <w:r>
+        <w:t>Fix plot</w:t>
+      </w:r>
+      <w:r>
+        <w:t>t</w:t>
+      </w:r>
+      <w:r>
+        <w:t>ing of error and vertical velocity time series data on the BT and WT tabs.</w:t>
+      </w:r>
+    </w:p>
+    <w:p>
+      <w:pPr>
+        <w:rPr>
+          <w:b/>
+          <w:bCs/>
+        </w:rPr>
+      </w:pPr>
+      <w:r>
+        <w:rPr>
+          <w:b/>
+          <w:bCs/>
+        </w:rPr>
         <w:t>Changes 4.29 to 4.30</w:t>
       </w:r>
     </w:p>
@@ -94,19 +148,26 @@
           <w:sz w:val="24"/>
           <w:szCs w:val="24"/>
         </w:rPr>
-        <w:t xml:space="preserve">Fixed crash on main tab due to lollipop plot if </w:t>
-      </w:r>
-      <w:proofErr w:type="spellStart"/>
-      <w:r>
+        <w:t>Fixed crash on main tab due to lollipop plot if oursin not used.</w:t>
+      </w:r>
+    </w:p>
+    <w:p>
+      <w:pPr>
+        <w:pStyle w:val="ListParagraph"/>
+        <w:numPr>
+          <w:ilvl w:val="0"/>
+          <w:numId w:val="28"/>
+        </w:numPr>
+        <w:shd w:val="clear" w:color="auto" w:fill="FFFFFF"/>
+        <w:spacing w:after="0" w:line="240" w:lineRule="auto"/>
+        <w:textAlignment w:val="baseline"/>
         <w:rPr>
           <w:rFonts w:ascii="Calibri" w:eastAsia="Times New Roman" w:hAnsi="Calibri" w:cs="Calibri"/>
           <w:color w:val="000000"/>
           <w:sz w:val="24"/>
           <w:szCs w:val="24"/>
         </w:rPr>
-        <w:t>oursin</w:t>
-      </w:r>
-      <w:proofErr w:type="spellEnd"/>
+      </w:pPr>
       <w:r>
         <w:rPr>
           <w:rFonts w:ascii="Calibri" w:eastAsia="Times New Roman" w:hAnsi="Calibri" w:cs="Calibri"/>
@@ -114,7 +175,7 @@
           <w:sz w:val="24"/>
           <w:szCs w:val="24"/>
         </w:rPr>
-        <w:t xml:space="preserve"> not used.</w:t>
+        <w:t>Fix crash when changing WT plot options on file loaded from RS5 Qrev matfile due to spaces in ping types when reloading.</w:t>
       </w:r>
     </w:p>
     <w:p>
@@ -141,47 +202,7 @@
           <w:sz w:val="24"/>
           <w:szCs w:val="24"/>
         </w:rPr>
-        <w:t xml:space="preserve">Fix crash when changing WT plot options on file loaded from RS5 </w:t>
-      </w:r>
-      <w:proofErr w:type="spellStart"/>
-      <w:r>
-        <w:rPr>
-          <w:rFonts w:ascii="Calibri" w:eastAsia="Times New Roman" w:hAnsi="Calibri" w:cs="Calibri"/>
-          <w:color w:val="000000"/>
-          <w:sz w:val="24"/>
-          <w:szCs w:val="24"/>
-        </w:rPr>
-        <w:t>Qrev</w:t>
-      </w:r>
-      <w:proofErr w:type="spellEnd"/>
-      <w:r>
-        <w:rPr>
-          <w:rFonts w:ascii="Calibri" w:eastAsia="Times New Roman" w:hAnsi="Calibri" w:cs="Calibri"/>
-          <w:color w:val="000000"/>
-          <w:sz w:val="24"/>
-          <w:szCs w:val="24"/>
-        </w:rPr>
-        <w:t xml:space="preserve"> </w:t>
-      </w:r>
-      <w:proofErr w:type="spellStart"/>
-      <w:r>
-        <w:rPr>
-          <w:rFonts w:ascii="Calibri" w:eastAsia="Times New Roman" w:hAnsi="Calibri" w:cs="Calibri"/>
-          <w:color w:val="000000"/>
-          <w:sz w:val="24"/>
-          <w:szCs w:val="24"/>
-        </w:rPr>
-        <w:t>matfile</w:t>
-      </w:r>
-      <w:proofErr w:type="spellEnd"/>
-      <w:r>
-        <w:rPr>
-          <w:rFonts w:ascii="Calibri" w:eastAsia="Times New Roman" w:hAnsi="Calibri" w:cs="Calibri"/>
-          <w:color w:val="000000"/>
-          <w:sz w:val="24"/>
-          <w:szCs w:val="24"/>
-        </w:rPr>
-        <w:t xml:space="preserve"> due to spaces in ping types when reloading.</w:t>
+        <w:t>Fix crash when plotting shiptrack on MvBedTst tab when viewing some older Qrev files.</w:t>
       </w:r>
     </w:p>
     <w:p>
@@ -191,84 +212,9 @@
           <w:ilvl w:val="0"/>
           <w:numId w:val="28"/>
         </w:numPr>
-        <w:shd w:val="clear" w:color="auto" w:fill="FFFFFF"/>
-        <w:spacing w:after="0" w:line="240" w:lineRule="auto"/>
-        <w:textAlignment w:val="baseline"/>
-        <w:rPr>
-          <w:rFonts w:ascii="Calibri" w:eastAsia="Times New Roman" w:hAnsi="Calibri" w:cs="Calibri"/>
-          <w:color w:val="000000"/>
-          <w:sz w:val="24"/>
-          <w:szCs w:val="24"/>
-        </w:rPr>
-      </w:pPr>
-      <w:r>
-        <w:rPr>
-          <w:rFonts w:ascii="Calibri" w:eastAsia="Times New Roman" w:hAnsi="Calibri" w:cs="Calibri"/>
-          <w:color w:val="000000"/>
-          <w:sz w:val="24"/>
-          <w:szCs w:val="24"/>
-        </w:rPr>
-        <w:t xml:space="preserve">Fix crash when plotting </w:t>
-      </w:r>
-      <w:proofErr w:type="spellStart"/>
-      <w:r>
-        <w:rPr>
-          <w:rFonts w:ascii="Calibri" w:eastAsia="Times New Roman" w:hAnsi="Calibri" w:cs="Calibri"/>
-          <w:color w:val="000000"/>
-          <w:sz w:val="24"/>
-          <w:szCs w:val="24"/>
-        </w:rPr>
-        <w:t>shiptrack</w:t>
-      </w:r>
-      <w:proofErr w:type="spellEnd"/>
-      <w:r>
-        <w:rPr>
-          <w:rFonts w:ascii="Calibri" w:eastAsia="Times New Roman" w:hAnsi="Calibri" w:cs="Calibri"/>
-          <w:color w:val="000000"/>
-          <w:sz w:val="24"/>
-          <w:szCs w:val="24"/>
-        </w:rPr>
-        <w:t xml:space="preserve"> on </w:t>
-      </w:r>
-      <w:proofErr w:type="spellStart"/>
-      <w:r>
-        <w:rPr>
-          <w:rFonts w:ascii="Calibri" w:eastAsia="Times New Roman" w:hAnsi="Calibri" w:cs="Calibri"/>
-          <w:color w:val="000000"/>
-          <w:sz w:val="24"/>
-          <w:szCs w:val="24"/>
-        </w:rPr>
-        <w:t>MvBedTst</w:t>
-      </w:r>
-      <w:proofErr w:type="spellEnd"/>
-      <w:r>
-        <w:rPr>
-          <w:rFonts w:ascii="Calibri" w:eastAsia="Times New Roman" w:hAnsi="Calibri" w:cs="Calibri"/>
-          <w:color w:val="000000"/>
-          <w:sz w:val="24"/>
-          <w:szCs w:val="24"/>
-        </w:rPr>
-        <w:t xml:space="preserve"> tab when viewing some older </w:t>
-      </w:r>
-      <w:proofErr w:type="spellStart"/>
-      <w:r>
-        <w:rPr>
-          <w:rFonts w:ascii="Calibri" w:eastAsia="Times New Roman" w:hAnsi="Calibri" w:cs="Calibri"/>
-          <w:color w:val="000000"/>
-          <w:sz w:val="24"/>
-          <w:szCs w:val="24"/>
-        </w:rPr>
-        <w:t>Qrev</w:t>
-      </w:r>
-      <w:proofErr w:type="spellEnd"/>
-      <w:r>
-        <w:rPr>
-          <w:rFonts w:ascii="Calibri" w:eastAsia="Times New Roman" w:hAnsi="Calibri" w:cs="Calibri"/>
-          <w:color w:val="000000"/>
-          <w:sz w:val="24"/>
-          <w:szCs w:val="24"/>
-        </w:rPr>
-        <w:t xml:space="preserve"> files.</w:t>
+      </w:pPr>
+      <w:r>
+        <w:t>Added config file.</w:t>
       </w:r>
     </w:p>
     <w:p>
@@ -280,7 +226,7 @@
         </w:numPr>
       </w:pPr>
       <w:r>
-        <w:t>Added config file.</w:t>
+        <w:t>Added creation of config file if one does not exist.</w:t>
       </w:r>
     </w:p>
     <w:p>
@@ -292,7 +238,7 @@
         </w:numPr>
       </w:pPr>
       <w:r>
-        <w:t>Added creation of config file if one does not exist.</w:t>
+        <w:t>Modified XML output. The Uncertainty node now contains only the total uncertainty and the model used. Separate nodes are provided for QRev_UA and Oursin details.</w:t>
       </w:r>
     </w:p>
     <w:p>
@@ -304,23 +250,10 @@
         </w:numPr>
       </w:pPr>
       <w:r>
-        <w:t xml:space="preserve">Modified XML output. The Uncertainty node now contains only the total uncertainty and the model used. Separate nodes are provided for </w:t>
-      </w:r>
-      <w:proofErr w:type="spellStart"/>
-      <w:r>
-        <w:t>QRev_UA</w:t>
-      </w:r>
-      <w:proofErr w:type="spellEnd"/>
-      <w:r>
-        <w:t xml:space="preserve"> and </w:t>
-      </w:r>
-      <w:proofErr w:type="spellStart"/>
-      <w:r>
-        <w:t>Oursin</w:t>
-      </w:r>
-      <w:proofErr w:type="spellEnd"/>
-      <w:r>
-        <w:t xml:space="preserve"> details.</w:t>
+        <w:t>F</w:t>
+      </w:r>
+      <w:r>
+        <w:t>ixed issue with salinity entered in WR2 not being applied in QRev</w:t>
       </w:r>
     </w:p>
     <w:p>
@@ -332,16 +265,11 @@
         </w:numPr>
       </w:pPr>
       <w:r>
-        <w:t>F</w:t>
-      </w:r>
-      <w:r>
-        <w:t xml:space="preserve">ixed issue with salinity entered in WR2 not being applied in </w:t>
-      </w:r>
-      <w:proofErr w:type="spellStart"/>
-      <w:r>
-        <w:t>QRev</w:t>
-      </w:r>
-      <w:proofErr w:type="spellEnd"/>
+        <w:t>A</w:t>
+      </w:r>
+      <w:r>
+        <w:t>dded support for RSL manual speed of sound, temperature, and salinity settings</w:t>
+      </w:r>
     </w:p>
     <w:p>
       <w:pPr>
@@ -352,10 +280,13 @@
         </w:numPr>
       </w:pPr>
       <w:r>
-        <w:t>A</w:t>
-      </w:r>
-      <w:r>
-        <w:t>dded support for RSL manual speed of sound, temperature, and salinity settings</w:t>
+        <w:t xml:space="preserve">Fixed bug adjusting RSL data to raw values when </w:t>
+      </w:r>
+      <w:r>
+        <w:t>manual speed of sound, temperature, and salinity settings</w:t>
+      </w:r>
+      <w:r>
+        <w:t xml:space="preserve"> were applied in RSL</w:t>
       </w:r>
     </w:p>
     <w:p>
@@ -367,13 +298,7 @@
         </w:numPr>
       </w:pPr>
       <w:r>
-        <w:t xml:space="preserve">Fixed bug adjusting RSL data to raw values when </w:t>
-      </w:r>
-      <w:r>
-        <w:t>manual speed of sound, temperature, and salinity settings</w:t>
-      </w:r>
-      <w:r>
-        <w:t xml:space="preserve"> were applied in RSL</w:t>
+        <w:t>Speed of sound correction now applied to vertical boat and water velocities.</w:t>
       </w:r>
     </w:p>
     <w:p>
@@ -385,7 +310,7 @@
         </w:numPr>
       </w:pPr>
       <w:r>
-        <w:t>Speed of sound correction now applied to vertical boat and water velocities.</w:t>
+        <w:t>Fixed bug in Oursin uncertainty model when using GPS reference</w:t>
       </w:r>
     </w:p>
     <w:p>
@@ -397,15 +322,7 @@
         </w:numPr>
       </w:pPr>
       <w:r>
-        <w:t xml:space="preserve">Fixed bug in </w:t>
-      </w:r>
-      <w:proofErr w:type="spellStart"/>
-      <w:r>
-        <w:t>Oursin</w:t>
-      </w:r>
-      <w:proofErr w:type="spellEnd"/>
-      <w:r>
-        <w:t xml:space="preserve"> uncertainty model when using GPS reference</w:t>
+        <w:t>Fixed bug in GPS tab when all transects do not have GPS data</w:t>
       </w:r>
     </w:p>
     <w:p>
@@ -417,7 +334,7 @@
         </w:numPr>
       </w:pPr>
       <w:r>
-        <w:t>Fixed bug in GPS tab when all transects do not have GPS data</w:t>
+        <w:t>Fixed bug causing Main tab not to update following user input in Oursin uncertainty</w:t>
       </w:r>
     </w:p>
     <w:p>
@@ -429,15 +346,7 @@
         </w:numPr>
       </w:pPr>
       <w:r>
-        <w:t xml:space="preserve">Fixed bug causing Main tab not to update following user input in </w:t>
-      </w:r>
-      <w:proofErr w:type="spellStart"/>
-      <w:r>
-        <w:t>Oursin</w:t>
-      </w:r>
-      <w:proofErr w:type="spellEnd"/>
-      <w:r>
-        <w:t xml:space="preserve"> uncertainty</w:t>
+        <w:t>Fixed bug loading QRev.mat as View then changing to Oursin uncertainty</w:t>
       </w:r>
     </w:p>
     <w:p>
@@ -449,23 +358,7 @@
         </w:numPr>
       </w:pPr>
       <w:r>
-        <w:t xml:space="preserve">Fixed bug loading </w:t>
-      </w:r>
-      <w:proofErr w:type="spellStart"/>
-      <w:r>
-        <w:t>QRev.mat</w:t>
-      </w:r>
-      <w:proofErr w:type="spellEnd"/>
-      <w:r>
-        <w:t xml:space="preserve"> as View then changing to </w:t>
-      </w:r>
-      <w:proofErr w:type="spellStart"/>
-      <w:r>
-        <w:t>Oursin</w:t>
-      </w:r>
-      <w:proofErr w:type="spellEnd"/>
-      <w:r>
-        <w:t xml:space="preserve"> uncertainty</w:t>
+        <w:t>Fixed bug on boat speed plot preventing invalid original data from plotting</w:t>
       </w:r>
     </w:p>
     <w:p>
@@ -477,7 +370,7 @@
         </w:numPr>
       </w:pPr>
       <w:r>
-        <w:t>Fixed bug on boat speed plot preventing invalid original data from plotting</w:t>
+        <w:t>Fixed bug causing crash if total discharge equals zero</w:t>
       </w:r>
     </w:p>
     <w:p>
@@ -489,7 +382,7 @@
         </w:numPr>
       </w:pPr>
       <w:r>
-        <w:t>Fixed bug causing crash if total discharge equals zero</w:t>
+        <w:t>Fixed bug for SonTek ADCPs showing no in the xml file CompassCalibrationResult when there is a calibration</w:t>
       </w:r>
     </w:p>
     <w:p>
@@ -501,23 +394,7 @@
         </w:numPr>
       </w:pPr>
       <w:r>
-        <w:t xml:space="preserve">Fixed bug for </w:t>
-      </w:r>
-      <w:proofErr w:type="spellStart"/>
-      <w:r>
-        <w:t>SonTek</w:t>
-      </w:r>
-      <w:proofErr w:type="spellEnd"/>
-      <w:r>
-        <w:t xml:space="preserve"> ADCPs showing no in the xml file </w:t>
-      </w:r>
-      <w:proofErr w:type="spellStart"/>
-      <w:r>
-        <w:t>CompassCalibrationResult</w:t>
-      </w:r>
-      <w:proofErr w:type="spellEnd"/>
-      <w:r>
-        <w:t xml:space="preserve"> when there is a calibration</w:t>
+        <w:t>Fixed bug in manual 3-beam filter setting for water track</w:t>
       </w:r>
     </w:p>
     <w:p>
@@ -529,7 +406,7 @@
         </w:numPr>
       </w:pPr>
       <w:r>
-        <w:t>Fixed bug in manual 3-beam filter setting for water track</w:t>
+        <w:t>Fixed bug loading RS5 Matlab data with blank Operator and/or Measurement Number</w:t>
       </w:r>
     </w:p>
     <w:p>
@@ -541,15 +418,7 @@
         </w:numPr>
       </w:pPr>
       <w:r>
-        <w:t xml:space="preserve">Fixed bug loading RS5 </w:t>
-      </w:r>
-      <w:proofErr w:type="spellStart"/>
-      <w:r>
-        <w:t>Matlab</w:t>
-      </w:r>
-      <w:proofErr w:type="spellEnd"/>
-      <w:r>
-        <w:t xml:space="preserve"> data with blank Operator and/or Measurement Number</w:t>
+        <w:t>Fixed bug in some dialogs if an edit box is left blank and OK is pressed</w:t>
       </w:r>
     </w:p>
     <w:p>
@@ -561,7 +430,7 @@
         </w:numPr>
       </w:pPr>
       <w:r>
-        <w:t>Fixed bug in some dialogs if an edit box is left blank and OK is pressed</w:t>
+        <w:t>Fixed bug associated with loading, reprocessing, saving, and then reloading of older *_QRev.mat files</w:t>
       </w:r>
     </w:p>
     <w:p>
@@ -573,15 +442,7 @@
         </w:numPr>
       </w:pPr>
       <w:r>
-        <w:t>Fixed bug associated with loading, reprocessing, saving, and then reloading of older *_</w:t>
-      </w:r>
-      <w:proofErr w:type="spellStart"/>
-      <w:r>
-        <w:t>QRev.mat</w:t>
-      </w:r>
-      <w:proofErr w:type="spellEnd"/>
-      <w:r>
-        <w:t xml:space="preserve"> files</w:t>
+        <w:t>Fixed bug causing crash when viewing SNR plot if transect had missing samples</w:t>
       </w:r>
     </w:p>
     <w:p>
@@ -593,35 +454,7 @@
         </w:numPr>
       </w:pPr>
       <w:r>
-        <w:t>Fixed bug causing crash when viewing SNR plot if transect had missing samples</w:t>
-      </w:r>
-    </w:p>
-    <w:p>
-      <w:pPr>
-        <w:pStyle w:val="ListParagraph"/>
-        <w:numPr>
-          <w:ilvl w:val="0"/>
-          <w:numId w:val="28"/>
-        </w:numPr>
-      </w:pPr>
-      <w:r>
-        <w:t xml:space="preserve">Fixed crash when opening a </w:t>
-      </w:r>
-      <w:proofErr w:type="spellStart"/>
-      <w:r>
-        <w:t>SonTek</w:t>
-      </w:r>
-      <w:proofErr w:type="spellEnd"/>
-      <w:r>
-        <w:t xml:space="preserve"> </w:t>
-      </w:r>
-      <w:proofErr w:type="spellStart"/>
-      <w:r>
-        <w:t>Matlab</w:t>
-      </w:r>
-      <w:proofErr w:type="spellEnd"/>
-      <w:r>
-        <w:t xml:space="preserve"> file that had no sample data</w:t>
+        <w:t>Fixed crash when opening a SonTek Matlab file that had no sample data</w:t>
       </w:r>
     </w:p>
     <w:p>
@@ -684,6 +517,7 @@
         </w:numPr>
       </w:pPr>
       <w:r>
+        <w:lastRenderedPageBreak/>
         <w:t>Fix crash associated with auto beam filters for TRDI data.</w:t>
       </w:r>
     </w:p>
@@ -711,24 +545,7 @@
         </w:numPr>
       </w:pPr>
       <w:r>
-        <w:lastRenderedPageBreak/>
-        <w:t xml:space="preserve">Fixed crash when opening an older </w:t>
-      </w:r>
-      <w:proofErr w:type="spellStart"/>
-      <w:r>
-        <w:t>QRev.mat</w:t>
-      </w:r>
-      <w:proofErr w:type="spellEnd"/>
-      <w:r>
-        <w:t xml:space="preserve"> file for a </w:t>
-      </w:r>
-      <w:proofErr w:type="spellStart"/>
-      <w:r>
-        <w:t>Sontek</w:t>
-      </w:r>
-      <w:proofErr w:type="spellEnd"/>
-      <w:r>
-        <w:t xml:space="preserve"> M9 that had some of the Loop test data marked as edge data. </w:t>
+        <w:t xml:space="preserve">Fixed crash when opening an older QRev.mat file for a Sontek M9 that had some of the Loop test data marked as edge data. </w:t>
       </w:r>
     </w:p>
     <w:p>
@@ -740,15 +557,7 @@
         </w:numPr>
       </w:pPr>
       <w:r>
-        <w:t xml:space="preserve">Fixed crash when changing thresholds on older </w:t>
-      </w:r>
-      <w:proofErr w:type="spellStart"/>
-      <w:r>
-        <w:t>QRev.mat</w:t>
-      </w:r>
-      <w:proofErr w:type="spellEnd"/>
-      <w:r>
-        <w:t xml:space="preserve"> file where bad MBT data was present. </w:t>
+        <w:t xml:space="preserve">Fixed crash when changing thresholds on older QRev.mat file where bad MBT data was present. </w:t>
       </w:r>
     </w:p>
     <w:p>
@@ -813,15 +622,7 @@
         <w:ind w:left="720" w:hanging="360"/>
       </w:pPr>
       <w:r>
-        <w:t xml:space="preserve">WT error and vertical velocity filters are now applied based on ping type for all new processing of data. Loading older </w:t>
-      </w:r>
-      <w:proofErr w:type="spellStart"/>
-      <w:r>
-        <w:t>QRev</w:t>
-      </w:r>
-      <w:proofErr w:type="spellEnd"/>
-      <w:r>
-        <w:t xml:space="preserve"> files without reprocessing will display previous results. </w:t>
+        <w:t xml:space="preserve">WT error and vertical velocity filters are now applied based on ping type for all new processing of data. Loading older QRev files without reprocessing will display previous results. </w:t>
       </w:r>
     </w:p>
     <w:p>
@@ -834,15 +635,7 @@
         <w:ind w:left="720" w:hanging="360"/>
       </w:pPr>
       <w:r>
-        <w:t xml:space="preserve">BT error and vertical velocity filters are now applied based on bottom track ping frequency for all new processing of data. Loading older </w:t>
-      </w:r>
-      <w:proofErr w:type="spellStart"/>
-      <w:r>
-        <w:t>QRev</w:t>
-      </w:r>
-      <w:proofErr w:type="spellEnd"/>
-      <w:r>
-        <w:t xml:space="preserve"> files without reprocessing will display previous results. </w:t>
+        <w:t xml:space="preserve">BT error and vertical velocity filters are now applied based on bottom track ping frequency for all new processing of data. Loading older QRev files without reprocessing will display previous results. </w:t>
       </w:r>
     </w:p>
     <w:p>
@@ -881,15 +674,7 @@
         <w:ind w:left="720" w:hanging="360"/>
       </w:pPr>
       <w:r>
-        <w:t xml:space="preserve">Fixed several bugs related to reading RS5 and older </w:t>
-      </w:r>
-      <w:proofErr w:type="spellStart"/>
-      <w:r>
-        <w:t>QRev</w:t>
-      </w:r>
-      <w:proofErr w:type="spellEnd"/>
-      <w:r>
-        <w:t xml:space="preserve"> files.</w:t>
+        <w:t>Fixed several bugs related to reading RS5 and older QRev files.</w:t>
       </w:r>
     </w:p>
     <w:p>
@@ -979,35 +764,7 @@
         <w:rPr>
           <w:rFonts w:cstheme="minorHAnsi"/>
         </w:rPr>
-        <w:t xml:space="preserve">Fixed crash resulting from import of </w:t>
-      </w:r>
-      <w:proofErr w:type="spellStart"/>
-      <w:r>
-        <w:rPr>
-          <w:rFonts w:cstheme="minorHAnsi"/>
-        </w:rPr>
-        <w:t>mmt</w:t>
-      </w:r>
-      <w:proofErr w:type="spellEnd"/>
-      <w:r>
-        <w:rPr>
-          <w:rFonts w:cstheme="minorHAnsi"/>
-        </w:rPr>
-        <w:t xml:space="preserve"> file with no configuration commands (</w:t>
-      </w:r>
-      <w:proofErr w:type="spellStart"/>
-      <w:r>
-        <w:rPr>
-          <w:rFonts w:cstheme="minorHAnsi"/>
-        </w:rPr>
-        <w:t>streampro</w:t>
-      </w:r>
-      <w:proofErr w:type="spellEnd"/>
-      <w:r>
-        <w:rPr>
-          <w:rFonts w:cstheme="minorHAnsi"/>
-        </w:rPr>
-        <w:t xml:space="preserve"> palm pilot).</w:t>
+        <w:t>Fixed crash resulting from import of mmt file with no configuration commands (streampro palm pilot).</w:t>
       </w:r>
     </w:p>
     <w:p>
@@ -1067,25 +824,7 @@
           <w:color w:val="000000"/>
           <w:shd w:val="clear" w:color="auto" w:fill="FFFFFF"/>
         </w:rPr>
-        <w:t>Changed the options for loading existing *_</w:t>
-      </w:r>
-      <w:proofErr w:type="spellStart"/>
-      <w:r>
-        <w:rPr>
-          <w:rFonts w:cstheme="minorHAnsi"/>
-          <w:color w:val="000000"/>
-          <w:shd w:val="clear" w:color="auto" w:fill="FFFFFF"/>
-        </w:rPr>
-        <w:t>QRev.mat</w:t>
-      </w:r>
-      <w:proofErr w:type="spellEnd"/>
-      <w:r>
-        <w:rPr>
-          <w:rFonts w:cstheme="minorHAnsi"/>
-          <w:color w:val="000000"/>
-          <w:shd w:val="clear" w:color="auto" w:fill="FFFFFF"/>
-        </w:rPr>
-        <w:t xml:space="preserve"> files. The options now are View or Reprocess.</w:t>
+        <w:t>Changed the options for loading existing *_QRev.mat files. The options now are View or Reprocess.</w:t>
       </w:r>
       <w:r>
         <w:tab/>
@@ -1101,15 +840,7 @@
         <w:ind w:left="720" w:hanging="360"/>
       </w:pPr>
       <w:r>
-        <w:t xml:space="preserve">Fixed crash when changing the magnetic variation after loading a previously saved </w:t>
-      </w:r>
-      <w:proofErr w:type="spellStart"/>
-      <w:r>
-        <w:t>QRev</w:t>
-      </w:r>
-      <w:proofErr w:type="spellEnd"/>
-      <w:r>
-        <w:t xml:space="preserve"> file.</w:t>
+        <w:t>Fixed crash when changing the magnetic variation after loading a previously saved QRev file.</w:t>
       </w:r>
     </w:p>
     <w:p>
@@ -1150,15 +881,7 @@
         <w:ind w:left="720" w:hanging="360"/>
       </w:pPr>
       <w:r>
-        <w:t xml:space="preserve">Fix crash resulting from </w:t>
-      </w:r>
-      <w:proofErr w:type="spellStart"/>
-      <w:r>
-        <w:t>NaN</w:t>
-      </w:r>
-      <w:proofErr w:type="spellEnd"/>
-      <w:r>
-        <w:t xml:space="preserve"> values in BT data for GPS class. </w:t>
+        <w:t xml:space="preserve">Fix crash resulting from NaN values in BT data for GPS class. </w:t>
       </w:r>
     </w:p>
     <w:p>
@@ -1171,23 +894,7 @@
         <w:ind w:left="720" w:hanging="360"/>
       </w:pPr>
       <w:r>
-        <w:t xml:space="preserve">Fix crash resulting from loading old </w:t>
-      </w:r>
-      <w:proofErr w:type="spellStart"/>
-      <w:r>
-        <w:t>QRev</w:t>
-      </w:r>
-      <w:proofErr w:type="spellEnd"/>
-      <w:r>
-        <w:t xml:space="preserve"> files missing setting </w:t>
-      </w:r>
-      <w:proofErr w:type="spellStart"/>
-      <w:r>
-        <w:t>dict</w:t>
-      </w:r>
-      <w:proofErr w:type="spellEnd"/>
-      <w:r>
-        <w:t xml:space="preserve"> in mat file. </w:t>
+        <w:t xml:space="preserve">Fix crash resulting from loading old QRev files missing setting dict in mat file. </w:t>
       </w:r>
     </w:p>
     <w:p>
@@ -1277,23 +984,8 @@
         </w:numPr>
       </w:pPr>
       <w:r>
-        <w:t xml:space="preserve">Modified </w:t>
-      </w:r>
-      <w:proofErr w:type="spellStart"/>
-      <w:r>
-        <w:t>extrap</w:t>
-      </w:r>
-      <w:proofErr w:type="spellEnd"/>
-      <w:r>
-        <w:t xml:space="preserve"> subsection so that </w:t>
-      </w:r>
-      <w:proofErr w:type="spellStart"/>
-      <w:r>
-        <w:t>subsectioning</w:t>
-      </w:r>
-      <w:proofErr w:type="spellEnd"/>
-      <w:r>
-        <w:t xml:space="preserve"> always works from left to right</w:t>
+        <w:lastRenderedPageBreak/>
+        <w:t>Modified extrap subsection so that subsectioning always works from left to right</w:t>
       </w:r>
     </w:p>
     <w:p>
@@ -1305,15 +997,7 @@
         </w:numPr>
       </w:pPr>
       <w:r>
-        <w:t xml:space="preserve">Removed depth from </w:t>
-      </w:r>
-      <w:proofErr w:type="spellStart"/>
-      <w:r>
-        <w:t>Oursin</w:t>
-      </w:r>
-      <w:proofErr w:type="spellEnd"/>
-      <w:r>
-        <w:t xml:space="preserve"> measured discharge uncertainty</w:t>
+        <w:t>Removed depth from Oursin measured discharge uncertainty</w:t>
       </w:r>
     </w:p>
     <w:p>
@@ -1336,14 +1020,8 @@
           <w:numId w:val="22"/>
         </w:numPr>
       </w:pPr>
-      <w:proofErr w:type="spellStart"/>
-      <w:r>
-        <w:lastRenderedPageBreak/>
-        <w:t>Extrap</w:t>
-      </w:r>
-      <w:proofErr w:type="spellEnd"/>
-      <w:r>
-        <w:t xml:space="preserve"> subsection label changes based on data loaded and processed.</w:t>
+      <w:r>
+        <w:t>Extrap subsection label changes based on data loaded and processed.</w:t>
       </w:r>
     </w:p>
     <w:p>
@@ -1391,15 +1069,7 @@
         </w:numPr>
       </w:pPr>
       <w:r>
-        <w:t xml:space="preserve">Fix bug with loading data collected with a PDA and </w:t>
-      </w:r>
-      <w:proofErr w:type="spellStart"/>
-      <w:r>
-        <w:t>streampro</w:t>
-      </w:r>
-      <w:proofErr w:type="spellEnd"/>
-      <w:r>
-        <w:t>.</w:t>
+        <w:t>Fix bug with loading data collected with a PDA and streampro.</w:t>
       </w:r>
     </w:p>
     <w:p>
@@ -1456,15 +1126,7 @@
         </w:numPr>
       </w:pPr>
       <w:r>
-        <w:t xml:space="preserve">Fixed bug reading some old </w:t>
-      </w:r>
-      <w:proofErr w:type="spellStart"/>
-      <w:r>
-        <w:t>QRev.mat</w:t>
-      </w:r>
-      <w:proofErr w:type="spellEnd"/>
-      <w:r>
-        <w:t xml:space="preserve"> files associated with new rating feature</w:t>
+        <w:t>Fixed bug reading some old QRev.mat files associated with new rating feature</w:t>
       </w:r>
     </w:p>
     <w:p>
@@ -1503,15 +1165,7 @@
         </w:numPr>
       </w:pPr>
       <w:r>
-        <w:t xml:space="preserve">Fixed issue with depth reference </w:t>
-      </w:r>
-      <w:proofErr w:type="gramStart"/>
-      <w:r>
-        <w:t>drop</w:t>
-      </w:r>
-      <w:proofErr w:type="gramEnd"/>
-      <w:r>
-        <w:t xml:space="preserve"> down </w:t>
+        <w:t xml:space="preserve">Fixed issue with depth reference drop down </w:t>
       </w:r>
       <w:r>
         <w:t xml:space="preserve">menu </w:t>
@@ -1565,15 +1219,7 @@
         </w:numPr>
       </w:pPr>
       <w:r>
-        <w:t>Fixed bug reading *_</w:t>
-      </w:r>
-      <w:proofErr w:type="spellStart"/>
-      <w:r>
-        <w:t>QRev.mat</w:t>
-      </w:r>
-      <w:proofErr w:type="spellEnd"/>
-      <w:r>
-        <w:t xml:space="preserve"> having only 1 transect</w:t>
+        <w:t>Fixed bug reading *_QRev.mat having only 1 transect</w:t>
       </w:r>
     </w:p>
     <w:p>
@@ -1600,13 +1246,8 @@
         <w:t xml:space="preserve">Fixed issue </w:t>
       </w:r>
       <w:r>
-        <w:t>that could occur when processing moving-bed tests loaded from *_</w:t>
-      </w:r>
-      <w:proofErr w:type="spellStart"/>
-      <w:r>
-        <w:t>QRev.mat</w:t>
-      </w:r>
-      <w:proofErr w:type="spellEnd"/>
+        <w:t>that could occur when processing moving-bed tests loaded from *_QRev.mat</w:t>
+      </w:r>
     </w:p>
     <w:p>
       <w:pPr>
@@ -1670,15 +1311,7 @@
         </w:numPr>
       </w:pPr>
       <w:r>
-        <w:t xml:space="preserve">Applying </w:t>
-      </w:r>
-      <w:proofErr w:type="spellStart"/>
-      <w:r>
-        <w:t>magvar</w:t>
-      </w:r>
-      <w:proofErr w:type="spellEnd"/>
-      <w:r>
-        <w:t xml:space="preserve"> or heading offset or heading source changes to all transects applies them to moving-bed test also</w:t>
+        <w:t>Applying magvar or heading offset or heading source changes to all transects applies them to moving-bed test also</w:t>
       </w:r>
     </w:p>
     <w:p>
@@ -1750,15 +1383,7 @@
         </w:numPr>
       </w:pPr>
       <w:r>
-        <w:t xml:space="preserve">Added support for user edge discharge for </w:t>
-      </w:r>
-      <w:proofErr w:type="spellStart"/>
-      <w:r>
-        <w:t>WinRiver</w:t>
-      </w:r>
-      <w:proofErr w:type="spellEnd"/>
-      <w:r>
-        <w:t xml:space="preserve"> II 2.22</w:t>
+        <w:t>Added support for user edge discharge for WinRiver II 2.22</w:t>
       </w:r>
     </w:p>
     <w:p>
@@ -1769,13 +1394,8 @@
           <w:numId w:val="20"/>
         </w:numPr>
       </w:pPr>
-      <w:proofErr w:type="gramStart"/>
-      <w:r>
-        <w:t>“.mat</w:t>
-      </w:r>
-      <w:proofErr w:type="gramEnd"/>
-      <w:r>
-        <w:t>” is always appended as suffix to saved QRev file</w:t>
+      <w:r>
+        <w:t>“.mat” is always appended as suffix to saved QRev file</w:t>
       </w:r>
     </w:p>
     <w:p>
@@ -1787,29 +1407,8 @@
         </w:numPr>
       </w:pPr>
       <w:r>
-        <w:t xml:space="preserve">Manual threshold for </w:t>
-      </w:r>
-      <w:proofErr w:type="spellStart"/>
-      <w:r>
-        <w:t>wt</w:t>
-      </w:r>
-      <w:proofErr w:type="spellEnd"/>
-      <w:r>
-        <w:t xml:space="preserve"> and </w:t>
-      </w:r>
-      <w:proofErr w:type="spellStart"/>
-      <w:r>
-        <w:t>bt</w:t>
-      </w:r>
-      <w:proofErr w:type="spellEnd"/>
-      <w:r>
-        <w:t xml:space="preserve"> saved and displayed when opening *_</w:t>
-      </w:r>
-      <w:proofErr w:type="spellStart"/>
-      <w:r>
-        <w:t>QRev.mat</w:t>
-      </w:r>
-      <w:proofErr w:type="spellEnd"/>
+        <w:t>Manual threshold for wt and bt saved and displayed when opening *_QRev.mat</w:t>
+      </w:r>
     </w:p>
     <w:p>
       <w:pPr>
@@ -1874,15 +1473,7 @@
         </w:numPr>
       </w:pPr>
       <w:r>
-        <w:t xml:space="preserve">Added notification when </w:t>
-      </w:r>
-      <w:proofErr w:type="spellStart"/>
-      <w:r>
-        <w:t>SonTek</w:t>
-      </w:r>
-      <w:proofErr w:type="spellEnd"/>
-      <w:r>
-        <w:t xml:space="preserve"> data is loaded with other than Earth coordinates</w:t>
+        <w:t>Added notification when SonTek data is loaded with other than Earth coordinates</w:t>
       </w:r>
     </w:p>
     <w:p>
@@ -1906,6 +1497,7 @@
         </w:numPr>
       </w:pPr>
       <w:r>
+        <w:lastRenderedPageBreak/>
         <w:t>Fixed issue in EDI if no GPS data are available</w:t>
       </w:r>
     </w:p>
@@ -2149,15 +1741,7 @@
         </w:numPr>
       </w:pPr>
       <w:r>
-        <w:t xml:space="preserve">Fixed issue with </w:t>
-      </w:r>
-      <w:proofErr w:type="spellStart"/>
-      <w:r>
-        <w:t>shiptrack</w:t>
-      </w:r>
-      <w:proofErr w:type="spellEnd"/>
-      <w:r>
-        <w:t xml:space="preserve"> when all GPS data are invalid</w:t>
+        <w:t>Fixed issue with shiptrack when all GPS data are invalid</w:t>
       </w:r>
     </w:p>
     <w:p>
@@ -2242,15 +1826,7 @@
         </w:numPr>
       </w:pPr>
       <w:r>
-        <w:t xml:space="preserve">Ported code from </w:t>
-      </w:r>
-      <w:proofErr w:type="spellStart"/>
-      <w:r>
-        <w:t>Matlab</w:t>
-      </w:r>
-      <w:proofErr w:type="spellEnd"/>
-      <w:r>
-        <w:t xml:space="preserve"> to Python</w:t>
+        <w:t>Ported code from Matlab to Python</w:t>
       </w:r>
     </w:p>
     <w:p>
@@ -2262,13 +1838,8 @@
         </w:numPr>
       </w:pPr>
       <w:r>
-        <w:t xml:space="preserve">User interface redesigned using </w:t>
-      </w:r>
-      <w:proofErr w:type="spellStart"/>
-      <w:r>
-        <w:t>PyQt</w:t>
-      </w:r>
-      <w:proofErr w:type="spellEnd"/>
+        <w:t>User interface redesigned using PyQt</w:t>
+      </w:r>
     </w:p>
     <w:p>
       <w:pPr>
@@ -2279,15 +1850,7 @@
         </w:numPr>
       </w:pPr>
       <w:r>
-        <w:t xml:space="preserve">Main summary page includes contour, </w:t>
-      </w:r>
-      <w:proofErr w:type="spellStart"/>
-      <w:r>
-        <w:t>shiptrack</w:t>
-      </w:r>
-      <w:proofErr w:type="spellEnd"/>
-      <w:r>
-        <w:t>, and discharge time series graphics</w:t>
+        <w:t>Main summary page includes contour, shiptrack, and discharge time series graphics</w:t>
       </w:r>
     </w:p>
     <w:p>
@@ -2374,15 +1937,7 @@
         <w:t>F</w:t>
       </w:r>
       <w:r>
-        <w:t xml:space="preserve">ixed bug in </w:t>
-      </w:r>
-      <w:proofErr w:type="spellStart"/>
-      <w:r>
-        <w:t>vtg</w:t>
-      </w:r>
-      <w:proofErr w:type="spellEnd"/>
-      <w:r>
-        <w:t xml:space="preserve"> primary composite tracks, wasn't substituting GGA</w:t>
+        <w:t>ixed bug in vtg primary composite tracks, wasn't substituting GGA</w:t>
       </w:r>
     </w:p>
     <w:p>
@@ -2406,13 +1961,8 @@
         </w:numPr>
       </w:pPr>
       <w:r>
-        <w:t xml:space="preserve">Statistics and interpolation methods in Python may result in small differences from </w:t>
-      </w:r>
-      <w:proofErr w:type="spellStart"/>
-      <w:r>
-        <w:t>Matlab</w:t>
-      </w:r>
-      <w:proofErr w:type="spellEnd"/>
+        <w:t>Statistics and interpolation methods in Python may result in small differences from Matlab</w:t>
+      </w:r>
     </w:p>
     <w:p>
       <w:pPr>
@@ -2438,15 +1988,8 @@
         </w:numPr>
       </w:pPr>
       <w:r>
-        <w:t xml:space="preserve">Fixed bug that did not properly identify missing (lost) ensembles if the typical ensemble duration was greater than 1.5 sec. This affected mode 13 </w:t>
-      </w:r>
-      <w:proofErr w:type="spellStart"/>
-      <w:r>
-        <w:t>StreamPro</w:t>
-      </w:r>
-      <w:proofErr w:type="spellEnd"/>
-      <w:r>
-        <w:t xml:space="preserve"> data.</w:t>
+        <w:lastRenderedPageBreak/>
+        <w:t>Fixed bug that did not properly identify missing (lost) ensembles if the typical ensemble duration was greater than 1.5 sec. This affected mode 13 StreamPro data.</w:t>
       </w:r>
     </w:p>
     <w:p>
@@ -2461,7 +2004,6 @@
           <w:b/>
           <w:bCs/>
         </w:rPr>
-        <w:lastRenderedPageBreak/>
         <w:t>Changes 3.41 to 3.42</w:t>
       </w:r>
     </w:p>
@@ -2501,15 +2043,7 @@
         </w:numPr>
       </w:pPr>
       <w:r>
-        <w:t xml:space="preserve">Fixed bug with discharge percent </w:t>
-      </w:r>
-      <w:proofErr w:type="gramStart"/>
-      <w:r>
-        <w:t>change</w:t>
-      </w:r>
-      <w:proofErr w:type="gramEnd"/>
-      <w:r>
-        <w:t xml:space="preserve"> not updating after multiple speed of sound changes.</w:t>
+        <w:t>Fixed bug with discharge percent change not updating after multiple speed of sound changes.</w:t>
       </w:r>
     </w:p>
     <w:p>
@@ -2533,23 +2067,7 @@
         </w:numPr>
       </w:pPr>
       <w:r>
-        <w:t xml:space="preserve">Fixed bug in edges </w:t>
-      </w:r>
-      <w:proofErr w:type="spellStart"/>
-      <w:r>
-        <w:t>shiptrack</w:t>
-      </w:r>
-      <w:proofErr w:type="spellEnd"/>
-      <w:r>
-        <w:t xml:space="preserve"> so it only displays valid </w:t>
-      </w:r>
-      <w:proofErr w:type="spellStart"/>
-      <w:r>
-        <w:t>orginal</w:t>
-      </w:r>
-      <w:proofErr w:type="spellEnd"/>
-      <w:r>
-        <w:t xml:space="preserve"> data and not interpolated data.</w:t>
+        <w:t>Fixed bug in edges shiptrack so it only displays valid orginal data and not interpolated data.</w:t>
       </w:r>
     </w:p>
     <w:p>
@@ -2636,15 +2154,7 @@
         </w:numPr>
       </w:pPr>
       <w:r>
-        <w:t xml:space="preserve">XML file now only contains the summary information from a </w:t>
-      </w:r>
-      <w:proofErr w:type="spellStart"/>
-      <w:r>
-        <w:t>SonTek</w:t>
-      </w:r>
-      <w:proofErr w:type="spellEnd"/>
-      <w:r>
-        <w:t xml:space="preserve"> compass calibration.</w:t>
+        <w:t>XML file now only contains the summary information from a SonTek compass calibration.</w:t>
       </w:r>
     </w:p>
     <w:p>
@@ -2668,15 +2178,7 @@
         </w:numPr>
       </w:pPr>
       <w:r>
-        <w:t xml:space="preserve">Added message for missing samples in </w:t>
-      </w:r>
-      <w:proofErr w:type="spellStart"/>
-      <w:r>
-        <w:t>SonTek</w:t>
-      </w:r>
-      <w:proofErr w:type="spellEnd"/>
-      <w:r>
-        <w:t xml:space="preserve"> data.</w:t>
+        <w:t>Added message for missing samples in SonTek data.</w:t>
       </w:r>
     </w:p>
     <w:p>
@@ -2700,15 +2202,7 @@
         </w:numPr>
       </w:pPr>
       <w:r>
-        <w:t xml:space="preserve">Added check to boat and </w:t>
-      </w:r>
-      <w:proofErr w:type="spellStart"/>
-      <w:r>
-        <w:t>wt</w:t>
-      </w:r>
-      <w:proofErr w:type="spellEnd"/>
-      <w:r>
-        <w:t xml:space="preserve"> to check warn if all data are invalid.</w:t>
+        <w:t>Added check to boat and wt to check warn if all data are invalid.</w:t>
       </w:r>
     </w:p>
     <w:p>
@@ -2768,15 +2262,7 @@
         </w:numPr>
       </w:pPr>
       <w:r>
-        <w:t xml:space="preserve">Added upper limit of 45 ppt to </w:t>
-      </w:r>
-      <w:proofErr w:type="spellStart"/>
-      <w:r>
-        <w:t>salinty</w:t>
-      </w:r>
-      <w:proofErr w:type="spellEnd"/>
-      <w:r>
-        <w:t xml:space="preserve"> input dialog.</w:t>
+        <w:t>Added upper limit of 45 ppt to salinty input dialog.</w:t>
       </w:r>
     </w:p>
     <w:p>
@@ -2854,15 +2340,7 @@
         </w:numPr>
       </w:pPr>
       <w:r>
-        <w:t xml:space="preserve">Fixed bug causing 25 cm excluded distance to be applied to </w:t>
-      </w:r>
-      <w:proofErr w:type="spellStart"/>
-      <w:r>
-        <w:t>RiverPro</w:t>
-      </w:r>
-      <w:proofErr w:type="spellEnd"/>
-      <w:r>
-        <w:t xml:space="preserve"> data.</w:t>
+        <w:t>Fixed bug causing 25 cm excluded distance to be applied to RiverPro data.</w:t>
       </w:r>
     </w:p>
     <w:p>
@@ -2949,31 +2427,8 @@
         </w:numPr>
       </w:pPr>
       <w:r>
-        <w:t xml:space="preserve">Fixed bug causing changes in draft </w:t>
-      </w:r>
-      <w:proofErr w:type="spellStart"/>
-      <w:r>
-        <w:t>hOffset</w:t>
-      </w:r>
-      <w:proofErr w:type="spellEnd"/>
-      <w:r>
-        <w:t xml:space="preserve">, </w:t>
-      </w:r>
-      <w:proofErr w:type="spellStart"/>
-      <w:r>
-        <w:t>hSource</w:t>
-      </w:r>
-      <w:proofErr w:type="spellEnd"/>
-      <w:r>
-        <w:t xml:space="preserve">, and </w:t>
-      </w:r>
-      <w:proofErr w:type="spellStart"/>
-      <w:r>
-        <w:t>magVar</w:t>
-      </w:r>
-      <w:proofErr w:type="spellEnd"/>
-      <w:r>
-        <w:t xml:space="preserve"> to not update QA properly</w:t>
+        <w:lastRenderedPageBreak/>
+        <w:t>Fixed bug causing changes in draft hOffset, hSource, and magVar to not update QA properly</w:t>
       </w:r>
     </w:p>
     <w:p>
@@ -3000,7 +2455,6 @@
         </w:numPr>
       </w:pPr>
       <w:r>
-        <w:lastRenderedPageBreak/>
         <w:t>Fixed bug creating structure for test results from existing QRev files</w:t>
       </w:r>
     </w:p>
@@ -3196,15 +2650,7 @@
         </w:numPr>
       </w:pPr>
       <w:r>
-        <w:t xml:space="preserve">Modified code in the way that TRDI </w:t>
-      </w:r>
-      <w:proofErr w:type="spellStart"/>
-      <w:r>
-        <w:t>mmt</w:t>
-      </w:r>
-      <w:proofErr w:type="spellEnd"/>
-      <w:r>
-        <w:t xml:space="preserve"> file setting for composite depths are processed to QRev settings. </w:t>
+        <w:t xml:space="preserve">Modified code in the way that TRDI mmt file setting for composite depths are processed to QRev settings. </w:t>
       </w:r>
     </w:p>
     <w:p>
@@ -3240,15 +2686,7 @@
         </w:numPr>
       </w:pPr>
       <w:r>
-        <w:t xml:space="preserve">Fixed bug with </w:t>
-      </w:r>
-      <w:proofErr w:type="spellStart"/>
-      <w:r>
-        <w:t>computePerDiff</w:t>
-      </w:r>
-      <w:proofErr w:type="spellEnd"/>
-      <w:r>
-        <w:t xml:space="preserve"> in extrapolation sensitivity when no transect data provided.</w:t>
+        <w:t>Fixed bug with computePerDiff in extrapolation sensitivity when no transect data provided.</w:t>
       </w:r>
     </w:p>
     <w:p>
@@ -3272,15 +2710,7 @@
         </w:numPr>
       </w:pPr>
       <w:r>
-        <w:t xml:space="preserve">Added code to check compass </w:t>
-      </w:r>
-      <w:proofErr w:type="spellStart"/>
-      <w:r>
-        <w:t>cal</w:t>
-      </w:r>
-      <w:proofErr w:type="spellEnd"/>
-      <w:r>
-        <w:t xml:space="preserve"> errors against USGS recommendations</w:t>
+        <w:t>Added code to check compass cal errors against USGS recommendations</w:t>
       </w:r>
     </w:p>
     <w:p>
@@ -3292,15 +2722,7 @@
         </w:numPr>
       </w:pPr>
       <w:r>
-        <w:t xml:space="preserve">Added code to handle files processed with </w:t>
-      </w:r>
-      <w:proofErr w:type="spellStart"/>
-      <w:r>
-        <w:t>QBatch</w:t>
-      </w:r>
-      <w:proofErr w:type="spellEnd"/>
-      <w:r>
-        <w:t>.</w:t>
+        <w:t>Added code to handle files processed with QBatch.</w:t>
       </w:r>
     </w:p>
     <w:p>
@@ -3365,6 +2787,7 @@
         </w:numPr>
       </w:pPr>
       <w:r>
+        <w:lastRenderedPageBreak/>
         <w:t>Clicking on a message will open the associated window, same as clicking on associated button.</w:t>
       </w:r>
     </w:p>
@@ -3389,7 +2812,6 @@
         </w:numPr>
       </w:pPr>
       <w:r>
-        <w:lastRenderedPageBreak/>
         <w:t>Clicking a row in the extrapolation discharge sensitivity table will set the fit to those parameters.</w:t>
       </w:r>
     </w:p>
@@ -3402,15 +2824,7 @@
         </w:numPr>
       </w:pPr>
       <w:r>
-        <w:t xml:space="preserve">The compass error from the evaluation of a TRDI ADCP and if available, from </w:t>
-      </w:r>
-      <w:proofErr w:type="spellStart"/>
-      <w:r>
-        <w:t>RiverSurveyor</w:t>
-      </w:r>
-      <w:proofErr w:type="spellEnd"/>
-      <w:r>
-        <w:t xml:space="preserve"> G3 compass is now shown in the Compass/P/R window.</w:t>
+        <w:t>The compass error from the evaluation of a TRDI ADCP and if available, from RiverSurveyor G3 compass is now shown in the Compass/P/R window.</w:t>
       </w:r>
     </w:p>
     <w:p>
@@ -3458,23 +2872,7 @@
         </w:numPr>
       </w:pPr>
       <w:r>
-        <w:t xml:space="preserve">A bug which applied both the </w:t>
-      </w:r>
-      <w:proofErr w:type="spellStart"/>
-      <w:r>
-        <w:t>magvar</w:t>
-      </w:r>
-      <w:proofErr w:type="spellEnd"/>
-      <w:r>
-        <w:t xml:space="preserve"> and heading offset to all compass data when loading has been fixed. Now the </w:t>
-      </w:r>
-      <w:proofErr w:type="spellStart"/>
-      <w:r>
-        <w:t>magvar</w:t>
-      </w:r>
-      <w:proofErr w:type="spellEnd"/>
-      <w:r>
-        <w:t xml:space="preserve"> is only applied to the internal compass and the heading offset only applied to the external compass. This is consistent with how it was handled in the Compass/P/R window.</w:t>
+        <w:t>A bug which applied both the magvar and heading offset to all compass data when loading has been fixed. Now the magvar is only applied to the internal compass and the heading offset only applied to the external compass. This is consistent with how it was handled in the Compass/P/R window.</w:t>
       </w:r>
     </w:p>
     <w:p>
@@ -3564,15 +2962,7 @@
         </w:numPr>
       </w:pPr>
       <w:r>
-        <w:t xml:space="preserve">Improved the handling of illegal xml characters in </w:t>
-      </w:r>
-      <w:proofErr w:type="spellStart"/>
-      <w:r>
-        <w:t>mmt</w:t>
-      </w:r>
-      <w:proofErr w:type="spellEnd"/>
-      <w:r>
-        <w:t xml:space="preserve"> file.</w:t>
+        <w:t>Improved the handling of illegal xml characters in mmt file.</w:t>
       </w:r>
     </w:p>
     <w:p>
@@ -3596,15 +2986,7 @@
         </w:numPr>
       </w:pPr>
       <w:r>
-        <w:t xml:space="preserve">Changed the QA check for number of valid ensembles to a </w:t>
-      </w:r>
-      <w:proofErr w:type="gramStart"/>
-      <w:r>
-        <w:t>duration based</w:t>
-      </w:r>
-      <w:proofErr w:type="gramEnd"/>
-      <w:r>
-        <w:t xml:space="preserve"> check for stationary moving-bed test.</w:t>
+        <w:t>Changed the QA check for number of valid ensembles to a duration based check for stationary moving-bed test.</w:t>
       </w:r>
     </w:p>
     <w:p>
@@ -3703,15 +3085,7 @@
         </w:numPr>
       </w:pPr>
       <w:r>
-        <w:t xml:space="preserve">Fixed issue with UTC time from GGA which contained an invalid character causing the str2double function resulting in </w:t>
-      </w:r>
-      <w:proofErr w:type="spellStart"/>
-      <w:r>
-        <w:t>NaN</w:t>
-      </w:r>
-      <w:proofErr w:type="spellEnd"/>
-      <w:r>
-        <w:t>.</w:t>
+        <w:t>Fixed issue with UTC time from GGA which contained an invalid character causing the str2double function resulting in NaN.</w:t>
       </w:r>
     </w:p>
     <w:p>
@@ -3723,29 +3097,8 @@
         </w:numPr>
       </w:pPr>
       <w:r>
-        <w:t xml:space="preserve">Added fix for invalid </w:t>
-      </w:r>
-      <w:proofErr w:type="spellStart"/>
-      <w:r>
-        <w:t>prefPath</w:t>
-      </w:r>
-      <w:proofErr w:type="spellEnd"/>
-      <w:r>
-        <w:t xml:space="preserve"> from corrupt </w:t>
-      </w:r>
-      <w:proofErr w:type="spellStart"/>
-      <w:r>
-        <w:t>AppData</w:t>
-      </w:r>
-      <w:proofErr w:type="spellEnd"/>
-      <w:r>
-        <w:t>/Local/</w:t>
-      </w:r>
-      <w:proofErr w:type="spellStart"/>
-      <w:r>
-        <w:t>QRev</w:t>
-      </w:r>
-      <w:proofErr w:type="spellEnd"/>
+        <w:t>Added fix for invalid prefPath from corrupt AppData/Local/QRev</w:t>
+      </w:r>
     </w:p>
     <w:p>
       <w:pPr>
@@ -3756,23 +3109,7 @@
         </w:numPr>
       </w:pPr>
       <w:r>
-        <w:t xml:space="preserve">Added code to reset the close option from </w:t>
-      </w:r>
-      <w:proofErr w:type="spellStart"/>
-      <w:r>
-        <w:t>extrap</w:t>
-      </w:r>
-      <w:proofErr w:type="spellEnd"/>
-      <w:r>
-        <w:t xml:space="preserve"> to the main window when </w:t>
-      </w:r>
-      <w:proofErr w:type="spellStart"/>
-      <w:r>
-        <w:t>extrap</w:t>
-      </w:r>
-      <w:proofErr w:type="spellEnd"/>
-      <w:r>
-        <w:t xml:space="preserve"> is closed.</w:t>
+        <w:t>Added code to reset the close option from extrap to the main window when extrap is closed.</w:t>
       </w:r>
     </w:p>
     <w:p>
@@ -3832,6 +3169,7 @@
         </w:numPr>
       </w:pPr>
       <w:r>
+        <w:lastRenderedPageBreak/>
         <w:t>Change version to 3.23</w:t>
       </w:r>
     </w:p>
@@ -3859,7 +3197,6 @@
         </w:numPr>
       </w:pPr>
       <w:r>
-        <w:lastRenderedPageBreak/>
         <w:t>Update help to add pdf file which can be searched.</w:t>
       </w:r>
     </w:p>
@@ -4004,39 +3341,7 @@
         </w:numPr>
       </w:pPr>
       <w:r>
-        <w:t xml:space="preserve">In the </w:t>
-      </w:r>
-      <w:proofErr w:type="spellStart"/>
-      <w:r>
-        <w:t>extrap</w:t>
-      </w:r>
-      <w:proofErr w:type="spellEnd"/>
-      <w:r>
-        <w:t xml:space="preserve"> window, added message to user that they need to set Fit to manual if </w:t>
-      </w:r>
-      <w:proofErr w:type="spellStart"/>
-      <w:r>
-        <w:t>the</w:t>
-      </w:r>
-      <w:proofErr w:type="spellEnd"/>
-      <w:r>
-        <w:t xml:space="preserve"> want to use an automatically </w:t>
-      </w:r>
-      <w:proofErr w:type="spellStart"/>
-      <w:r>
-        <w:t>opitimized</w:t>
-      </w:r>
-      <w:proofErr w:type="spellEnd"/>
-      <w:r>
-        <w:t xml:space="preserve"> </w:t>
-      </w:r>
-      <w:proofErr w:type="gramStart"/>
-      <w:r>
-        <w:t>fit</w:t>
-      </w:r>
-      <w:proofErr w:type="gramEnd"/>
-      <w:r>
-        <w:t xml:space="preserve"> but they have change the threshold, subsection, or data type.</w:t>
+        <w:t>In the extrap window, added message to user that they need to set Fit to manual if the want to use an automatically opitimized fit but they have change the threshold, subsection, or data type.</w:t>
       </w:r>
     </w:p>
     <w:p>
@@ -4111,15 +3416,7 @@
         </w:numPr>
       </w:pPr>
       <w:r>
-        <w:t xml:space="preserve">Fixed bug where </w:t>
-      </w:r>
-      <w:proofErr w:type="spellStart"/>
-      <w:r>
-        <w:t>magError</w:t>
-      </w:r>
-      <w:proofErr w:type="spellEnd"/>
-      <w:r>
-        <w:t xml:space="preserve"> and GPS heading were saved as column vector rather than row vector</w:t>
+        <w:t>Fixed bug where magError and GPS heading were saved as column vector rather than row vector</w:t>
       </w:r>
     </w:p>
     <w:p>
@@ -4143,15 +3440,7 @@
         </w:numPr>
       </w:pPr>
       <w:r>
-        <w:t xml:space="preserve">Improved scaling for </w:t>
-      </w:r>
-      <w:proofErr w:type="spellStart"/>
-      <w:r>
-        <w:t>magError</w:t>
-      </w:r>
-      <w:proofErr w:type="spellEnd"/>
-      <w:r>
-        <w:t xml:space="preserve"> and pitch and roll, 2) linked x axes of top and bottom plots</w:t>
+        <w:t>Improved scaling for magError and pitch and roll, 2) linked x axes of top and bottom plots</w:t>
       </w:r>
     </w:p>
     <w:p>
@@ -4163,23 +3452,7 @@
         </w:numPr>
       </w:pPr>
       <w:r>
-        <w:t xml:space="preserve">Added code to add </w:t>
-      </w:r>
-      <w:proofErr w:type="spellStart"/>
-      <w:r>
-        <w:t>qTotalCaution</w:t>
-      </w:r>
-      <w:proofErr w:type="spellEnd"/>
-      <w:r>
-        <w:t xml:space="preserve"> to older </w:t>
-      </w:r>
-      <w:proofErr w:type="spellStart"/>
-      <w:r>
-        <w:t>QRev</w:t>
-      </w:r>
-      <w:proofErr w:type="spellEnd"/>
-      <w:r>
-        <w:t xml:space="preserve"> files</w:t>
+        <w:t>Added code to add qTotalCaution to older QRev files</w:t>
       </w:r>
     </w:p>
     <w:p>
@@ -4191,15 +3464,7 @@
         </w:numPr>
       </w:pPr>
       <w:r>
-        <w:t xml:space="preserve">Fixed bug when there is no pitch and roll data (old </w:t>
-      </w:r>
-      <w:proofErr w:type="spellStart"/>
-      <w:r>
-        <w:t>SonTek</w:t>
-      </w:r>
-      <w:proofErr w:type="spellEnd"/>
-      <w:r>
-        <w:t xml:space="preserve"> files)</w:t>
+        <w:t>Fixed bug when there is no pitch and roll data (old SonTek files)</w:t>
       </w:r>
     </w:p>
     <w:p>
@@ -4223,15 +3488,7 @@
         </w:numPr>
       </w:pPr>
       <w:r>
-        <w:t xml:space="preserve">Fixed bug when loading QRev files from 2.9x by adding code to create the </w:t>
-      </w:r>
-      <w:proofErr w:type="spellStart"/>
-      <w:r>
-        <w:t>qTotalCaution</w:t>
-      </w:r>
-      <w:proofErr w:type="spellEnd"/>
-      <w:r>
-        <w:t xml:space="preserve"> field</w:t>
+        <w:t>Fixed bug when loading QRev files from 2.9x by adding code to create the qTotalCaution field</w:t>
       </w:r>
     </w:p>
     <w:p>
@@ -4266,13 +3523,8 @@
           <w:numId w:val="14"/>
         </w:numPr>
       </w:pPr>
-      <w:proofErr w:type="spellStart"/>
-      <w:r>
-        <w:t>kml</w:t>
-      </w:r>
-      <w:proofErr w:type="spellEnd"/>
-      <w:r>
-        <w:t xml:space="preserve"> Google earth file now plots the full transect filename</w:t>
+      <w:r>
+        <w:t>kml Google earth file now plots the full transect filename</w:t>
       </w:r>
     </w:p>
     <w:p>
@@ -4308,13 +3560,8 @@
         </w:numPr>
       </w:pPr>
       <w:r>
-        <w:t xml:space="preserve">Fixed bug preventing automatic excluded distance for </w:t>
-      </w:r>
-      <w:proofErr w:type="spellStart"/>
-      <w:r>
-        <w:t>RioPro</w:t>
-      </w:r>
-      <w:proofErr w:type="spellEnd"/>
+        <w:t>Fixed bug preventing automatic excluded distance for RioPro</w:t>
+      </w:r>
     </w:p>
     <w:p>
       <w:pPr>
@@ -4349,15 +3596,7 @@
         </w:numPr>
       </w:pPr>
       <w:r>
-        <w:t xml:space="preserve">Fixed bug applying user specified edge Q in </w:t>
-      </w:r>
-      <w:proofErr w:type="spellStart"/>
-      <w:r>
-        <w:t>RiverSurveyor</w:t>
-      </w:r>
-      <w:proofErr w:type="spellEnd"/>
-      <w:r>
-        <w:t xml:space="preserve"> Live</w:t>
+        <w:t>Fixed bug applying user specified edge Q in RiverSurveyor Live</w:t>
       </w:r>
     </w:p>
     <w:p>
@@ -4405,7 +3644,7 @@
         <v:path o:extrusionok="f" gradientshapeok="t" o:connecttype="rect"/>
         <o:lock v:ext="edit" aspectratio="t"/>
       </v:shapetype>
-      <v:shape id="_x0000_i1067" type="#_x0000_t75" alt="A close up of a logo&#10;&#10;Description automatically generated" style="width:35.3pt;height:35.3pt;visibility:visible;mso-wrap-style:square" o:bullet="t">
+      <v:shape id="_x0000_i1080" type="#_x0000_t75" alt="A close up of a logo&#10;&#10;Description automatically generated" style="width:35.25pt;height:35.25pt;visibility:visible;mso-wrap-style:square" o:bullet="t">
         <v:imagedata r:id="rId1" o:title="A close up of a logo&#10;&#10;Description automatically generated"/>
       </v:shape>
     </w:pict>
@@ -5025,6 +4264,92 @@
     </w:lvl>
   </w:abstractNum>
   <w:abstractNum w:abstractNumId="7" w15:restartNumberingAfterBreak="0">
+    <w:nsid w:val="17752907"/>
+    <w:multiLevelType w:val="hybridMultilevel"/>
+    <w:tmpl w:val="5F187B7C"/>
+    <w:lvl w:ilvl="0" w:tplc="0409000F">
+      <w:start w:val="1"/>
+      <w:numFmt w:val="decimal"/>
+      <w:lvlText w:val="%1."/>
+      <w:lvlJc w:val="left"/>
+      <w:pPr>
+        <w:ind w:left="720" w:hanging="360"/>
+      </w:pPr>
+    </w:lvl>
+    <w:lvl w:ilvl="1" w:tplc="04090019" w:tentative="1">
+      <w:start w:val="1"/>
+      <w:numFmt w:val="lowerLetter"/>
+      <w:lvlText w:val="%2."/>
+      <w:lvlJc w:val="left"/>
+      <w:pPr>
+        <w:ind w:left="1440" w:hanging="360"/>
+      </w:pPr>
+    </w:lvl>
+    <w:lvl w:ilvl="2" w:tplc="0409001B" w:tentative="1">
+      <w:start w:val="1"/>
+      <w:numFmt w:val="lowerRoman"/>
+      <w:lvlText w:val="%3."/>
+      <w:lvlJc w:val="right"/>
+      <w:pPr>
+        <w:ind w:left="2160" w:hanging="180"/>
+      </w:pPr>
+    </w:lvl>
+    <w:lvl w:ilvl="3" w:tplc="0409000F" w:tentative="1">
+      <w:start w:val="1"/>
+      <w:numFmt w:val="decimal"/>
+      <w:lvlText w:val="%4."/>
+      <w:lvlJc w:val="left"/>
+      <w:pPr>
+        <w:ind w:left="2880" w:hanging="360"/>
+      </w:pPr>
+    </w:lvl>
+    <w:lvl w:ilvl="4" w:tplc="04090019" w:tentative="1">
+      <w:start w:val="1"/>
+      <w:numFmt w:val="lowerLetter"/>
+      <w:lvlText w:val="%5."/>
+      <w:lvlJc w:val="left"/>
+      <w:pPr>
+        <w:ind w:left="3600" w:hanging="360"/>
+      </w:pPr>
+    </w:lvl>
+    <w:lvl w:ilvl="5" w:tplc="0409001B" w:tentative="1">
+      <w:start w:val="1"/>
+      <w:numFmt w:val="lowerRoman"/>
+      <w:lvlText w:val="%6."/>
+      <w:lvlJc w:val="right"/>
+      <w:pPr>
+        <w:ind w:left="4320" w:hanging="180"/>
+      </w:pPr>
+    </w:lvl>
+    <w:lvl w:ilvl="6" w:tplc="0409000F" w:tentative="1">
+      <w:start w:val="1"/>
+      <w:numFmt w:val="decimal"/>
+      <w:lvlText w:val="%7."/>
+      <w:lvlJc w:val="left"/>
+      <w:pPr>
+        <w:ind w:left="5040" w:hanging="360"/>
+      </w:pPr>
+    </w:lvl>
+    <w:lvl w:ilvl="7" w:tplc="04090019" w:tentative="1">
+      <w:start w:val="1"/>
+      <w:numFmt w:val="lowerLetter"/>
+      <w:lvlText w:val="%8."/>
+      <w:lvlJc w:val="left"/>
+      <w:pPr>
+        <w:ind w:left="5760" w:hanging="360"/>
+      </w:pPr>
+    </w:lvl>
+    <w:lvl w:ilvl="8" w:tplc="0409001B" w:tentative="1">
+      <w:start w:val="1"/>
+      <w:numFmt w:val="lowerRoman"/>
+      <w:lvlText w:val="%9."/>
+      <w:lvlJc w:val="right"/>
+      <w:pPr>
+        <w:ind w:left="6480" w:hanging="180"/>
+      </w:pPr>
+    </w:lvl>
+  </w:abstractNum>
+  <w:abstractNum w:abstractNumId="8" w15:restartNumberingAfterBreak="0">
     <w:nsid w:val="1B8F05A8"/>
     <w:multiLevelType w:val="hybridMultilevel"/>
     <w:tmpl w:val="3856C938"/>
@@ -5113,7 +4438,7 @@
       </w:pPr>
     </w:lvl>
   </w:abstractNum>
-  <w:abstractNum w:abstractNumId="8" w15:restartNumberingAfterBreak="0">
+  <w:abstractNum w:abstractNumId="9" w15:restartNumberingAfterBreak="0">
     <w:nsid w:val="1C146BCC"/>
     <w:multiLevelType w:val="hybridMultilevel"/>
     <w:tmpl w:val="60586804"/>
@@ -5254,7 +4579,7 @@
       </w:rPr>
     </w:lvl>
   </w:abstractNum>
-  <w:abstractNum w:abstractNumId="9" w15:restartNumberingAfterBreak="0">
+  <w:abstractNum w:abstractNumId="10" w15:restartNumberingAfterBreak="0">
     <w:nsid w:val="1E8D2FE1"/>
     <w:multiLevelType w:val="hybridMultilevel"/>
     <w:tmpl w:val="0AB2924A"/>
@@ -5340,7 +4665,7 @@
       </w:pPr>
     </w:lvl>
   </w:abstractNum>
-  <w:abstractNum w:abstractNumId="10" w15:restartNumberingAfterBreak="0">
+  <w:abstractNum w:abstractNumId="11" w15:restartNumberingAfterBreak="0">
     <w:nsid w:val="26605BC4"/>
     <w:multiLevelType w:val="hybridMultilevel"/>
     <w:tmpl w:val="34727F94"/>
@@ -5429,7 +4754,7 @@
       </w:pPr>
     </w:lvl>
   </w:abstractNum>
-  <w:abstractNum w:abstractNumId="11" w15:restartNumberingAfterBreak="0">
+  <w:abstractNum w:abstractNumId="12" w15:restartNumberingAfterBreak="0">
     <w:nsid w:val="284C2DCC"/>
     <w:multiLevelType w:val="hybridMultilevel"/>
     <w:tmpl w:val="5BF67E76"/>
@@ -5515,7 +4840,7 @@
       </w:pPr>
     </w:lvl>
   </w:abstractNum>
-  <w:abstractNum w:abstractNumId="12" w15:restartNumberingAfterBreak="0">
+  <w:abstractNum w:abstractNumId="13" w15:restartNumberingAfterBreak="0">
     <w:nsid w:val="2B9B2592"/>
     <w:multiLevelType w:val="hybridMultilevel"/>
     <w:tmpl w:val="17F2E8E8"/>
@@ -5601,7 +4926,7 @@
       </w:pPr>
     </w:lvl>
   </w:abstractNum>
-  <w:abstractNum w:abstractNumId="13" w15:restartNumberingAfterBreak="0">
+  <w:abstractNum w:abstractNumId="14" w15:restartNumberingAfterBreak="0">
     <w:nsid w:val="2C1B4243"/>
     <w:multiLevelType w:val="hybridMultilevel"/>
     <w:tmpl w:val="84BA4ADC"/>
@@ -5690,7 +5015,7 @@
       </w:pPr>
     </w:lvl>
   </w:abstractNum>
-  <w:abstractNum w:abstractNumId="14" w15:restartNumberingAfterBreak="0">
+  <w:abstractNum w:abstractNumId="15" w15:restartNumberingAfterBreak="0">
     <w:nsid w:val="2EDE4774"/>
     <w:multiLevelType w:val="hybridMultilevel"/>
     <w:tmpl w:val="D8E8F944"/>
@@ -5779,7 +5104,7 @@
       </w:pPr>
     </w:lvl>
   </w:abstractNum>
-  <w:abstractNum w:abstractNumId="15" w15:restartNumberingAfterBreak="0">
+  <w:abstractNum w:abstractNumId="16" w15:restartNumberingAfterBreak="0">
     <w:nsid w:val="3B0445A7"/>
     <w:multiLevelType w:val="hybridMultilevel"/>
     <w:tmpl w:val="3E12C668"/>
@@ -5868,7 +5193,7 @@
       </w:pPr>
     </w:lvl>
   </w:abstractNum>
-  <w:abstractNum w:abstractNumId="16" w15:restartNumberingAfterBreak="0">
+  <w:abstractNum w:abstractNumId="17" w15:restartNumberingAfterBreak="0">
     <w:nsid w:val="42851CF1"/>
     <w:multiLevelType w:val="hybridMultilevel"/>
     <w:tmpl w:val="11FC60E4"/>
@@ -5954,7 +5279,7 @@
       </w:pPr>
     </w:lvl>
   </w:abstractNum>
-  <w:abstractNum w:abstractNumId="17" w15:restartNumberingAfterBreak="0">
+  <w:abstractNum w:abstractNumId="18" w15:restartNumberingAfterBreak="0">
     <w:nsid w:val="435E2934"/>
     <w:multiLevelType w:val="hybridMultilevel"/>
     <w:tmpl w:val="D3D0919E"/>
@@ -6040,7 +5365,7 @@
       </w:pPr>
     </w:lvl>
   </w:abstractNum>
-  <w:abstractNum w:abstractNumId="18" w15:restartNumberingAfterBreak="0">
+  <w:abstractNum w:abstractNumId="19" w15:restartNumberingAfterBreak="0">
     <w:nsid w:val="43A97FDC"/>
     <w:multiLevelType w:val="hybridMultilevel"/>
     <w:tmpl w:val="D9005D1E"/>
@@ -6129,7 +5454,7 @@
       </w:pPr>
     </w:lvl>
   </w:abstractNum>
-  <w:abstractNum w:abstractNumId="19" w15:restartNumberingAfterBreak="0">
+  <w:abstractNum w:abstractNumId="20" w15:restartNumberingAfterBreak="0">
     <w:nsid w:val="45EB12D2"/>
     <w:multiLevelType w:val="hybridMultilevel"/>
     <w:tmpl w:val="D8E8F944"/>
@@ -6218,7 +5543,7 @@
       </w:pPr>
     </w:lvl>
   </w:abstractNum>
-  <w:abstractNum w:abstractNumId="20" w15:restartNumberingAfterBreak="0">
+  <w:abstractNum w:abstractNumId="21" w15:restartNumberingAfterBreak="0">
     <w:nsid w:val="4A5B4EC3"/>
     <w:multiLevelType w:val="hybridMultilevel"/>
     <w:tmpl w:val="BC9E8AFA"/>
@@ -6304,7 +5629,7 @@
       </w:pPr>
     </w:lvl>
   </w:abstractNum>
-  <w:abstractNum w:abstractNumId="21" w15:restartNumberingAfterBreak="0">
+  <w:abstractNum w:abstractNumId="22" w15:restartNumberingAfterBreak="0">
     <w:nsid w:val="4F757A13"/>
     <w:multiLevelType w:val="hybridMultilevel"/>
     <w:tmpl w:val="003AE8C2"/>
@@ -6390,7 +5715,7 @@
       </w:pPr>
     </w:lvl>
   </w:abstractNum>
-  <w:abstractNum w:abstractNumId="22" w15:restartNumberingAfterBreak="0">
+  <w:abstractNum w:abstractNumId="23" w15:restartNumberingAfterBreak="0">
     <w:nsid w:val="5DA0187C"/>
     <w:multiLevelType w:val="hybridMultilevel"/>
     <w:tmpl w:val="6366C8C6"/>
@@ -6479,7 +5804,7 @@
       </w:pPr>
     </w:lvl>
   </w:abstractNum>
-  <w:abstractNum w:abstractNumId="23" w15:restartNumberingAfterBreak="0">
+  <w:abstractNum w:abstractNumId="24" w15:restartNumberingAfterBreak="0">
     <w:nsid w:val="5F6A260E"/>
     <w:multiLevelType w:val="hybridMultilevel"/>
     <w:tmpl w:val="3A0C7072"/>
@@ -6565,7 +5890,7 @@
       </w:pPr>
     </w:lvl>
   </w:abstractNum>
-  <w:abstractNum w:abstractNumId="24" w15:restartNumberingAfterBreak="0">
+  <w:abstractNum w:abstractNumId="25" w15:restartNumberingAfterBreak="0">
     <w:nsid w:val="650B224C"/>
     <w:multiLevelType w:val="hybridMultilevel"/>
     <w:tmpl w:val="602E31F6"/>
@@ -6654,7 +5979,7 @@
       </w:pPr>
     </w:lvl>
   </w:abstractNum>
-  <w:abstractNum w:abstractNumId="25" w15:restartNumberingAfterBreak="0">
+  <w:abstractNum w:abstractNumId="26" w15:restartNumberingAfterBreak="0">
     <w:nsid w:val="6D4C3886"/>
     <w:multiLevelType w:val="hybridMultilevel"/>
     <w:tmpl w:val="5BF67E76"/>
@@ -6740,7 +6065,7 @@
       </w:pPr>
     </w:lvl>
   </w:abstractNum>
-  <w:abstractNum w:abstractNumId="26" w15:restartNumberingAfterBreak="0">
+  <w:abstractNum w:abstractNumId="27" w15:restartNumberingAfterBreak="0">
     <w:nsid w:val="7F303681"/>
     <w:multiLevelType w:val="hybridMultilevel"/>
     <w:tmpl w:val="549A06E6"/>
@@ -6826,7 +6151,7 @@
       </w:pPr>
     </w:lvl>
   </w:abstractNum>
-  <w:abstractNum w:abstractNumId="27" w15:restartNumberingAfterBreak="0">
+  <w:abstractNum w:abstractNumId="28" w15:restartNumberingAfterBreak="0">
     <w:nsid w:val="7F72028C"/>
     <w:multiLevelType w:val="hybridMultilevel"/>
     <w:tmpl w:val="4A2E54C4"/>
@@ -6916,28 +6241,28 @@
     </w:lvl>
   </w:abstractNum>
   <w:num w:numId="1">
-    <w:abstractNumId w:val="27"/>
+    <w:abstractNumId w:val="28"/>
   </w:num>
   <w:num w:numId="2">
-    <w:abstractNumId w:val="15"/>
+    <w:abstractNumId w:val="16"/>
   </w:num>
   <w:num w:numId="3">
-    <w:abstractNumId w:val="22"/>
+    <w:abstractNumId w:val="23"/>
   </w:num>
   <w:num w:numId="4">
-    <w:abstractNumId w:val="13"/>
+    <w:abstractNumId w:val="14"/>
   </w:num>
   <w:num w:numId="5">
     <w:abstractNumId w:val="0"/>
   </w:num>
   <w:num w:numId="6">
-    <w:abstractNumId w:val="14"/>
+    <w:abstractNumId w:val="15"/>
   </w:num>
   <w:num w:numId="7">
-    <w:abstractNumId w:val="19"/>
+    <w:abstractNumId w:val="20"/>
   </w:num>
   <w:num w:numId="8">
-    <w:abstractNumId w:val="10"/>
+    <w:abstractNumId w:val="11"/>
   </w:num>
   <w:num w:numId="9">
     <w:abstractNumId w:val="3"/>
@@ -6946,46 +6271,46 @@
     <w:abstractNumId w:val="4"/>
   </w:num>
   <w:num w:numId="11">
-    <w:abstractNumId w:val="7"/>
+    <w:abstractNumId w:val="8"/>
   </w:num>
   <w:num w:numId="12">
-    <w:abstractNumId w:val="18"/>
+    <w:abstractNumId w:val="19"/>
   </w:num>
   <w:num w:numId="13">
-    <w:abstractNumId w:val="12"/>
+    <w:abstractNumId w:val="13"/>
   </w:num>
   <w:num w:numId="14">
-    <w:abstractNumId w:val="16"/>
+    <w:abstractNumId w:val="17"/>
   </w:num>
   <w:num w:numId="15">
-    <w:abstractNumId w:val="23"/>
+    <w:abstractNumId w:val="24"/>
   </w:num>
   <w:num w:numId="16">
-    <w:abstractNumId w:val="8"/>
+    <w:abstractNumId w:val="9"/>
   </w:num>
   <w:num w:numId="17">
     <w:abstractNumId w:val="5"/>
   </w:num>
   <w:num w:numId="18">
-    <w:abstractNumId w:val="26"/>
+    <w:abstractNumId w:val="27"/>
   </w:num>
   <w:num w:numId="19">
     <w:abstractNumId w:val="1"/>
   </w:num>
   <w:num w:numId="20">
-    <w:abstractNumId w:val="17"/>
+    <w:abstractNumId w:val="18"/>
   </w:num>
   <w:num w:numId="21">
-    <w:abstractNumId w:val="9"/>
+    <w:abstractNumId w:val="10"/>
   </w:num>
   <w:num w:numId="22">
-    <w:abstractNumId w:val="11"/>
+    <w:abstractNumId w:val="12"/>
   </w:num>
   <w:num w:numId="23">
-    <w:abstractNumId w:val="25"/>
+    <w:abstractNumId w:val="26"/>
   </w:num>
   <w:num w:numId="24">
-    <w:abstractNumId w:val="24"/>
+    <w:abstractNumId w:val="25"/>
   </w:num>
   <w:num w:numId="25">
     <w:abstractNumId w:val="2"/>
@@ -6994,10 +6319,13 @@
     <w:abstractNumId w:val="6"/>
   </w:num>
   <w:num w:numId="27">
-    <w:abstractNumId w:val="20"/>
+    <w:abstractNumId w:val="21"/>
   </w:num>
   <w:num w:numId="28">
-    <w:abstractNumId w:val="21"/>
+    <w:abstractNumId w:val="22"/>
+  </w:num>
+  <w:num w:numId="29">
+    <w:abstractNumId w:val="7"/>
   </w:num>
   <w:numIdMacAtCleanup w:val="28"/>
 </w:numbering>

</xml_diff>

<commit_message>
Added changelog with links to releases for git.
</commit_message>
<xml_diff>
--- a/UI/Help/QRev_Change_Log.docx
+++ b/UI/Help/QRev_Change_Log.docx
@@ -53,7 +53,7 @@
           <w:b/>
           <w:bCs/>
         </w:rPr>
-        <w:t>2</w:t>
+        <w:t>3</w:t>
       </w:r>
       <w:r>
         <w:rPr>
@@ -67,19 +67,7 @@
           <w:b/>
           <w:bCs/>
         </w:rPr>
-        <w:t>3</w:t>
-      </w:r>
-    </w:p>
-    <w:p>
-      <w:pPr>
-        <w:pStyle w:val="ListParagraph"/>
-        <w:numPr>
-          <w:ilvl w:val="0"/>
-          <w:numId w:val="31"/>
-        </w:numPr>
-      </w:pPr>
-      <w:r>
-        <w:t>Fixed auto application of MBT correction when no bed is detected.</w:t>
+        <w:t>4</w:t>
       </w:r>
     </w:p>
     <w:p>
@@ -95,21 +83,122 @@
         </w:rPr>
       </w:pPr>
       <w:r>
-        <w:t>Fix crash resulting from RS5 .mat files containing ping types labeled as 'Other' or '1'</w:t>
-      </w:r>
-    </w:p>
-    <w:p>
-      <w:pPr>
+        <w:t>Fixed RS5 frequency display.</w:t>
+      </w:r>
+    </w:p>
+    <w:p>
+      <w:pPr>
+        <w:pStyle w:val="ListParagraph"/>
+        <w:numPr>
+          <w:ilvl w:val="0"/>
+          <w:numId w:val="31"/>
+        </w:numPr>
         <w:rPr>
           <w:b/>
           <w:bCs/>
         </w:rPr>
       </w:pPr>
       <w:r>
+        <w:t>Fixed reading of SonTek files with long directories.</w:t>
+      </w:r>
+      <w:r>
+        <w:t xml:space="preserve"> </w:t>
+      </w:r>
+    </w:p>
+    <w:p>
+      <w:pPr>
+        <w:pStyle w:val="ListParagraph"/>
+        <w:numPr>
+          <w:ilvl w:val="0"/>
+          <w:numId w:val="31"/>
+        </w:numPr>
+      </w:pPr>
+      <w:r>
+        <w:t>Fix MB correction application.</w:t>
+      </w:r>
+      <w:r>
+        <w:t xml:space="preserve"> </w:t>
+      </w:r>
+    </w:p>
+    <w:p>
+      <w:pPr>
+        <w:pStyle w:val="ListParagraph"/>
+        <w:numPr>
+          <w:ilvl w:val="0"/>
+          <w:numId w:val="31"/>
+        </w:numPr>
         <w:rPr>
           <w:b/>
           <w:bCs/>
         </w:rPr>
+      </w:pPr>
+      <w:r>
+        <w:t xml:space="preserve">Fix crash resulting from very slow boat movement due to repeated </w:t>
+      </w:r>
+      <w:proofErr w:type="spellStart"/>
+      <w:r>
+        <w:t>shiptrack</w:t>
+      </w:r>
+      <w:proofErr w:type="spellEnd"/>
+      <w:r>
+        <w:t xml:space="preserve"> coordinates.</w:t>
+      </w:r>
+    </w:p>
+    <w:p>
+      <w:pPr>
+        <w:rPr>
+          <w:b/>
+          <w:bCs/>
+        </w:rPr>
+      </w:pPr>
+      <w:r>
+        <w:rPr>
+          <w:b/>
+          <w:bCs/>
+        </w:rPr>
+        <w:t>Changes 4.32 to 4.33</w:t>
+      </w:r>
+    </w:p>
+    <w:p>
+      <w:pPr>
+        <w:pStyle w:val="ListParagraph"/>
+        <w:numPr>
+          <w:ilvl w:val="0"/>
+          <w:numId w:val="32"/>
+        </w:numPr>
+      </w:pPr>
+      <w:r>
+        <w:t>Fixed auto application of MBT correction when no bed is detected.</w:t>
+      </w:r>
+    </w:p>
+    <w:p>
+      <w:pPr>
+        <w:pStyle w:val="ListParagraph"/>
+        <w:numPr>
+          <w:ilvl w:val="0"/>
+          <w:numId w:val="32"/>
+        </w:numPr>
+        <w:rPr>
+          <w:b/>
+          <w:bCs/>
+        </w:rPr>
+      </w:pPr>
+      <w:r>
+        <w:t>Fix crash resulting from RS5 .mat files containing ping types labeled as 'Other' or '1'</w:t>
+      </w:r>
+    </w:p>
+    <w:p>
+      <w:pPr>
+        <w:rPr>
+          <w:b/>
+          <w:bCs/>
+        </w:rPr>
+      </w:pPr>
+      <w:r>
+        <w:rPr>
+          <w:b/>
+          <w:bCs/>
+        </w:rPr>
         <w:t>Changes 4.31 to 4.32</w:t>
       </w:r>
     </w:p>
@@ -140,7 +229,15 @@
         </w:numPr>
       </w:pPr>
       <w:r>
-        <w:t>Add reading of ping types for BT data from RS5, available in the matlab export of RSQ_V2.1.11 or later.</w:t>
+        <w:t xml:space="preserve">Add reading of ping types for BT data from RS5, available in the </w:t>
+      </w:r>
+      <w:proofErr w:type="spellStart"/>
+      <w:r>
+        <w:t>matlab</w:t>
+      </w:r>
+      <w:proofErr w:type="spellEnd"/>
+      <w:r>
+        <w:t xml:space="preserve"> export of RSQ_V2.1.11 or later.</w:t>
       </w:r>
     </w:p>
     <w:p>
@@ -248,26 +345,19 @@
           <w:sz w:val="24"/>
           <w:szCs w:val="24"/>
         </w:rPr>
-        <w:t>Fixed crash on main tab due to lollipop plot if oursin not used.</w:t>
-      </w:r>
-    </w:p>
-    <w:p>
-      <w:pPr>
-        <w:pStyle w:val="ListParagraph"/>
-        <w:numPr>
-          <w:ilvl w:val="0"/>
-          <w:numId w:val="28"/>
-        </w:numPr>
-        <w:shd w:val="clear" w:color="auto" w:fill="FFFFFF"/>
-        <w:spacing w:after="0" w:line="240" w:lineRule="auto"/>
-        <w:textAlignment w:val="baseline"/>
+        <w:t xml:space="preserve">Fixed crash on main tab due to lollipop plot if </w:t>
+      </w:r>
+      <w:proofErr w:type="spellStart"/>
+      <w:r>
         <w:rPr>
           <w:rFonts w:ascii="Calibri" w:eastAsia="Times New Roman" w:hAnsi="Calibri" w:cs="Calibri"/>
           <w:color w:val="000000"/>
           <w:sz w:val="24"/>
           <w:szCs w:val="24"/>
         </w:rPr>
-      </w:pPr>
+        <w:t>oursin</w:t>
+      </w:r>
+      <w:proofErr w:type="spellEnd"/>
       <w:r>
         <w:rPr>
           <w:rFonts w:ascii="Calibri" w:eastAsia="Times New Roman" w:hAnsi="Calibri" w:cs="Calibri"/>
@@ -275,7 +365,7 @@
           <w:sz w:val="24"/>
           <w:szCs w:val="24"/>
         </w:rPr>
-        <w:t>Fix crash when changing WT plot options on file loaded from RS5 Qrev matfile due to spaces in ping types when reloading.</w:t>
+        <w:t xml:space="preserve"> not used.</w:t>
       </w:r>
     </w:p>
     <w:p>
@@ -302,7 +392,47 @@
           <w:sz w:val="24"/>
           <w:szCs w:val="24"/>
         </w:rPr>
-        <w:t>Fix crash when plotting shiptrack on MvBedTst tab when viewing some older Qrev files.</w:t>
+        <w:t xml:space="preserve">Fix crash when changing WT plot options on file loaded from RS5 </w:t>
+      </w:r>
+      <w:proofErr w:type="spellStart"/>
+      <w:r>
+        <w:rPr>
+          <w:rFonts w:ascii="Calibri" w:eastAsia="Times New Roman" w:hAnsi="Calibri" w:cs="Calibri"/>
+          <w:color w:val="000000"/>
+          <w:sz w:val="24"/>
+          <w:szCs w:val="24"/>
+        </w:rPr>
+        <w:t>Qrev</w:t>
+      </w:r>
+      <w:proofErr w:type="spellEnd"/>
+      <w:r>
+        <w:rPr>
+          <w:rFonts w:ascii="Calibri" w:eastAsia="Times New Roman" w:hAnsi="Calibri" w:cs="Calibri"/>
+          <w:color w:val="000000"/>
+          <w:sz w:val="24"/>
+          <w:szCs w:val="24"/>
+        </w:rPr>
+        <w:t xml:space="preserve"> </w:t>
+      </w:r>
+      <w:proofErr w:type="spellStart"/>
+      <w:r>
+        <w:rPr>
+          <w:rFonts w:ascii="Calibri" w:eastAsia="Times New Roman" w:hAnsi="Calibri" w:cs="Calibri"/>
+          <w:color w:val="000000"/>
+          <w:sz w:val="24"/>
+          <w:szCs w:val="24"/>
+        </w:rPr>
+        <w:t>matfile</w:t>
+      </w:r>
+      <w:proofErr w:type="spellEnd"/>
+      <w:r>
+        <w:rPr>
+          <w:rFonts w:ascii="Calibri" w:eastAsia="Times New Roman" w:hAnsi="Calibri" w:cs="Calibri"/>
+          <w:color w:val="000000"/>
+          <w:sz w:val="24"/>
+          <w:szCs w:val="24"/>
+        </w:rPr>
+        <w:t xml:space="preserve"> due to spaces in ping types when reloading.</w:t>
       </w:r>
     </w:p>
     <w:p>
@@ -312,6 +442,93 @@
           <w:ilvl w:val="0"/>
           <w:numId w:val="28"/>
         </w:numPr>
+        <w:shd w:val="clear" w:color="auto" w:fill="FFFFFF"/>
+        <w:spacing w:after="0" w:line="240" w:lineRule="auto"/>
+        <w:textAlignment w:val="baseline"/>
+        <w:rPr>
+          <w:rFonts w:ascii="Calibri" w:eastAsia="Times New Roman" w:hAnsi="Calibri" w:cs="Calibri"/>
+          <w:color w:val="000000"/>
+          <w:sz w:val="24"/>
+          <w:szCs w:val="24"/>
+        </w:rPr>
+      </w:pPr>
+      <w:r>
+        <w:rPr>
+          <w:rFonts w:ascii="Calibri" w:eastAsia="Times New Roman" w:hAnsi="Calibri" w:cs="Calibri"/>
+          <w:color w:val="000000"/>
+          <w:sz w:val="24"/>
+          <w:szCs w:val="24"/>
+        </w:rPr>
+        <w:t xml:space="preserve">Fix crash when plotting </w:t>
+      </w:r>
+      <w:proofErr w:type="spellStart"/>
+      <w:r>
+        <w:rPr>
+          <w:rFonts w:ascii="Calibri" w:eastAsia="Times New Roman" w:hAnsi="Calibri" w:cs="Calibri"/>
+          <w:color w:val="000000"/>
+          <w:sz w:val="24"/>
+          <w:szCs w:val="24"/>
+        </w:rPr>
+        <w:t>shiptrack</w:t>
+      </w:r>
+      <w:proofErr w:type="spellEnd"/>
+      <w:r>
+        <w:rPr>
+          <w:rFonts w:ascii="Calibri" w:eastAsia="Times New Roman" w:hAnsi="Calibri" w:cs="Calibri"/>
+          <w:color w:val="000000"/>
+          <w:sz w:val="24"/>
+          <w:szCs w:val="24"/>
+        </w:rPr>
+        <w:t xml:space="preserve"> on </w:t>
+      </w:r>
+      <w:proofErr w:type="spellStart"/>
+      <w:r>
+        <w:rPr>
+          <w:rFonts w:ascii="Calibri" w:eastAsia="Times New Roman" w:hAnsi="Calibri" w:cs="Calibri"/>
+          <w:color w:val="000000"/>
+          <w:sz w:val="24"/>
+          <w:szCs w:val="24"/>
+        </w:rPr>
+        <w:t>MvBedTst</w:t>
+      </w:r>
+      <w:proofErr w:type="spellEnd"/>
+      <w:r>
+        <w:rPr>
+          <w:rFonts w:ascii="Calibri" w:eastAsia="Times New Roman" w:hAnsi="Calibri" w:cs="Calibri"/>
+          <w:color w:val="000000"/>
+          <w:sz w:val="24"/>
+          <w:szCs w:val="24"/>
+        </w:rPr>
+        <w:t xml:space="preserve"> tab when viewing some older </w:t>
+      </w:r>
+      <w:proofErr w:type="spellStart"/>
+      <w:r>
+        <w:rPr>
+          <w:rFonts w:ascii="Calibri" w:eastAsia="Times New Roman" w:hAnsi="Calibri" w:cs="Calibri"/>
+          <w:color w:val="000000"/>
+          <w:sz w:val="24"/>
+          <w:szCs w:val="24"/>
+        </w:rPr>
+        <w:t>Qrev</w:t>
+      </w:r>
+      <w:proofErr w:type="spellEnd"/>
+      <w:r>
+        <w:rPr>
+          <w:rFonts w:ascii="Calibri" w:eastAsia="Times New Roman" w:hAnsi="Calibri" w:cs="Calibri"/>
+          <w:color w:val="000000"/>
+          <w:sz w:val="24"/>
+          <w:szCs w:val="24"/>
+        </w:rPr>
+        <w:t xml:space="preserve"> files.</w:t>
+      </w:r>
+    </w:p>
+    <w:p>
+      <w:pPr>
+        <w:pStyle w:val="ListParagraph"/>
+        <w:numPr>
+          <w:ilvl w:val="0"/>
+          <w:numId w:val="28"/>
+        </w:numPr>
       </w:pPr>
       <w:r>
         <w:t>Added config file.</w:t>
@@ -338,7 +555,23 @@
         </w:numPr>
       </w:pPr>
       <w:r>
-        <w:t>Modified XML output. The Uncertainty node now contains only the total uncertainty and the model used. Separate nodes are provided for QRev_UA and Oursin details.</w:t>
+        <w:t xml:space="preserve">Modified XML output. The Uncertainty node now contains only the total uncertainty and the model used. Separate nodes are provided for </w:t>
+      </w:r>
+      <w:proofErr w:type="spellStart"/>
+      <w:r>
+        <w:t>QRev_UA</w:t>
+      </w:r>
+      <w:proofErr w:type="spellEnd"/>
+      <w:r>
+        <w:t xml:space="preserve"> and </w:t>
+      </w:r>
+      <w:proofErr w:type="spellStart"/>
+      <w:r>
+        <w:t>Oursin</w:t>
+      </w:r>
+      <w:proofErr w:type="spellEnd"/>
+      <w:r>
+        <w:t xml:space="preserve"> details.</w:t>
       </w:r>
     </w:p>
     <w:p>
@@ -410,7 +643,15 @@
         </w:numPr>
       </w:pPr>
       <w:r>
-        <w:t>Fixed bug in Oursin uncertainty model when using GPS reference</w:t>
+        <w:t xml:space="preserve">Fixed bug in </w:t>
+      </w:r>
+      <w:proofErr w:type="spellStart"/>
+      <w:r>
+        <w:t>Oursin</w:t>
+      </w:r>
+      <w:proofErr w:type="spellEnd"/>
+      <w:r>
+        <w:t xml:space="preserve"> uncertainty model when using GPS reference</w:t>
       </w:r>
     </w:p>
     <w:p>
@@ -434,7 +675,15 @@
         </w:numPr>
       </w:pPr>
       <w:r>
-        <w:t>Fixed bug causing Main tab not to update following user input in Oursin uncertainty</w:t>
+        <w:t xml:space="preserve">Fixed bug causing Main tab not to update following user input in </w:t>
+      </w:r>
+      <w:proofErr w:type="spellStart"/>
+      <w:r>
+        <w:t>Oursin</w:t>
+      </w:r>
+      <w:proofErr w:type="spellEnd"/>
+      <w:r>
+        <w:t xml:space="preserve"> uncertainty</w:t>
       </w:r>
     </w:p>
     <w:p>
@@ -446,7 +695,23 @@
         </w:numPr>
       </w:pPr>
       <w:r>
-        <w:t>Fixed bug loading QRev.mat as View then changing to Oursin uncertainty</w:t>
+        <w:t xml:space="preserve">Fixed bug loading </w:t>
+      </w:r>
+      <w:proofErr w:type="spellStart"/>
+      <w:r>
+        <w:t>QRev.mat</w:t>
+      </w:r>
+      <w:proofErr w:type="spellEnd"/>
+      <w:r>
+        <w:t xml:space="preserve"> as View then changing to </w:t>
+      </w:r>
+      <w:proofErr w:type="spellStart"/>
+      <w:r>
+        <w:t>Oursin</w:t>
+      </w:r>
+      <w:proofErr w:type="spellEnd"/>
+      <w:r>
+        <w:t xml:space="preserve"> uncertainty</w:t>
       </w:r>
     </w:p>
     <w:p>
@@ -458,6 +723,7 @@
         </w:numPr>
       </w:pPr>
       <w:r>
+        <w:lastRenderedPageBreak/>
         <w:t>Fixed bug on boat speed plot preventing invalid original data from plotting</w:t>
       </w:r>
     </w:p>
@@ -482,7 +748,15 @@
         </w:numPr>
       </w:pPr>
       <w:r>
-        <w:t>Fixed bug for SonTek ADCPs showing no in the xml file CompassCalibrationResult when there is a calibration</w:t>
+        <w:t xml:space="preserve">Fixed bug for SonTek ADCPs showing no in the xml file </w:t>
+      </w:r>
+      <w:proofErr w:type="spellStart"/>
+      <w:r>
+        <w:t>CompassCalibrationResult</w:t>
+      </w:r>
+      <w:proofErr w:type="spellEnd"/>
+      <w:r>
+        <w:t xml:space="preserve"> when there is a calibration</w:t>
       </w:r>
     </w:p>
     <w:p>
@@ -506,7 +780,15 @@
         </w:numPr>
       </w:pPr>
       <w:r>
-        <w:t>Fixed bug loading RS5 Matlab data with blank Operator and/or Measurement Number</w:t>
+        <w:t xml:space="preserve">Fixed bug loading RS5 </w:t>
+      </w:r>
+      <w:proofErr w:type="spellStart"/>
+      <w:r>
+        <w:t>Matlab</w:t>
+      </w:r>
+      <w:proofErr w:type="spellEnd"/>
+      <w:r>
+        <w:t xml:space="preserve"> data with blank Operator and/or Measurement Number</w:t>
       </w:r>
     </w:p>
     <w:p>
@@ -518,7 +800,6 @@
         </w:numPr>
       </w:pPr>
       <w:r>
-        <w:lastRenderedPageBreak/>
         <w:t>Fixed bug in some dialogs if an edit box is left blank and OK is pressed</w:t>
       </w:r>
     </w:p>
@@ -531,7 +812,15 @@
         </w:numPr>
       </w:pPr>
       <w:r>
-        <w:t>Fixed bug associated with loading, reprocessing, saving, and then reloading of older *_QRev.mat files</w:t>
+        <w:t>Fixed bug associated with loading, reprocessing, saving, and then reloading of older *_</w:t>
+      </w:r>
+      <w:proofErr w:type="spellStart"/>
+      <w:r>
+        <w:t>QRev.mat</w:t>
+      </w:r>
+      <w:proofErr w:type="spellEnd"/>
+      <w:r>
+        <w:t xml:space="preserve"> files</w:t>
       </w:r>
     </w:p>
     <w:p>
@@ -555,7 +844,15 @@
         </w:numPr>
       </w:pPr>
       <w:r>
-        <w:t>Fixed crash when opening a SonTek Matlab file that had no sample data</w:t>
+        <w:t xml:space="preserve">Fixed crash when opening a SonTek </w:t>
+      </w:r>
+      <w:proofErr w:type="spellStart"/>
+      <w:r>
+        <w:t>Matlab</w:t>
+      </w:r>
+      <w:proofErr w:type="spellEnd"/>
+      <w:r>
+        <w:t xml:space="preserve"> file that had no sample data</w:t>
       </w:r>
     </w:p>
     <w:p>
@@ -645,7 +942,23 @@
         </w:numPr>
       </w:pPr>
       <w:r>
-        <w:t xml:space="preserve">Fixed crash when opening an older QRev.mat file for a Sontek M9 that had some of the Loop test data marked as edge data. </w:t>
+        <w:t xml:space="preserve">Fixed crash when opening an older </w:t>
+      </w:r>
+      <w:proofErr w:type="spellStart"/>
+      <w:r>
+        <w:t>QRev.mat</w:t>
+      </w:r>
+      <w:proofErr w:type="spellEnd"/>
+      <w:r>
+        <w:t xml:space="preserve"> file for a </w:t>
+      </w:r>
+      <w:proofErr w:type="spellStart"/>
+      <w:r>
+        <w:t>Sontek</w:t>
+      </w:r>
+      <w:proofErr w:type="spellEnd"/>
+      <w:r>
+        <w:t xml:space="preserve"> M9 that had some of the Loop test data marked as edge data. </w:t>
       </w:r>
     </w:p>
     <w:p>
@@ -657,7 +970,15 @@
         </w:numPr>
       </w:pPr>
       <w:r>
-        <w:t xml:space="preserve">Fixed crash when changing thresholds on older QRev.mat file where bad MBT data was present. </w:t>
+        <w:t xml:space="preserve">Fixed crash when changing thresholds on older </w:t>
+      </w:r>
+      <w:proofErr w:type="spellStart"/>
+      <w:r>
+        <w:t>QRev.mat</w:t>
+      </w:r>
+      <w:proofErr w:type="spellEnd"/>
+      <w:r>
+        <w:t xml:space="preserve"> file where bad MBT data was present. </w:t>
       </w:r>
     </w:p>
     <w:p>
@@ -845,7 +1166,15 @@
         <w:ind w:left="720" w:hanging="360"/>
       </w:pPr>
       <w:r>
-        <w:t>Fixed crash from nan values present in the Transect data.</w:t>
+        <w:t xml:space="preserve">Fixed crash from nan values </w:t>
+      </w:r>
+      <w:proofErr w:type="gramStart"/>
+      <w:r>
+        <w:t>present</w:t>
+      </w:r>
+      <w:proofErr w:type="gramEnd"/>
+      <w:r>
+        <w:t xml:space="preserve"> in the Transect data.</w:t>
       </w:r>
     </w:p>
     <w:p>
@@ -864,7 +1193,35 @@
         <w:rPr>
           <w:rFonts w:cstheme="minorHAnsi"/>
         </w:rPr>
-        <w:t>Fixed crash resulting from import of mmt file with no configuration commands (streampro palm pilot).</w:t>
+        <w:t xml:space="preserve">Fixed crash resulting from import of </w:t>
+      </w:r>
+      <w:proofErr w:type="spellStart"/>
+      <w:r>
+        <w:rPr>
+          <w:rFonts w:cstheme="minorHAnsi"/>
+        </w:rPr>
+        <w:t>mmt</w:t>
+      </w:r>
+      <w:proofErr w:type="spellEnd"/>
+      <w:r>
+        <w:rPr>
+          <w:rFonts w:cstheme="minorHAnsi"/>
+        </w:rPr>
+        <w:t xml:space="preserve"> file with no configuration commands (</w:t>
+      </w:r>
+      <w:proofErr w:type="spellStart"/>
+      <w:r>
+        <w:rPr>
+          <w:rFonts w:cstheme="minorHAnsi"/>
+        </w:rPr>
+        <w:t>streampro</w:t>
+      </w:r>
+      <w:proofErr w:type="spellEnd"/>
+      <w:r>
+        <w:rPr>
+          <w:rFonts w:cstheme="minorHAnsi"/>
+        </w:rPr>
+        <w:t xml:space="preserve"> palm pilot).</w:t>
       </w:r>
     </w:p>
     <w:p>
@@ -906,6 +1263,7 @@
           <w:color w:val="000000"/>
           <w:shd w:val="clear" w:color="auto" w:fill="FFFFFF"/>
         </w:rPr>
+        <w:lastRenderedPageBreak/>
         <w:t>Added Uncertainty option to the Options dialog.</w:t>
       </w:r>
     </w:p>
@@ -924,7 +1282,25 @@
           <w:color w:val="000000"/>
           <w:shd w:val="clear" w:color="auto" w:fill="FFFFFF"/>
         </w:rPr>
-        <w:t>Changed the options for loading existing *_QRev.mat files. The options now are View or Reprocess.</w:t>
+        <w:t>Changed the options for loading existing *_</w:t>
+      </w:r>
+      <w:proofErr w:type="spellStart"/>
+      <w:r>
+        <w:rPr>
+          <w:rFonts w:cstheme="minorHAnsi"/>
+          <w:color w:val="000000"/>
+          <w:shd w:val="clear" w:color="auto" w:fill="FFFFFF"/>
+        </w:rPr>
+        <w:t>QRev.mat</w:t>
+      </w:r>
+      <w:proofErr w:type="spellEnd"/>
+      <w:r>
+        <w:rPr>
+          <w:rFonts w:cstheme="minorHAnsi"/>
+          <w:color w:val="000000"/>
+          <w:shd w:val="clear" w:color="auto" w:fill="FFFFFF"/>
+        </w:rPr>
+        <w:t xml:space="preserve"> files. The options now are View or Reprocess.</w:t>
       </w:r>
       <w:r>
         <w:tab/>
@@ -968,7 +1344,6 @@
           <w:b/>
           <w:bCs/>
         </w:rPr>
-        <w:lastRenderedPageBreak/>
         <w:t xml:space="preserve"> Changes 4.25 to 4.26 </w:t>
       </w:r>
     </w:p>
@@ -982,7 +1357,15 @@
         <w:ind w:left="720" w:hanging="360"/>
       </w:pPr>
       <w:r>
-        <w:t xml:space="preserve">Fix crash resulting from NaN values in BT data for GPS class. </w:t>
+        <w:t xml:space="preserve">Fix crash resulting from </w:t>
+      </w:r>
+      <w:proofErr w:type="spellStart"/>
+      <w:r>
+        <w:t>NaN</w:t>
+      </w:r>
+      <w:proofErr w:type="spellEnd"/>
+      <w:r>
+        <w:t xml:space="preserve"> values in BT data for GPS class. </w:t>
       </w:r>
     </w:p>
     <w:p>
@@ -995,7 +1378,15 @@
         <w:ind w:left="720" w:hanging="360"/>
       </w:pPr>
       <w:r>
-        <w:t xml:space="preserve">Fix crash resulting from loading old QRev files missing setting dict in mat file. </w:t>
+        <w:t xml:space="preserve">Fix crash resulting from loading old QRev files missing setting </w:t>
+      </w:r>
+      <w:proofErr w:type="spellStart"/>
+      <w:r>
+        <w:t>dict</w:t>
+      </w:r>
+      <w:proofErr w:type="spellEnd"/>
+      <w:r>
+        <w:t xml:space="preserve"> in mat file. </w:t>
       </w:r>
     </w:p>
     <w:p>
@@ -1085,7 +1476,23 @@
         </w:numPr>
       </w:pPr>
       <w:r>
-        <w:t>Modified extrap subsection so that subsectioning always works from left to right</w:t>
+        <w:t xml:space="preserve">Modified </w:t>
+      </w:r>
+      <w:proofErr w:type="spellStart"/>
+      <w:r>
+        <w:t>extrap</w:t>
+      </w:r>
+      <w:proofErr w:type="spellEnd"/>
+      <w:r>
+        <w:t xml:space="preserve"> subsection so that </w:t>
+      </w:r>
+      <w:proofErr w:type="spellStart"/>
+      <w:r>
+        <w:t>subsectioning</w:t>
+      </w:r>
+      <w:proofErr w:type="spellEnd"/>
+      <w:r>
+        <w:t xml:space="preserve"> always works from left to right</w:t>
       </w:r>
     </w:p>
     <w:p>
@@ -1097,7 +1504,15 @@
         </w:numPr>
       </w:pPr>
       <w:r>
-        <w:t>Removed depth from Oursin measured discharge uncertainty</w:t>
+        <w:t xml:space="preserve">Removed depth from </w:t>
+      </w:r>
+      <w:proofErr w:type="spellStart"/>
+      <w:r>
+        <w:t>Oursin</w:t>
+      </w:r>
+      <w:proofErr w:type="spellEnd"/>
+      <w:r>
+        <w:t xml:space="preserve"> measured discharge uncertainty</w:t>
       </w:r>
     </w:p>
     <w:p>
@@ -1120,8 +1535,13 @@
           <w:numId w:val="22"/>
         </w:numPr>
       </w:pPr>
-      <w:r>
-        <w:t>Extrap subsection label changes based on data loaded and processed.</w:t>
+      <w:proofErr w:type="spellStart"/>
+      <w:r>
+        <w:t>Extrap</w:t>
+      </w:r>
+      <w:proofErr w:type="spellEnd"/>
+      <w:r>
+        <w:t xml:space="preserve"> subsection label changes based on data loaded and processed.</w:t>
       </w:r>
     </w:p>
     <w:p>
@@ -1169,7 +1589,15 @@
         </w:numPr>
       </w:pPr>
       <w:r>
-        <w:t>Fix bug with loading data collected with a PDA and streampro.</w:t>
+        <w:t xml:space="preserve">Fix bug with loading data collected with a PDA and </w:t>
+      </w:r>
+      <w:proofErr w:type="spellStart"/>
+      <w:r>
+        <w:t>streampro</w:t>
+      </w:r>
+      <w:proofErr w:type="spellEnd"/>
+      <w:r>
+        <w:t>.</w:t>
       </w:r>
     </w:p>
     <w:p>
@@ -1226,7 +1654,15 @@
         </w:numPr>
       </w:pPr>
       <w:r>
-        <w:t>Fixed bug reading some old QRev.mat files associated with new rating feature</w:t>
+        <w:t xml:space="preserve">Fixed bug reading some old </w:t>
+      </w:r>
+      <w:proofErr w:type="spellStart"/>
+      <w:r>
+        <w:t>QRev.mat</w:t>
+      </w:r>
+      <w:proofErr w:type="spellEnd"/>
+      <w:r>
+        <w:t xml:space="preserve"> files associated with new rating feature</w:t>
       </w:r>
     </w:p>
     <w:p>
@@ -1265,7 +1701,15 @@
         </w:numPr>
       </w:pPr>
       <w:r>
-        <w:t xml:space="preserve">Fixed issue with depth reference drop down </w:t>
+        <w:t xml:space="preserve">Fixed issue with depth reference </w:t>
+      </w:r>
+      <w:proofErr w:type="gramStart"/>
+      <w:r>
+        <w:t>drop</w:t>
+      </w:r>
+      <w:proofErr w:type="gramEnd"/>
+      <w:r>
+        <w:t xml:space="preserve"> down </w:t>
       </w:r>
       <w:r>
         <w:t xml:space="preserve">menu </w:t>
@@ -1319,7 +1763,15 @@
         </w:numPr>
       </w:pPr>
       <w:r>
-        <w:t>Fixed bug reading *_QRev.mat having only 1 transect</w:t>
+        <w:t>Fixed bug reading *_</w:t>
+      </w:r>
+      <w:proofErr w:type="spellStart"/>
+      <w:r>
+        <w:t>QRev.mat</w:t>
+      </w:r>
+      <w:proofErr w:type="spellEnd"/>
+      <w:r>
+        <w:t xml:space="preserve"> having only 1 transect</w:t>
       </w:r>
     </w:p>
     <w:p>
@@ -1346,8 +1798,13 @@
         <w:t xml:space="preserve">Fixed issue </w:t>
       </w:r>
       <w:r>
-        <w:t>that could occur when processing moving-bed tests loaded from *_QRev.mat</w:t>
-      </w:r>
+        <w:t>that could occur when processing moving-bed tests loaded from *_</w:t>
+      </w:r>
+      <w:proofErr w:type="spellStart"/>
+      <w:r>
+        <w:t>QRev.mat</w:t>
+      </w:r>
+      <w:proofErr w:type="spellEnd"/>
     </w:p>
     <w:p>
       <w:pPr>
@@ -1399,6 +1856,7 @@
         </w:numPr>
       </w:pPr>
       <w:r>
+        <w:lastRenderedPageBreak/>
         <w:t>Added ability to use GPS as a reference for moving-bed tests</w:t>
       </w:r>
     </w:p>
@@ -1411,7 +1869,15 @@
         </w:numPr>
       </w:pPr>
       <w:r>
-        <w:t>Applying magvar or heading offset or heading source changes to all transects applies them to moving-bed test also</w:t>
+        <w:t xml:space="preserve">Applying </w:t>
+      </w:r>
+      <w:proofErr w:type="spellStart"/>
+      <w:r>
+        <w:t>magvar</w:t>
+      </w:r>
+      <w:proofErr w:type="spellEnd"/>
+      <w:r>
+        <w:t xml:space="preserve"> or heading offset or heading source changes to all transects applies them to moving-bed test also</w:t>
       </w:r>
     </w:p>
     <w:p>
@@ -1447,7 +1913,6 @@
         </w:numPr>
       </w:pPr>
       <w:r>
-        <w:lastRenderedPageBreak/>
         <w:t>Added GPS – BT comparison tab to GPS Tab</w:t>
       </w:r>
     </w:p>
@@ -1484,7 +1949,15 @@
         </w:numPr>
       </w:pPr>
       <w:r>
-        <w:t>Added support for user edge discharge for WinRiver II 2.22</w:t>
+        <w:t xml:space="preserve">Added support for user edge discharge for </w:t>
+      </w:r>
+      <w:proofErr w:type="spellStart"/>
+      <w:r>
+        <w:t>WinRiver</w:t>
+      </w:r>
+      <w:proofErr w:type="spellEnd"/>
+      <w:r>
+        <w:t xml:space="preserve"> II 2.22</w:t>
       </w:r>
     </w:p>
     <w:p>
@@ -1495,8 +1968,13 @@
           <w:numId w:val="20"/>
         </w:numPr>
       </w:pPr>
-      <w:r>
-        <w:t>“.mat” is always appended as suffix to saved QRev file</w:t>
+      <w:proofErr w:type="gramStart"/>
+      <w:r>
+        <w:t>“.mat</w:t>
+      </w:r>
+      <w:proofErr w:type="gramEnd"/>
+      <w:r>
+        <w:t>” is always appended as suffix to saved QRev file</w:t>
       </w:r>
     </w:p>
     <w:p>
@@ -1508,8 +1986,29 @@
         </w:numPr>
       </w:pPr>
       <w:r>
-        <w:t>Manual threshold for wt and bt saved and displayed when opening *_QRev.mat</w:t>
-      </w:r>
+        <w:t xml:space="preserve">Manual threshold for </w:t>
+      </w:r>
+      <w:proofErr w:type="spellStart"/>
+      <w:r>
+        <w:t>wt</w:t>
+      </w:r>
+      <w:proofErr w:type="spellEnd"/>
+      <w:r>
+        <w:t xml:space="preserve"> and </w:t>
+      </w:r>
+      <w:proofErr w:type="spellStart"/>
+      <w:r>
+        <w:t>bt</w:t>
+      </w:r>
+      <w:proofErr w:type="spellEnd"/>
+      <w:r>
+        <w:t xml:space="preserve"> saved and displayed when opening *_</w:t>
+      </w:r>
+      <w:proofErr w:type="spellStart"/>
+      <w:r>
+        <w:t>QRev.mat</w:t>
+      </w:r>
+      <w:proofErr w:type="spellEnd"/>
     </w:p>
     <w:p>
       <w:pPr>
@@ -1841,7 +2340,15 @@
         </w:numPr>
       </w:pPr>
       <w:r>
-        <w:t>Fixed issue with shiptrack when all GPS data are invalid</w:t>
+        <w:t xml:space="preserve">Fixed issue with </w:t>
+      </w:r>
+      <w:proofErr w:type="spellStart"/>
+      <w:r>
+        <w:t>shiptrack</w:t>
+      </w:r>
+      <w:proofErr w:type="spellEnd"/>
+      <w:r>
+        <w:t xml:space="preserve"> when all GPS data are invalid</w:t>
       </w:r>
     </w:p>
     <w:p>
@@ -1907,6 +2414,7 @@
           <w:b/>
           <w:bCs/>
         </w:rPr>
+        <w:lastRenderedPageBreak/>
         <w:t>Changes 3.43 to 4.1</w:t>
       </w:r>
       <w:r>
@@ -1926,7 +2434,15 @@
         </w:numPr>
       </w:pPr>
       <w:r>
-        <w:t>Ported code from Matlab to Python</w:t>
+        <w:t xml:space="preserve">Ported code from </w:t>
+      </w:r>
+      <w:proofErr w:type="spellStart"/>
+      <w:r>
+        <w:t>Matlab</w:t>
+      </w:r>
+      <w:proofErr w:type="spellEnd"/>
+      <w:r>
+        <w:t xml:space="preserve"> to Python</w:t>
       </w:r>
     </w:p>
     <w:p>
@@ -1938,8 +2454,13 @@
         </w:numPr>
       </w:pPr>
       <w:r>
-        <w:t>User interface redesigned using PyQt</w:t>
-      </w:r>
+        <w:t xml:space="preserve">User interface redesigned using </w:t>
+      </w:r>
+      <w:proofErr w:type="spellStart"/>
+      <w:r>
+        <w:t>PyQt</w:t>
+      </w:r>
+      <w:proofErr w:type="spellEnd"/>
     </w:p>
     <w:p>
       <w:pPr>
@@ -1950,7 +2471,15 @@
         </w:numPr>
       </w:pPr>
       <w:r>
-        <w:t>Main summary page includes contour, shiptrack, and discharge time series graphics</w:t>
+        <w:t xml:space="preserve">Main summary page includes contour, </w:t>
+      </w:r>
+      <w:proofErr w:type="spellStart"/>
+      <w:r>
+        <w:t>shiptrack</w:t>
+      </w:r>
+      <w:proofErr w:type="spellEnd"/>
+      <w:r>
+        <w:t>, and discharge time series graphics</w:t>
       </w:r>
     </w:p>
     <w:p>
@@ -1962,7 +2491,6 @@
         </w:numPr>
       </w:pPr>
       <w:r>
-        <w:lastRenderedPageBreak/>
         <w:t>Ability to change navigation reference through the toolbar</w:t>
       </w:r>
     </w:p>
@@ -2038,7 +2566,15 @@
         <w:t>F</w:t>
       </w:r>
       <w:r>
-        <w:t>ixed bug in vtg primary composite tracks, wasn't substituting GGA</w:t>
+        <w:t xml:space="preserve">ixed bug in </w:t>
+      </w:r>
+      <w:proofErr w:type="spellStart"/>
+      <w:r>
+        <w:t>vtg</w:t>
+      </w:r>
+      <w:proofErr w:type="spellEnd"/>
+      <w:r>
+        <w:t xml:space="preserve"> primary composite tracks, wasn't substituting GGA</w:t>
       </w:r>
     </w:p>
     <w:p>
@@ -2062,8 +2598,13 @@
         </w:numPr>
       </w:pPr>
       <w:r>
-        <w:t>Statistics and interpolation methods in Python may result in small differences from Matlab</w:t>
-      </w:r>
+        <w:t xml:space="preserve">Statistics and interpolation methods in Python may result in small differences from </w:t>
+      </w:r>
+      <w:proofErr w:type="spellStart"/>
+      <w:r>
+        <w:t>Matlab</w:t>
+      </w:r>
+      <w:proofErr w:type="spellEnd"/>
     </w:p>
     <w:p>
       <w:pPr>
@@ -2089,7 +2630,15 @@
         </w:numPr>
       </w:pPr>
       <w:r>
-        <w:t>Fixed bug that did not properly identify missing (lost) ensembles if the typical ensemble duration was greater than 1.5 sec. This affected mode 13 StreamPro data.</w:t>
+        <w:t xml:space="preserve">Fixed bug that did not properly identify missing (lost) ensembles if the typical ensemble duration was greater than 1.5 sec. This affected mode 13 </w:t>
+      </w:r>
+      <w:proofErr w:type="spellStart"/>
+      <w:r>
+        <w:t>StreamPro</w:t>
+      </w:r>
+      <w:proofErr w:type="spellEnd"/>
+      <w:r>
+        <w:t xml:space="preserve"> data.</w:t>
       </w:r>
     </w:p>
     <w:p>
@@ -2143,7 +2692,15 @@
         </w:numPr>
       </w:pPr>
       <w:r>
-        <w:t>Fixed bug with discharge percent change not updating after multiple speed of sound changes.</w:t>
+        <w:t xml:space="preserve">Fixed bug with discharge percent </w:t>
+      </w:r>
+      <w:proofErr w:type="gramStart"/>
+      <w:r>
+        <w:t>change</w:t>
+      </w:r>
+      <w:proofErr w:type="gramEnd"/>
+      <w:r>
+        <w:t xml:space="preserve"> not updating after multiple speed of sound changes.</w:t>
       </w:r>
     </w:p>
     <w:p>
@@ -2167,7 +2724,23 @@
         </w:numPr>
       </w:pPr>
       <w:r>
-        <w:t>Fixed bug in edges shiptrack so it only displays valid orginal data and not interpolated data.</w:t>
+        <w:t xml:space="preserve">Fixed bug in edges </w:t>
+      </w:r>
+      <w:proofErr w:type="spellStart"/>
+      <w:r>
+        <w:t>shiptrack</w:t>
+      </w:r>
+      <w:proofErr w:type="spellEnd"/>
+      <w:r>
+        <w:t xml:space="preserve"> so it only displays valid </w:t>
+      </w:r>
+      <w:proofErr w:type="spellStart"/>
+      <w:r>
+        <w:t>orginal</w:t>
+      </w:r>
+      <w:proofErr w:type="spellEnd"/>
+      <w:r>
+        <w:t xml:space="preserve"> data and not interpolated data.</w:t>
       </w:r>
     </w:p>
     <w:p>
@@ -2218,7 +2791,15 @@
         </w:numPr>
       </w:pPr>
       <w:r>
-        <w:t>Modified uncertainty estimate for invalid and edges to use absolute values.</w:t>
+        <w:t xml:space="preserve">Modified uncertainty </w:t>
+      </w:r>
+      <w:proofErr w:type="gramStart"/>
+      <w:r>
+        <w:t>estimate</w:t>
+      </w:r>
+      <w:proofErr w:type="gramEnd"/>
+      <w:r>
+        <w:t xml:space="preserve"> for invalid and edges to use absolute values.</w:t>
       </w:r>
     </w:p>
     <w:p>
@@ -2302,7 +2883,15 @@
         </w:numPr>
       </w:pPr>
       <w:r>
-        <w:t>Added check to boat and wt to check warn if all data are invalid.</w:t>
+        <w:t xml:space="preserve">Added check to boat and </w:t>
+      </w:r>
+      <w:proofErr w:type="spellStart"/>
+      <w:r>
+        <w:t>wt</w:t>
+      </w:r>
+      <w:proofErr w:type="spellEnd"/>
+      <w:r>
+        <w:t xml:space="preserve"> to check warn if all data are invalid.</w:t>
       </w:r>
     </w:p>
     <w:p>
@@ -2350,6 +2939,7 @@
         </w:numPr>
       </w:pPr>
       <w:r>
+        <w:lastRenderedPageBreak/>
         <w:t>Default compass data view changed to evaluation if evaluation is available.</w:t>
       </w:r>
     </w:p>
@@ -2362,7 +2952,15 @@
         </w:numPr>
       </w:pPr>
       <w:r>
-        <w:t>Added upper limit of 45 ppt to salinty input dialog.</w:t>
+        <w:t xml:space="preserve">Added upper limit of 45 ppt to </w:t>
+      </w:r>
+      <w:proofErr w:type="spellStart"/>
+      <w:r>
+        <w:t>salinty</w:t>
+      </w:r>
+      <w:proofErr w:type="spellEnd"/>
+      <w:r>
+        <w:t xml:space="preserve"> input dialog.</w:t>
       </w:r>
     </w:p>
     <w:p>
@@ -2401,7 +2999,6 @@
           <w:b/>
           <w:bCs/>
         </w:rPr>
-        <w:lastRenderedPageBreak/>
         <w:t>Changes to QRev from 3.34 to 3.35</w:t>
       </w:r>
     </w:p>
@@ -2441,7 +3038,15 @@
         </w:numPr>
       </w:pPr>
       <w:r>
-        <w:t>Fixed bug causing 25 cm excluded distance to be applied to RiverPro data.</w:t>
+        <w:t xml:space="preserve">Fixed bug causing 25 cm excluded distance to be applied to </w:t>
+      </w:r>
+      <w:proofErr w:type="spellStart"/>
+      <w:r>
+        <w:t>RiverPro</w:t>
+      </w:r>
+      <w:proofErr w:type="spellEnd"/>
+      <w:r>
+        <w:t xml:space="preserve"> data.</w:t>
       </w:r>
     </w:p>
     <w:p>
@@ -2528,7 +3133,31 @@
         </w:numPr>
       </w:pPr>
       <w:r>
-        <w:t>Fixed bug causing changes in draft hOffset, hSource, and magVar to not update QA properly</w:t>
+        <w:t xml:space="preserve">Fixed bug causing changes in draft </w:t>
+      </w:r>
+      <w:proofErr w:type="spellStart"/>
+      <w:r>
+        <w:t>hOffset</w:t>
+      </w:r>
+      <w:proofErr w:type="spellEnd"/>
+      <w:r>
+        <w:t xml:space="preserve">, </w:t>
+      </w:r>
+      <w:proofErr w:type="spellStart"/>
+      <w:r>
+        <w:t>hSource</w:t>
+      </w:r>
+      <w:proofErr w:type="spellEnd"/>
+      <w:r>
+        <w:t xml:space="preserve">, and </w:t>
+      </w:r>
+      <w:proofErr w:type="spellStart"/>
+      <w:r>
+        <w:t>magVar</w:t>
+      </w:r>
+      <w:proofErr w:type="spellEnd"/>
+      <w:r>
+        <w:t xml:space="preserve"> to not update QA properly</w:t>
       </w:r>
     </w:p>
     <w:p>
@@ -2750,7 +3379,16 @@
         </w:numPr>
       </w:pPr>
       <w:r>
-        <w:t xml:space="preserve">Modified code in the way that TRDI mmt file setting for composite depths are processed to QRev settings. </w:t>
+        <w:lastRenderedPageBreak/>
+        <w:t xml:space="preserve">Modified code in the way that TRDI </w:t>
+      </w:r>
+      <w:proofErr w:type="spellStart"/>
+      <w:r>
+        <w:t>mmt</w:t>
+      </w:r>
+      <w:proofErr w:type="spellEnd"/>
+      <w:r>
+        <w:t xml:space="preserve"> file setting for composite depths are processed to QRev settings. </w:t>
       </w:r>
     </w:p>
     <w:p>
@@ -2786,8 +3424,15 @@
         </w:numPr>
       </w:pPr>
       <w:r>
-        <w:lastRenderedPageBreak/>
-        <w:t>Fixed bug with computePerDiff in extrapolation sensitivity when no transect data provided.</w:t>
+        <w:t xml:space="preserve">Fixed bug with </w:t>
+      </w:r>
+      <w:proofErr w:type="spellStart"/>
+      <w:r>
+        <w:t>computePerDiff</w:t>
+      </w:r>
+      <w:proofErr w:type="spellEnd"/>
+      <w:r>
+        <w:t xml:space="preserve"> in extrapolation sensitivity when no transect data provided.</w:t>
       </w:r>
     </w:p>
     <w:p>
@@ -2811,7 +3456,15 @@
         </w:numPr>
       </w:pPr>
       <w:r>
-        <w:t>Added code to check compass cal errors against USGS recommendations</w:t>
+        <w:t xml:space="preserve">Added code to check compass </w:t>
+      </w:r>
+      <w:proofErr w:type="spellStart"/>
+      <w:r>
+        <w:t>cal</w:t>
+      </w:r>
+      <w:proofErr w:type="spellEnd"/>
+      <w:r>
+        <w:t xml:space="preserve"> errors against USGS recommendations</w:t>
       </w:r>
     </w:p>
     <w:p>
@@ -2823,7 +3476,15 @@
         </w:numPr>
       </w:pPr>
       <w:r>
-        <w:t>Added code to handle files processed with QBatch.</w:t>
+        <w:t xml:space="preserve">Added code to handle files processed with </w:t>
+      </w:r>
+      <w:proofErr w:type="spellStart"/>
+      <w:r>
+        <w:t>QBatch</w:t>
+      </w:r>
+      <w:proofErr w:type="spellEnd"/>
+      <w:r>
+        <w:t>.</w:t>
       </w:r>
     </w:p>
     <w:p>
@@ -2924,7 +3585,15 @@
         </w:numPr>
       </w:pPr>
       <w:r>
-        <w:t>The compass error from the evaluation of a TRDI ADCP and if available, from RiverSurveyor G3 compass is now shown in the Compass/P/R window.</w:t>
+        <w:t xml:space="preserve">The compass error from the evaluation of a TRDI ADCP and if available, from </w:t>
+      </w:r>
+      <w:proofErr w:type="spellStart"/>
+      <w:r>
+        <w:t>RiverSurveyor</w:t>
+      </w:r>
+      <w:proofErr w:type="spellEnd"/>
+      <w:r>
+        <w:t xml:space="preserve"> G3 compass is now shown in the Compass/P/R window.</w:t>
       </w:r>
     </w:p>
     <w:p>
@@ -2972,7 +3641,23 @@
         </w:numPr>
       </w:pPr>
       <w:r>
-        <w:t>A bug which applied both the magvar and heading offset to all compass data when loading has been fixed. Now the magvar is only applied to the internal compass and the heading offset only applied to the external compass. This is consistent with how it was handled in the Compass/P/R window.</w:t>
+        <w:t xml:space="preserve">A bug which applied both the </w:t>
+      </w:r>
+      <w:proofErr w:type="spellStart"/>
+      <w:r>
+        <w:t>magvar</w:t>
+      </w:r>
+      <w:proofErr w:type="spellEnd"/>
+      <w:r>
+        <w:t xml:space="preserve"> and heading offset to all compass data when loading has been fixed. Now the </w:t>
+      </w:r>
+      <w:proofErr w:type="spellStart"/>
+      <w:r>
+        <w:t>magvar</w:t>
+      </w:r>
+      <w:proofErr w:type="spellEnd"/>
+      <w:r>
+        <w:t xml:space="preserve"> is only applied to the internal compass and the heading offset only applied to the external compass. This is consistent with how it was handled in the Compass/P/R window.</w:t>
       </w:r>
     </w:p>
     <w:p>
@@ -3062,7 +3747,15 @@
         </w:numPr>
       </w:pPr>
       <w:r>
-        <w:t>Improved the handling of illegal xml characters in mmt file.</w:t>
+        <w:t xml:space="preserve">Improved the handling of illegal xml characters in </w:t>
+      </w:r>
+      <w:proofErr w:type="spellStart"/>
+      <w:r>
+        <w:t>mmt</w:t>
+      </w:r>
+      <w:proofErr w:type="spellEnd"/>
+      <w:r>
+        <w:t xml:space="preserve"> file.</w:t>
       </w:r>
     </w:p>
     <w:p>
@@ -3086,7 +3779,15 @@
         </w:numPr>
       </w:pPr>
       <w:r>
-        <w:t>Changed the QA check for number of valid ensembles to a duration based check for stationary moving-bed test.</w:t>
+        <w:t xml:space="preserve">Changed the QA check for number of valid ensembles to a </w:t>
+      </w:r>
+      <w:proofErr w:type="gramStart"/>
+      <w:r>
+        <w:t>duration based</w:t>
+      </w:r>
+      <w:proofErr w:type="gramEnd"/>
+      <w:r>
+        <w:t xml:space="preserve"> check for stationary moving-bed test.</w:t>
       </w:r>
     </w:p>
     <w:p>
@@ -3098,6 +3799,7 @@
         </w:numPr>
       </w:pPr>
       <w:r>
+        <w:lastRenderedPageBreak/>
         <w:t>Fixed bug causing edges GUI not to update with changes to table.</w:t>
       </w:r>
     </w:p>
@@ -3134,7 +3836,6 @@
         </w:numPr>
       </w:pPr>
       <w:r>
-        <w:lastRenderedPageBreak/>
         <w:t>Added an icon button to main window for uncheck all.</w:t>
       </w:r>
     </w:p>
@@ -3186,7 +3887,15 @@
         </w:numPr>
       </w:pPr>
       <w:r>
-        <w:t>Fixed issue with UTC time from GGA which contained an invalid character causing the str2double function resulting in NaN.</w:t>
+        <w:t xml:space="preserve">Fixed issue with UTC time from GGA which contained an invalid character causing the str2double function resulting in </w:t>
+      </w:r>
+      <w:proofErr w:type="spellStart"/>
+      <w:r>
+        <w:t>NaN</w:t>
+      </w:r>
+      <w:proofErr w:type="spellEnd"/>
+      <w:r>
+        <w:t>.</w:t>
       </w:r>
     </w:p>
     <w:p>
@@ -3198,7 +3907,23 @@
         </w:numPr>
       </w:pPr>
       <w:r>
-        <w:t>Added fix for invalid prefPath from corrupt AppData/Local/QRev</w:t>
+        <w:t xml:space="preserve">Added fix for invalid </w:t>
+      </w:r>
+      <w:proofErr w:type="spellStart"/>
+      <w:r>
+        <w:t>prefPath</w:t>
+      </w:r>
+      <w:proofErr w:type="spellEnd"/>
+      <w:r>
+        <w:t xml:space="preserve"> from corrupt </w:t>
+      </w:r>
+      <w:proofErr w:type="spellStart"/>
+      <w:r>
+        <w:t>AppData</w:t>
+      </w:r>
+      <w:proofErr w:type="spellEnd"/>
+      <w:r>
+        <w:t>/Local/QRev</w:t>
       </w:r>
     </w:p>
     <w:p>
@@ -3210,7 +3935,23 @@
         </w:numPr>
       </w:pPr>
       <w:r>
-        <w:t>Added code to reset the close option from extrap to the main window when extrap is closed.</w:t>
+        <w:t xml:space="preserve">Added code to reset the close option from </w:t>
+      </w:r>
+      <w:proofErr w:type="spellStart"/>
+      <w:r>
+        <w:t>extrap</w:t>
+      </w:r>
+      <w:proofErr w:type="spellEnd"/>
+      <w:r>
+        <w:t xml:space="preserve"> to the main window when </w:t>
+      </w:r>
+      <w:proofErr w:type="spellStart"/>
+      <w:r>
+        <w:t>extrap</w:t>
+      </w:r>
+      <w:proofErr w:type="spellEnd"/>
+      <w:r>
+        <w:t xml:space="preserve"> is closed.</w:t>
       </w:r>
     </w:p>
     <w:p>
@@ -3441,7 +4182,39 @@
         </w:numPr>
       </w:pPr>
       <w:r>
-        <w:t>In the extrap window, added message to user that they need to set Fit to manual if the want to use an automatically opitimized fit but they have change the threshold, subsection, or data type.</w:t>
+        <w:t xml:space="preserve">In the </w:t>
+      </w:r>
+      <w:proofErr w:type="spellStart"/>
+      <w:r>
+        <w:t>extrap</w:t>
+      </w:r>
+      <w:proofErr w:type="spellEnd"/>
+      <w:r>
+        <w:t xml:space="preserve"> window, added message to user that they need to set Fit to manual if </w:t>
+      </w:r>
+      <w:proofErr w:type="spellStart"/>
+      <w:r>
+        <w:t>the</w:t>
+      </w:r>
+      <w:proofErr w:type="spellEnd"/>
+      <w:r>
+        <w:t xml:space="preserve"> want to use an automatically </w:t>
+      </w:r>
+      <w:proofErr w:type="spellStart"/>
+      <w:r>
+        <w:t>opitimized</w:t>
+      </w:r>
+      <w:proofErr w:type="spellEnd"/>
+      <w:r>
+        <w:t xml:space="preserve"> </w:t>
+      </w:r>
+      <w:proofErr w:type="gramStart"/>
+      <w:r>
+        <w:t>fit</w:t>
+      </w:r>
+      <w:proofErr w:type="gramEnd"/>
+      <w:r>
+        <w:t xml:space="preserve"> but they have change the threshold, subsection, or data type.</w:t>
       </w:r>
     </w:p>
     <w:p>
@@ -3516,7 +4289,16 @@
         </w:numPr>
       </w:pPr>
       <w:r>
-        <w:t>Fixed bug where magError and GPS heading were saved as column vector rather than row vector</w:t>
+        <w:lastRenderedPageBreak/>
+        <w:t xml:space="preserve">Fixed bug where </w:t>
+      </w:r>
+      <w:proofErr w:type="spellStart"/>
+      <w:r>
+        <w:t>magError</w:t>
+      </w:r>
+      <w:proofErr w:type="spellEnd"/>
+      <w:r>
+        <w:t xml:space="preserve"> and GPS heading were saved as column vector rather than row vector</w:t>
       </w:r>
     </w:p>
     <w:p>
@@ -3540,7 +4322,15 @@
         </w:numPr>
       </w:pPr>
       <w:r>
-        <w:t>Improved scaling for magError and pitch and roll, 2) linked x axes of top and bottom plots</w:t>
+        <w:t xml:space="preserve">Improved scaling for </w:t>
+      </w:r>
+      <w:proofErr w:type="spellStart"/>
+      <w:r>
+        <w:t>magError</w:t>
+      </w:r>
+      <w:proofErr w:type="spellEnd"/>
+      <w:r>
+        <w:t xml:space="preserve"> and pitch and roll, 2) linked x axes of top and bottom plots</w:t>
       </w:r>
     </w:p>
     <w:p>
@@ -3552,7 +4342,15 @@
         </w:numPr>
       </w:pPr>
       <w:r>
-        <w:t>Added code to add qTotalCaution to older QRev files</w:t>
+        <w:t xml:space="preserve">Added code to add </w:t>
+      </w:r>
+      <w:proofErr w:type="spellStart"/>
+      <w:r>
+        <w:t>qTotalCaution</w:t>
+      </w:r>
+      <w:proofErr w:type="spellEnd"/>
+      <w:r>
+        <w:t xml:space="preserve"> to older QRev files</w:t>
       </w:r>
     </w:p>
     <w:p>
@@ -3576,7 +4374,6 @@
         </w:numPr>
       </w:pPr>
       <w:r>
-        <w:lastRenderedPageBreak/>
         <w:t>Fixed bug when selecting use when moving-bed test is not user valid</w:t>
       </w:r>
     </w:p>
@@ -3589,7 +4386,15 @@
         </w:numPr>
       </w:pPr>
       <w:r>
-        <w:t>Fixed bug when loading QRev files from 2.9x by adding code to create the qTotalCaution field</w:t>
+        <w:t xml:space="preserve">Fixed bug when loading QRev files from 2.9x by adding code to create the </w:t>
+      </w:r>
+      <w:proofErr w:type="spellStart"/>
+      <w:r>
+        <w:t>qTotalCaution</w:t>
+      </w:r>
+      <w:proofErr w:type="spellEnd"/>
+      <w:r>
+        <w:t xml:space="preserve"> field</w:t>
       </w:r>
     </w:p>
     <w:p>
@@ -3624,8 +4429,13 @@
           <w:numId w:val="14"/>
         </w:numPr>
       </w:pPr>
-      <w:r>
-        <w:t>kml Google earth file now plots the full transect filename</w:t>
+      <w:proofErr w:type="spellStart"/>
+      <w:r>
+        <w:t>kml</w:t>
+      </w:r>
+      <w:proofErr w:type="spellEnd"/>
+      <w:r>
+        <w:t xml:space="preserve"> Google earth file now plots the full transect filename</w:t>
       </w:r>
     </w:p>
     <w:p>
@@ -3661,8 +4471,13 @@
         </w:numPr>
       </w:pPr>
       <w:r>
-        <w:t>Fixed bug preventing automatic excluded distance for RioPro</w:t>
-      </w:r>
+        <w:t xml:space="preserve">Fixed bug preventing automatic excluded distance for </w:t>
+      </w:r>
+      <w:proofErr w:type="spellStart"/>
+      <w:r>
+        <w:t>RioPro</w:t>
+      </w:r>
+      <w:proofErr w:type="spellEnd"/>
     </w:p>
     <w:p>
       <w:pPr>
@@ -3697,7 +4512,15 @@
         </w:numPr>
       </w:pPr>
       <w:r>
-        <w:t>Fixed bug applying user specified edge Q in RiverSurveyor Live</w:t>
+        <w:t xml:space="preserve">Fixed bug applying user specified edge Q in </w:t>
+      </w:r>
+      <w:proofErr w:type="spellStart"/>
+      <w:r>
+        <w:t>RiverSurveyor</w:t>
+      </w:r>
+      <w:proofErr w:type="spellEnd"/>
+      <w:r>
+        <w:t xml:space="preserve"> Live</w:t>
       </w:r>
     </w:p>
     <w:p>
@@ -3745,7 +4568,7 @@
         <v:path o:extrusionok="f" gradientshapeok="t" o:connecttype="rect"/>
         <o:lock v:ext="edit" aspectratio="t"/>
       </v:shapetype>
-      <v:shape id="_x0000_i1106" type="#_x0000_t75" alt="A close up of a logo&#10;&#10;Description automatically generated" style="width:35.25pt;height:35.25pt;visibility:visible;mso-wrap-style:square" o:bullet="t">
+      <v:shape id="_x0000_i1196" type="#_x0000_t75" alt="A close up of a logo&#10;&#10;Description automatically generated" style="width:35.1pt;height:35.1pt;visibility:visible;mso-wrap-style:square" o:bullet="t">
         <v:imagedata r:id="rId1" o:title="A close up of a logo&#10;&#10;Description automatically generated"/>
       </v:shape>
     </w:pict>
@@ -6081,6 +6904,96 @@
     </w:lvl>
   </w:abstractNum>
   <w:abstractNum w:abstractNumId="26" w15:restartNumberingAfterBreak="0">
+    <w:nsid w:val="66D71212"/>
+    <w:multiLevelType w:val="hybridMultilevel"/>
+    <w:tmpl w:val="2AC4F97A"/>
+    <w:lvl w:ilvl="0" w:tplc="6F92CF22">
+      <w:start w:val="1"/>
+      <w:numFmt w:val="decimal"/>
+      <w:lvlText w:val="%1."/>
+      <w:lvlJc w:val="left"/>
+      <w:pPr>
+        <w:ind w:left="720" w:hanging="360"/>
+      </w:pPr>
+      <w:rPr>
+        <w:b w:val="0"/>
+        <w:bCs w:val="0"/>
+      </w:rPr>
+    </w:lvl>
+    <w:lvl w:ilvl="1" w:tplc="FFFFFFFF" w:tentative="1">
+      <w:start w:val="1"/>
+      <w:numFmt w:val="lowerLetter"/>
+      <w:lvlText w:val="%2."/>
+      <w:lvlJc w:val="left"/>
+      <w:pPr>
+        <w:ind w:left="1440" w:hanging="360"/>
+      </w:pPr>
+    </w:lvl>
+    <w:lvl w:ilvl="2" w:tplc="FFFFFFFF" w:tentative="1">
+      <w:start w:val="1"/>
+      <w:numFmt w:val="lowerRoman"/>
+      <w:lvlText w:val="%3."/>
+      <w:lvlJc w:val="right"/>
+      <w:pPr>
+        <w:ind w:left="2160" w:hanging="180"/>
+      </w:pPr>
+    </w:lvl>
+    <w:lvl w:ilvl="3" w:tplc="FFFFFFFF" w:tentative="1">
+      <w:start w:val="1"/>
+      <w:numFmt w:val="decimal"/>
+      <w:lvlText w:val="%4."/>
+      <w:lvlJc w:val="left"/>
+      <w:pPr>
+        <w:ind w:left="2880" w:hanging="360"/>
+      </w:pPr>
+    </w:lvl>
+    <w:lvl w:ilvl="4" w:tplc="FFFFFFFF" w:tentative="1">
+      <w:start w:val="1"/>
+      <w:numFmt w:val="lowerLetter"/>
+      <w:lvlText w:val="%5."/>
+      <w:lvlJc w:val="left"/>
+      <w:pPr>
+        <w:ind w:left="3600" w:hanging="360"/>
+      </w:pPr>
+    </w:lvl>
+    <w:lvl w:ilvl="5" w:tplc="FFFFFFFF" w:tentative="1">
+      <w:start w:val="1"/>
+      <w:numFmt w:val="lowerRoman"/>
+      <w:lvlText w:val="%6."/>
+      <w:lvlJc w:val="right"/>
+      <w:pPr>
+        <w:ind w:left="4320" w:hanging="180"/>
+      </w:pPr>
+    </w:lvl>
+    <w:lvl w:ilvl="6" w:tplc="FFFFFFFF" w:tentative="1">
+      <w:start w:val="1"/>
+      <w:numFmt w:val="decimal"/>
+      <w:lvlText w:val="%7."/>
+      <w:lvlJc w:val="left"/>
+      <w:pPr>
+        <w:ind w:left="5040" w:hanging="360"/>
+      </w:pPr>
+    </w:lvl>
+    <w:lvl w:ilvl="7" w:tplc="FFFFFFFF" w:tentative="1">
+      <w:start w:val="1"/>
+      <w:numFmt w:val="lowerLetter"/>
+      <w:lvlText w:val="%8."/>
+      <w:lvlJc w:val="left"/>
+      <w:pPr>
+        <w:ind w:left="5760" w:hanging="360"/>
+      </w:pPr>
+    </w:lvl>
+    <w:lvl w:ilvl="8" w:tplc="FFFFFFFF" w:tentative="1">
+      <w:start w:val="1"/>
+      <w:numFmt w:val="lowerRoman"/>
+      <w:lvlText w:val="%9."/>
+      <w:lvlJc w:val="right"/>
+      <w:pPr>
+        <w:ind w:left="6480" w:hanging="180"/>
+      </w:pPr>
+    </w:lvl>
+  </w:abstractNum>
+  <w:abstractNum w:abstractNumId="27" w15:restartNumberingAfterBreak="0">
     <w:nsid w:val="67FD258A"/>
     <w:multiLevelType w:val="hybridMultilevel"/>
     <w:tmpl w:val="5F187B7C"/>
@@ -6166,7 +7079,7 @@
       </w:pPr>
     </w:lvl>
   </w:abstractNum>
-  <w:abstractNum w:abstractNumId="27" w15:restartNumberingAfterBreak="0">
+  <w:abstractNum w:abstractNumId="28" w15:restartNumberingAfterBreak="0">
     <w:nsid w:val="6D4C3886"/>
     <w:multiLevelType w:val="hybridMultilevel"/>
     <w:tmpl w:val="5BF67E76"/>
@@ -6252,11 +7165,11 @@
       </w:pPr>
     </w:lvl>
   </w:abstractNum>
-  <w:abstractNum w:abstractNumId="28" w15:restartNumberingAfterBreak="0">
+  <w:abstractNum w:abstractNumId="29" w15:restartNumberingAfterBreak="0">
     <w:nsid w:val="78D12F44"/>
     <w:multiLevelType w:val="hybridMultilevel"/>
-    <w:tmpl w:val="6E36780A"/>
-    <w:lvl w:ilvl="0" w:tplc="0409000F">
+    <w:tmpl w:val="CC30CF42"/>
+    <w:lvl w:ilvl="0" w:tplc="C480D840">
       <w:start w:val="1"/>
       <w:numFmt w:val="decimal"/>
       <w:lvlText w:val="%1."/>
@@ -6264,6 +7177,10 @@
       <w:pPr>
         <w:ind w:left="720" w:hanging="360"/>
       </w:pPr>
+      <w:rPr>
+        <w:b w:val="0"/>
+        <w:bCs w:val="0"/>
+      </w:rPr>
     </w:lvl>
     <w:lvl w:ilvl="1" w:tplc="04090019" w:tentative="1">
       <w:start w:val="1"/>
@@ -6338,7 +7255,7 @@
       </w:pPr>
     </w:lvl>
   </w:abstractNum>
-  <w:abstractNum w:abstractNumId="29" w15:restartNumberingAfterBreak="0">
+  <w:abstractNum w:abstractNumId="30" w15:restartNumberingAfterBreak="0">
     <w:nsid w:val="7F303681"/>
     <w:multiLevelType w:val="hybridMultilevel"/>
     <w:tmpl w:val="549A06E6"/>
@@ -6424,7 +7341,7 @@
       </w:pPr>
     </w:lvl>
   </w:abstractNum>
-  <w:abstractNum w:abstractNumId="30" w15:restartNumberingAfterBreak="0">
+  <w:abstractNum w:abstractNumId="31" w15:restartNumberingAfterBreak="0">
     <w:nsid w:val="7F72028C"/>
     <w:multiLevelType w:val="hybridMultilevel"/>
     <w:tmpl w:val="4A2E54C4"/>
@@ -6514,7 +7431,7 @@
     </w:lvl>
   </w:abstractNum>
   <w:num w:numId="1">
-    <w:abstractNumId w:val="30"/>
+    <w:abstractNumId w:val="31"/>
   </w:num>
   <w:num w:numId="2">
     <w:abstractNumId w:val="16"/>
@@ -6565,7 +7482,7 @@
     <w:abstractNumId w:val="5"/>
   </w:num>
   <w:num w:numId="18">
-    <w:abstractNumId w:val="29"/>
+    <w:abstractNumId w:val="30"/>
   </w:num>
   <w:num w:numId="19">
     <w:abstractNumId w:val="1"/>
@@ -6580,7 +7497,7 @@
     <w:abstractNumId w:val="12"/>
   </w:num>
   <w:num w:numId="23">
-    <w:abstractNumId w:val="27"/>
+    <w:abstractNumId w:val="28"/>
   </w:num>
   <w:num w:numId="24">
     <w:abstractNumId w:val="25"/>
@@ -6601,10 +7518,13 @@
     <w:abstractNumId w:val="7"/>
   </w:num>
   <w:num w:numId="30">
-    <w:abstractNumId w:val="26"/>
+    <w:abstractNumId w:val="27"/>
   </w:num>
   <w:num w:numId="31">
-    <w:abstractNumId w:val="28"/>
+    <w:abstractNumId w:val="29"/>
+  </w:num>
+  <w:num w:numId="32">
+    <w:abstractNumId w:val="26"/>
   </w:num>
   <w:numIdMacAtCleanup w:val="28"/>
 </w:numbering>

</xml_diff>